<commit_message>
Phase 6 complete: Entity Foundation — compiler, Council, Luminarious anchor, Assessor
</commit_message>
<xml_diff>
--- a/Referentia/Build-Journal.lumin.docx
+++ b/Referentia/Build-Journal.lumin.docx
@@ -4922,7 +4922,7 @@
               <w:pStyle w:val="BodyText"/>
               <w:numPr>
                 <w:ilvl w:val="0"/>
-                <w:numId w:val="5"/>
+                <w:numId w:val="21"/>
               </w:numPr>
               <w:tabs>
                 <w:tab w:val="clear" w:pos="720"/>
@@ -9632,6 +9632,7 @@
       </w:tr>
       <w:tr>
         <w:trPr>
+          <w:trHeight w:val="459" w:hRule="atLeast"/>
           <w:cantSplit w:val="true"/>
         </w:trPr>
         <w:tc>
@@ -9775,7 +9776,15 @@
             </w:pPr>
             <w:r>
               <w:rPr/>
-              <w:t xml:space="preserve">             </w:t>
+              <w:t xml:space="preserve">     </w:t>
+            </w:r>
+            <w:r>
+              <w:rPr/>
+              <w:t>NA</w:t>
+            </w:r>
+            <w:r>
+              <w:rPr/>
+              <w:t xml:space="preserve">        </w:t>
             </w:r>
           </w:p>
         </w:tc>
@@ -12296,6 +12305,52 @@
           </w:tcPr>
           <w:p>
             <w:pPr>
+              <w:pStyle w:val="BodyText"/>
+              <w:numPr>
+                <w:ilvl w:val="0"/>
+                <w:numId w:val="4"/>
+              </w:numPr>
+              <w:tabs>
+                <w:tab w:val="clear" w:pos="720"/>
+                <w:tab w:val="left" w:pos="0" w:leader="none"/>
+              </w:tabs>
+              <w:spacing w:before="0" w:after="0"/>
+              <w:ind w:hanging="283" w:start="720"/>
+              <w:rPr/>
+            </w:pPr>
+            <w:r>
+              <w:rPr>
+                <w:rStyle w:val="SourceText"/>
+              </w:rPr>
+              <w:t>Distillation.__init__</w:t>
+            </w:r>
+            <w:r>
+              <w:rPr/>
+              <w:t xml:space="preserve"> signature changed from </w:t>
+            </w:r>
+            <w:r>
+              <w:rPr>
+                <w:rStyle w:val="SourceText"/>
+              </w:rPr>
+              <w:t>(cfg, client=...)</w:t>
+            </w:r>
+            <w:r>
+              <w:rPr/>
+              <w:t xml:space="preserve"> to </w:t>
+            </w:r>
+            <w:r>
+              <w:rPr>
+                <w:rStyle w:val="SourceText"/>
+              </w:rPr>
+              <w:t>(api_client=None)</w:t>
+            </w:r>
+            <w:r>
+              <w:rPr/>
+              <w:t xml:space="preserve"> — cfg not needed, api_client is the only dependency </w:t>
+            </w:r>
+          </w:p>
+          <w:p>
+            <w:pPr>
               <w:pStyle w:val="Normal"/>
               <w:rPr/>
             </w:pPr>
@@ -12320,6 +12375,62 @@
           </w:tcPr>
           <w:p>
             <w:pPr>
+              <w:pStyle w:val="BodyText"/>
+              <w:numPr>
+                <w:ilvl w:val="0"/>
+                <w:numId w:val="5"/>
+              </w:numPr>
+              <w:tabs>
+                <w:tab w:val="clear" w:pos="720"/>
+                <w:tab w:val="left" w:pos="0" w:leader="none"/>
+              </w:tabs>
+              <w:spacing w:before="0" w:after="0"/>
+              <w:ind w:hanging="283" w:start="720"/>
+              <w:rPr/>
+            </w:pPr>
+            <w:r>
+              <w:rPr>
+                <w:rStyle w:val="SourceText"/>
+              </w:rPr>
+              <w:t>self.vectors</w:t>
+            </w:r>
+            <w:r>
+              <w:rPr/>
+              <w:t xml:space="preserve"> renamed to </w:t>
+            </w:r>
+            <w:r>
+              <w:rPr>
+                <w:rStyle w:val="SourceText"/>
+              </w:rPr>
+              <w:t>self.chronicle</w:t>
+            </w:r>
+            <w:r>
+              <w:rPr/>
+              <w:t xml:space="preserve"> throughout </w:t>
+            </w:r>
+            <w:r>
+              <w:rPr>
+                <w:rStyle w:val="SourceText"/>
+              </w:rPr>
+              <w:t>app.py</w:t>
+            </w:r>
+            <w:r>
+              <w:rPr/>
+              <w:t xml:space="preserve"> and </w:t>
+            </w:r>
+            <w:r>
+              <w:rPr>
+                <w:rStyle w:val="SourceText"/>
+              </w:rPr>
+              <w:t>client/reflection.py</w:t>
+            </w:r>
+            <w:r>
+              <w:rPr/>
+              <w:t xml:space="preserve"> — Phase 1 naming pass item missed at the time </w:t>
+            </w:r>
+          </w:p>
+          <w:p>
+            <w:pPr>
               <w:pStyle w:val="Normal"/>
               <w:rPr/>
             </w:pPr>
@@ -12344,6 +12455,52 @@
           </w:tcPr>
           <w:p>
             <w:pPr>
+              <w:pStyle w:val="BodyText"/>
+              <w:numPr>
+                <w:ilvl w:val="0"/>
+                <w:numId w:val="6"/>
+              </w:numPr>
+              <w:tabs>
+                <w:tab w:val="clear" w:pos="720"/>
+                <w:tab w:val="left" w:pos="0" w:leader="none"/>
+              </w:tabs>
+              <w:spacing w:before="0" w:after="0"/>
+              <w:ind w:hanging="283" w:start="720"/>
+              <w:rPr/>
+            </w:pPr>
+            <w:r>
+              <w:rPr>
+                <w:rStyle w:val="SourceText"/>
+              </w:rPr>
+              <w:t>vectors=</w:t>
+            </w:r>
+            <w:r>
+              <w:rPr/>
+              <w:t xml:space="preserve"> kwarg in </w:t>
+            </w:r>
+            <w:r>
+              <w:rPr>
+                <w:rStyle w:val="SourceText"/>
+              </w:rPr>
+              <w:t>Reflection</w:t>
+            </w:r>
+            <w:r>
+              <w:rPr/>
+              <w:t xml:space="preserve"> instantiation corrected to </w:t>
+            </w:r>
+            <w:r>
+              <w:rPr>
+                <w:rStyle w:val="SourceText"/>
+              </w:rPr>
+              <w:t>chronicle=</w:t>
+            </w:r>
+            <w:r>
+              <w:rPr/>
+              <w:t xml:space="preserve"> to match rename </w:t>
+            </w:r>
+          </w:p>
+          <w:p>
+            <w:pPr>
               <w:pStyle w:val="Normal"/>
               <w:rPr/>
             </w:pPr>
@@ -12368,6 +12525,46 @@
           </w:tcPr>
           <w:p>
             <w:pPr>
+              <w:pStyle w:val="BodyText"/>
+              <w:numPr>
+                <w:ilvl w:val="0"/>
+                <w:numId w:val="7"/>
+              </w:numPr>
+              <w:tabs>
+                <w:tab w:val="clear" w:pos="720"/>
+                <w:tab w:val="left" w:pos="0" w:leader="none"/>
+              </w:tabs>
+              <w:spacing w:before="0" w:after="0"/>
+              <w:ind w:hanging="283" w:start="720"/>
+              <w:rPr/>
+            </w:pPr>
+            <w:r>
+              <w:rPr/>
+              <w:t xml:space="preserve">Distillation trigger added to </w:t>
+            </w:r>
+            <w:r>
+              <w:rPr>
+                <w:rStyle w:val="SourceText"/>
+              </w:rPr>
+              <w:t>_build_context()</w:t>
+            </w:r>
+            <w:r>
+              <w:rPr/>
+              <w:t xml:space="preserve"> before the </w:t>
+            </w:r>
+            <w:r>
+              <w:rPr>
+                <w:rStyle w:val="SourceText"/>
+              </w:rPr>
+              <w:t>short_max</w:t>
+            </w:r>
+            <w:r>
+              <w:rPr/>
+              <w:t xml:space="preserve"> loop — fires synchronously before API call, returns early with compressed message if triggered </w:t>
+            </w:r>
+          </w:p>
+          <w:p>
+            <w:pPr>
               <w:pStyle w:val="Normal"/>
               <w:rPr/>
             </w:pPr>
@@ -12392,6 +12589,62 @@
           </w:tcPr>
           <w:p>
             <w:pPr>
+              <w:pStyle w:val="BodyText"/>
+              <w:numPr>
+                <w:ilvl w:val="0"/>
+                <w:numId w:val="8"/>
+              </w:numPr>
+              <w:tabs>
+                <w:tab w:val="clear" w:pos="720"/>
+                <w:tab w:val="left" w:pos="0" w:leader="none"/>
+              </w:tabs>
+              <w:spacing w:before="0" w:after="0"/>
+              <w:ind w:hanging="283" w:start="720"/>
+              <w:rPr/>
+            </w:pPr>
+            <w:r>
+              <w:rPr>
+                <w:rStyle w:val="SourceText"/>
+              </w:rPr>
+              <w:t>Chronicle.add_from_distillation()</w:t>
+            </w:r>
+            <w:r>
+              <w:rPr/>
+              <w:t xml:space="preserve"> appended to </w:t>
+            </w:r>
+            <w:r>
+              <w:rPr>
+                <w:rStyle w:val="SourceText"/>
+              </w:rPr>
+              <w:t>memory/chronicle.py</w:t>
+            </w:r>
+            <w:r>
+              <w:rPr/>
+              <w:t xml:space="preserve"> — thin wrapper over </w:t>
+            </w:r>
+            <w:r>
+              <w:rPr>
+                <w:rStyle w:val="SourceText"/>
+              </w:rPr>
+              <w:t>add()</w:t>
+            </w:r>
+            <w:r>
+              <w:rPr/>
+              <w:t xml:space="preserve"> stamping </w:t>
+            </w:r>
+            <w:r>
+              <w:rPr>
+                <w:rStyle w:val="SourceText"/>
+              </w:rPr>
+              <w:t>source=distillation</w:t>
+            </w:r>
+            <w:r>
+              <w:rPr/>
+              <w:t xml:space="preserve"> </w:t>
+            </w:r>
+          </w:p>
+          <w:p>
+            <w:pPr>
               <w:pStyle w:val="Normal"/>
               <w:rPr/>
             </w:pPr>
@@ -12416,17 +12669,64 @@
           </w:tcPr>
           <w:p>
             <w:pPr>
-              <w:pStyle w:val="Normal"/>
-              <w:rPr/>
-            </w:pPr>
-            <w:r>
-              <w:rPr/>
-            </w:r>
-          </w:p>
-        </w:tc>
-      </w:tr>
-      <w:tr>
-        <w:trPr>
+              <w:pStyle w:val="BodyText"/>
+              <w:numPr>
+                <w:ilvl w:val="0"/>
+                <w:numId w:val="9"/>
+              </w:numPr>
+              <w:tabs>
+                <w:tab w:val="clear" w:pos="720"/>
+                <w:tab w:val="left" w:pos="0" w:leader="none"/>
+              </w:tabs>
+              <w:spacing w:before="0" w:after="0"/>
+              <w:ind w:hanging="283" w:start="720"/>
+              <w:rPr/>
+            </w:pPr>
+            <w:r>
+              <w:rPr>
+                <w:rStyle w:val="SourceText"/>
+              </w:rPr>
+              <w:t>Reflection.extract_routing_signals()</w:t>
+            </w:r>
+            <w:r>
+              <w:rPr/>
+              <w:t xml:space="preserve"> appended to </w:t>
+            </w:r>
+            <w:r>
+              <w:rPr>
+                <w:rStyle w:val="SourceText"/>
+              </w:rPr>
+              <w:t>client/reflection.py</w:t>
+            </w:r>
+            <w:r>
+              <w:rPr/>
+              <w:t xml:space="preserve"> — writes signal record to </w:t>
+            </w:r>
+            <w:r>
+              <w:rPr>
+                <w:rStyle w:val="SourceText"/>
+              </w:rPr>
+              <w:t>reflections.jsonl</w:t>
+            </w:r>
+            <w:r>
+              <w:rPr/>
+              <w:t xml:space="preserve">, returns dict for immediate use </w:t>
+            </w:r>
+          </w:p>
+          <w:p>
+            <w:pPr>
+              <w:pStyle w:val="Normal"/>
+              <w:rPr/>
+            </w:pPr>
+            <w:r>
+              <w:rPr/>
+            </w:r>
+          </w:p>
+        </w:tc>
+      </w:tr>
+      <w:tr>
+        <w:trPr>
+          <w:trHeight w:val="1146" w:hRule="atLeast"/>
           <w:cantSplit w:val="true"/>
         </w:trPr>
         <w:tc>
@@ -12438,6 +12738,199 @@
               <w:end w:val="single" w:sz="2" w:space="0" w:color="AAAAAA"/>
             </w:tcBorders>
           </w:tcPr>
+          <w:p>
+            <w:pPr>
+              <w:pStyle w:val="BodyText"/>
+              <w:numPr>
+                <w:ilvl w:val="0"/>
+                <w:numId w:val="10"/>
+              </w:numPr>
+              <w:tabs>
+                <w:tab w:val="clear" w:pos="720"/>
+                <w:tab w:val="left" w:pos="0" w:leader="none"/>
+              </w:tabs>
+              <w:spacing w:before="0" w:after="0"/>
+              <w:ind w:hanging="283" w:start="720"/>
+              <w:rPr/>
+            </w:pPr>
+            <w:r>
+              <w:rPr>
+                <w:rStyle w:val="SourceText"/>
+              </w:rPr>
+              <w:t>sigils/</w:t>
+            </w:r>
+            <w:r>
+              <w:rPr/>
+              <w:t xml:space="preserve"> directory and </w:t>
+            </w:r>
+            <w:r>
+              <w:rPr>
+                <w:rStyle w:val="SourceText"/>
+              </w:rPr>
+              <w:t>default.txt</w:t>
+            </w:r>
+            <w:r>
+              <w:rPr/>
+              <w:t xml:space="preserve"> created — was missing, caused two Phase 2 tests to fail </w:t>
+            </w:r>
+          </w:p>
+          <w:p>
+            <w:pPr>
+              <w:pStyle w:val="Normal"/>
+              <w:rPr/>
+            </w:pPr>
+            <w:r>
+              <w:rPr/>
+            </w:r>
+          </w:p>
+        </w:tc>
+      </w:tr>
+      <w:tr>
+        <w:trPr>
+          <w:cantSplit w:val="true"/>
+        </w:trPr>
+        <w:tc>
+          <w:tcPr>
+            <w:tcW w:w="9360" w:type="dxa"/>
+            <w:tcBorders>
+              <w:start w:val="single" w:sz="2" w:space="0" w:color="AAAAAA"/>
+              <w:bottom w:val="single" w:sz="2" w:space="0" w:color="AAAAAA"/>
+              <w:end w:val="single" w:sz="2" w:space="0" w:color="AAAAAA"/>
+            </w:tcBorders>
+          </w:tcPr>
+          <w:p>
+            <w:pPr>
+              <w:pStyle w:val="BodyText"/>
+              <w:numPr>
+                <w:ilvl w:val="0"/>
+                <w:numId w:val="11"/>
+              </w:numPr>
+              <w:tabs>
+                <w:tab w:val="clear" w:pos="720"/>
+                <w:tab w:val="left" w:pos="0" w:leader="none"/>
+              </w:tabs>
+              <w:spacing w:before="0" w:after="0"/>
+              <w:ind w:hanging="283" w:start="720"/>
+              <w:rPr/>
+            </w:pPr>
+            <w:r>
+              <w:rPr/>
+              <w:t xml:space="preserve">FAT_PATTERNS had a split string across two list entries — merged into single valid regex </w:t>
+            </w:r>
+          </w:p>
+          <w:p>
+            <w:pPr>
+              <w:pStyle w:val="Normal"/>
+              <w:rPr/>
+            </w:pPr>
+            <w:r>
+              <w:rPr/>
+            </w:r>
+          </w:p>
+        </w:tc>
+      </w:tr>
+      <w:tr>
+        <w:trPr>
+          <w:cantSplit w:val="true"/>
+        </w:trPr>
+        <w:tc>
+          <w:tcPr>
+            <w:tcW w:w="9360" w:type="dxa"/>
+            <w:tcBorders>
+              <w:start w:val="single" w:sz="2" w:space="0" w:color="AAAAAA"/>
+              <w:bottom w:val="single" w:sz="2" w:space="0" w:color="AAAAAA"/>
+              <w:end w:val="single" w:sz="2" w:space="0" w:color="AAAAAA"/>
+            </w:tcBorders>
+          </w:tcPr>
+          <w:p>
+            <w:pPr>
+              <w:pStyle w:val="BodyText"/>
+              <w:numPr>
+                <w:ilvl w:val="0"/>
+                <w:numId w:val="12"/>
+              </w:numPr>
+              <w:tabs>
+                <w:tab w:val="clear" w:pos="720"/>
+                <w:tab w:val="left" w:pos="0" w:leader="none"/>
+              </w:tabs>
+              <w:spacing w:before="0" w:after="0"/>
+              <w:ind w:hanging="283" w:start="720"/>
+              <w:rPr/>
+            </w:pPr>
+            <w:r>
+              <w:rPr>
+                <w:rStyle w:val="SourceText"/>
+              </w:rPr>
+              <w:t>memory/tome.py</w:t>
+            </w:r>
+            <w:r>
+              <w:rPr/>
+              <w:t xml:space="preserve"> was never written to disk despite being designed — created during Phase 5 test run when Phase 4 tests first ran </w:t>
+            </w:r>
+          </w:p>
+          <w:p>
+            <w:pPr>
+              <w:pStyle w:val="Normal"/>
+              <w:rPr/>
+            </w:pPr>
+            <w:r>
+              <w:rPr/>
+            </w:r>
+          </w:p>
+        </w:tc>
+      </w:tr>
+      <w:tr>
+        <w:trPr>
+          <w:cantSplit w:val="true"/>
+        </w:trPr>
+        <w:tc>
+          <w:tcPr>
+            <w:tcW w:w="9360" w:type="dxa"/>
+            <w:tcBorders>
+              <w:start w:val="single" w:sz="2" w:space="0" w:color="AAAAAA"/>
+              <w:bottom w:val="single" w:sz="2" w:space="0" w:color="AAAAAA"/>
+              <w:end w:val="single" w:sz="2" w:space="0" w:color="AAAAAA"/>
+            </w:tcBorders>
+          </w:tcPr>
+          <w:p>
+            <w:pPr>
+              <w:pStyle w:val="BodyText"/>
+              <w:numPr>
+                <w:ilvl w:val="0"/>
+                <w:numId w:val="13"/>
+              </w:numPr>
+              <w:tabs>
+                <w:tab w:val="clear" w:pos="720"/>
+                <w:tab w:val="left" w:pos="0" w:leader="none"/>
+              </w:tabs>
+              <w:ind w:hanging="283" w:start="709"/>
+              <w:rPr/>
+            </w:pPr>
+            <w:r>
+              <w:rPr/>
+              <w:t xml:space="preserve">App restored from </w:t>
+            </w:r>
+            <w:r>
+              <w:rPr>
+                <w:rStyle w:val="SourceText"/>
+              </w:rPr>
+              <w:t>phase-4-tome</w:t>
+            </w:r>
+            <w:r>
+              <w:rPr/>
+              <w:t xml:space="preserve"> commit after </w:t>
+            </w:r>
+            <w:r>
+              <w:rPr>
+                <w:rStyle w:val="SourceText"/>
+              </w:rPr>
+              <w:t>app.py</w:t>
+            </w:r>
+            <w:r>
+              <w:rPr/>
+              <w:t xml:space="preserve"> was accidentally overwritten by an older version from an open text editor </w:t>
+            </w:r>
+          </w:p>
           <w:p>
             <w:pPr>
               <w:pStyle w:val="Normal"/>
@@ -12672,6 +13165,7 @@
       </w:tr>
       <w:tr>
         <w:trPr>
+          <w:trHeight w:val="764" w:hRule="atLeast"/>
           <w:cantSplit w:val="true"/>
         </w:trPr>
         <w:tc>
@@ -12696,6 +13190,7 @@
             </w:pPr>
             <w:r>
               <w:rPr/>
+              <w:t>Distillation.__init__</w:t>
             </w:r>
           </w:p>
         </w:tc>
@@ -12721,6 +13216,7 @@
             </w:pPr>
             <w:r>
               <w:rPr/>
+              <w:t>(cfg, client=...)</w:t>
             </w:r>
           </w:p>
         </w:tc>
@@ -12746,6 +13242,7 @@
             </w:pPr>
             <w:r>
               <w:rPr/>
+              <w:t>(api_client=None)</w:t>
             </w:r>
           </w:p>
         </w:tc>
@@ -12771,6 +13268,7 @@
             </w:pPr>
             <w:r>
               <w:rPr/>
+              <w:t>cfg not needed in Phase 5 design. Permanent.</w:t>
             </w:r>
           </w:p>
         </w:tc>
@@ -12801,6 +13299,7 @@
             </w:pPr>
             <w:r>
               <w:rPr/>
+              <w:t>self.vectors</w:t>
             </w:r>
           </w:p>
         </w:tc>
@@ -12826,6 +13325,17 @@
             </w:pPr>
             <w:r>
               <w:rPr/>
+              <w:t xml:space="preserve">Should have been </w:t>
+            </w:r>
+            <w:r>
+              <w:rPr>
+                <w:rStyle w:val="SourceText"/>
+              </w:rPr>
+              <w:t>self.chronicle</w:t>
+            </w:r>
+            <w:r>
+              <w:rPr/>
+              <w:t xml:space="preserve"> in Phase 1</w:t>
             </w:r>
           </w:p>
         </w:tc>
@@ -12851,6 +13361,7 @@
             </w:pPr>
             <w:r>
               <w:rPr/>
+              <w:t>Renamed in Phase 5</w:t>
             </w:r>
           </w:p>
         </w:tc>
@@ -12876,12 +13387,14 @@
             </w:pPr>
             <w:r>
               <w:rPr/>
-            </w:r>
-          </w:p>
-        </w:tc>
-      </w:tr>
-      <w:tr>
-        <w:trPr>
+              <w:t>Missed in Phase 1. Corrected. Permanent.</w:t>
+            </w:r>
+          </w:p>
+        </w:tc>
+      </w:tr>
+      <w:tr>
+        <w:trPr>
+          <w:trHeight w:val="485" w:hRule="atLeast"/>
           <w:cantSplit w:val="true"/>
         </w:trPr>
         <w:tc>
@@ -12905,7 +13418,14 @@
               <w:rPr/>
             </w:pPr>
             <w:r>
-              <w:rPr/>
+              <w:rPr>
+                <w:rStyle w:val="SourceText"/>
+              </w:rPr>
+              <w:t>Reflection</w:t>
+            </w:r>
+            <w:r>
+              <w:rPr/>
+              <w:t xml:space="preserve"> kwarg</w:t>
             </w:r>
           </w:p>
         </w:tc>
@@ -12931,6 +13451,7 @@
             </w:pPr>
             <w:r>
               <w:rPr/>
+              <w:t>vectors=</w:t>
             </w:r>
           </w:p>
         </w:tc>
@@ -12956,6 +13477,7 @@
             </w:pPr>
             <w:r>
               <w:rPr/>
+              <w:t>chronicle=</w:t>
             </w:r>
           </w:p>
         </w:tc>
@@ -12981,6 +13503,7 @@
             </w:pPr>
             <w:r>
               <w:rPr/>
+              <w:t>Follows rename. Permanent.</w:t>
             </w:r>
           </w:p>
         </w:tc>
@@ -13011,6 +13534,7 @@
             </w:pPr>
             <w:r>
               <w:rPr/>
+              <w:t>memory/tome.py</w:t>
             </w:r>
           </w:p>
         </w:tc>
@@ -13036,6 +13560,7 @@
             </w:pPr>
             <w:r>
               <w:rPr/>
+              <w:t>Created in Phase 4</w:t>
             </w:r>
           </w:p>
         </w:tc>
@@ -13062,6 +13587,7 @@
             </w:pPr>
             <w:r>
               <w:rPr/>
+              <w:t>Actually created in Phase 5</w:t>
             </w:r>
           </w:p>
         </w:tc>
@@ -13083,6 +13609,7 @@
             </w:pPr>
             <w:r>
               <w:rPr/>
+              <w:t>File was designed but never written to disk. Permanent.</w:t>
             </w:r>
           </w:p>
         </w:tc>
@@ -13210,6 +13737,42 @@
           </w:tcPr>
           <w:p>
             <w:pPr>
+              <w:pStyle w:val="BodyText"/>
+              <w:numPr>
+                <w:ilvl w:val="0"/>
+                <w:numId w:val="14"/>
+              </w:numPr>
+              <w:tabs>
+                <w:tab w:val="clear" w:pos="720"/>
+                <w:tab w:val="left" w:pos="0" w:leader="none"/>
+              </w:tabs>
+              <w:spacing w:before="0" w:after="0"/>
+              <w:ind w:hanging="283" w:start="720"/>
+              <w:rPr/>
+            </w:pPr>
+            <w:r>
+              <w:rPr>
+                <w:rStyle w:val="SourceText"/>
+              </w:rPr>
+              <w:t>app.py</w:t>
+            </w:r>
+            <w:r>
+              <w:rPr/>
+              <w:t xml:space="preserve"> accidentally overwritten by open text editor — restored from </w:t>
+            </w:r>
+            <w:r>
+              <w:rPr>
+                <w:rStyle w:val="SourceText"/>
+              </w:rPr>
+              <w:t>phase-4-tome</w:t>
+            </w:r>
+            <w:r>
+              <w:rPr/>
+              <w:t xml:space="preserve"> git commit </w:t>
+            </w:r>
+          </w:p>
+          <w:p>
+            <w:pPr>
               <w:pStyle w:val="Normal"/>
               <w:rPr/>
             </w:pPr>
@@ -13234,6 +13797,36 @@
           </w:tcPr>
           <w:p>
             <w:pPr>
+              <w:pStyle w:val="BodyText"/>
+              <w:numPr>
+                <w:ilvl w:val="0"/>
+                <w:numId w:val="15"/>
+              </w:numPr>
+              <w:tabs>
+                <w:tab w:val="clear" w:pos="720"/>
+                <w:tab w:val="left" w:pos="0" w:leader="none"/>
+              </w:tabs>
+              <w:spacing w:before="0" w:after="0"/>
+              <w:ind w:hanging="283" w:start="720"/>
+              <w:rPr/>
+            </w:pPr>
+            <w:r>
+              <w:rPr/>
+              <w:t xml:space="preserve">Phase 4 and 5 changes had to be re-applied after restore — </w:t>
+            </w:r>
+            <w:r>
+              <w:rPr>
+                <w:rStyle w:val="SourceText"/>
+              </w:rPr>
+              <w:t>self.vectors</w:t>
+            </w:r>
+            <w:r>
+              <w:rPr/>
+              <w:t xml:space="preserve"> rename, Distillation signature fix, distillation trigger, Grimoire store path </w:t>
+            </w:r>
+          </w:p>
+          <w:p>
+            <w:pPr>
               <w:pStyle w:val="Normal"/>
               <w:rPr/>
             </w:pPr>
@@ -13258,6 +13851,26 @@
           </w:tcPr>
           <w:p>
             <w:pPr>
+              <w:pStyle w:val="BodyText"/>
+              <w:numPr>
+                <w:ilvl w:val="0"/>
+                <w:numId w:val="16"/>
+              </w:numPr>
+              <w:tabs>
+                <w:tab w:val="clear" w:pos="720"/>
+                <w:tab w:val="left" w:pos="0" w:leader="none"/>
+              </w:tabs>
+              <w:spacing w:before="0" w:after="0"/>
+              <w:ind w:hanging="283" w:start="720"/>
+              <w:rPr/>
+            </w:pPr>
+            <w:r>
+              <w:rPr/>
+              <w:t xml:space="preserve">FAT_PATTERNS broken regex — pattern split across two string literals in the list </w:t>
+            </w:r>
+          </w:p>
+          <w:p>
+            <w:pPr>
               <w:pStyle w:val="Normal"/>
               <w:rPr/>
             </w:pPr>
@@ -13282,6 +13895,32 @@
           </w:tcPr>
           <w:p>
             <w:pPr>
+              <w:pStyle w:val="BodyText"/>
+              <w:numPr>
+                <w:ilvl w:val="0"/>
+                <w:numId w:val="17"/>
+              </w:numPr>
+              <w:tabs>
+                <w:tab w:val="clear" w:pos="720"/>
+                <w:tab w:val="left" w:pos="0" w:leader="none"/>
+              </w:tabs>
+              <w:spacing w:before="0" w:after="0"/>
+              <w:ind w:hanging="283" w:start="720"/>
+              <w:rPr/>
+            </w:pPr>
+            <w:r>
+              <w:rPr>
+                <w:rStyle w:val="SourceText"/>
+              </w:rPr>
+              <w:t>memory/tome.py</w:t>
+            </w:r>
+            <w:r>
+              <w:rPr/>
+              <w:t xml:space="preserve"> missing from disk despite being fully designed — silent until Phase 4 tests ran for the first time in Phase 5 </w:t>
+            </w:r>
+          </w:p>
+          <w:p>
+            <w:pPr>
               <w:pStyle w:val="Normal"/>
               <w:rPr/>
             </w:pPr>
@@ -13304,6 +13943,140 @@
               <w:end w:val="single" w:sz="2" w:space="0" w:color="AAAAAA"/>
             </w:tcBorders>
           </w:tcPr>
+          <w:p>
+            <w:pPr>
+              <w:pStyle w:val="BodyText"/>
+              <w:numPr>
+                <w:ilvl w:val="0"/>
+                <w:numId w:val="17"/>
+              </w:numPr>
+              <w:tabs>
+                <w:tab w:val="clear" w:pos="720"/>
+                <w:tab w:val="left" w:pos="0" w:leader="none"/>
+              </w:tabs>
+              <w:spacing w:before="0" w:after="0"/>
+              <w:ind w:hanging="283" w:start="720"/>
+              <w:rPr/>
+            </w:pPr>
+            <w:r>
+              <w:rPr/>
+              <w:t xml:space="preserve">Chronicle tests failing with </w:t>
+            </w:r>
+            <w:r>
+              <w:rPr>
+                <w:rStyle w:val="SourceText"/>
+              </w:rPr>
+              <w:t>EOFError</w:t>
+            </w:r>
+            <w:r>
+              <w:rPr/>
+              <w:t xml:space="preserve"> — mocked cfg pointing to real (empty) vectors file, needed </w:t>
+            </w:r>
+            <w:r>
+              <w:rPr>
+                <w:rStyle w:val="SourceText"/>
+              </w:rPr>
+              <w:t>tmp_path</w:t>
+            </w:r>
+            <w:r>
+              <w:rPr/>
+              <w:t xml:space="preserve"> override </w:t>
+            </w:r>
+          </w:p>
+        </w:tc>
+      </w:tr>
+      <w:tr>
+        <w:trPr>
+          <w:cantSplit w:val="true"/>
+        </w:trPr>
+        <w:tc>
+          <w:tcPr>
+            <w:tcW w:w="9360" w:type="dxa"/>
+            <w:tcBorders>
+              <w:start w:val="single" w:sz="2" w:space="0" w:color="AAAAAA"/>
+              <w:bottom w:val="single" w:sz="2" w:space="0" w:color="AAAAAA"/>
+              <w:end w:val="single" w:sz="2" w:space="0" w:color="AAAAAA"/>
+            </w:tcBorders>
+          </w:tcPr>
+          <w:p>
+            <w:pPr>
+              <w:pStyle w:val="BodyText"/>
+              <w:numPr>
+                <w:ilvl w:val="0"/>
+                <w:numId w:val="18"/>
+              </w:numPr>
+              <w:tabs>
+                <w:tab w:val="clear" w:pos="720"/>
+                <w:tab w:val="left" w:pos="0" w:leader="none"/>
+              </w:tabs>
+              <w:spacing w:before="0" w:after="0"/>
+              <w:ind w:hanging="283" w:start="720"/>
+              <w:rPr/>
+            </w:pPr>
+            <w:r>
+              <w:rPr/>
+              <w:t xml:space="preserve">Reflection tests using </w:t>
+            </w:r>
+            <w:r>
+              <w:rPr>
+                <w:rStyle w:val="SourceText"/>
+              </w:rPr>
+              <w:t>log_path=</w:t>
+            </w:r>
+            <w:r>
+              <w:rPr/>
+              <w:t xml:space="preserve"> kwarg that doesn't exist — tests written against imagined API, not real signature </w:t>
+            </w:r>
+          </w:p>
+          <w:p>
+            <w:pPr>
+              <w:pStyle w:val="Normal"/>
+              <w:rPr/>
+            </w:pPr>
+            <w:r>
+              <w:rPr/>
+            </w:r>
+          </w:p>
+        </w:tc>
+      </w:tr>
+      <w:tr>
+        <w:trPr>
+          <w:cantSplit w:val="true"/>
+        </w:trPr>
+        <w:tc>
+          <w:tcPr>
+            <w:tcW w:w="9360" w:type="dxa"/>
+            <w:tcBorders>
+              <w:start w:val="single" w:sz="2" w:space="0" w:color="AAAAAA"/>
+              <w:bottom w:val="single" w:sz="2" w:space="0" w:color="AAAAAA"/>
+              <w:end w:val="single" w:sz="2" w:space="0" w:color="AAAAAA"/>
+            </w:tcBorders>
+          </w:tcPr>
+          <w:p>
+            <w:pPr>
+              <w:pStyle w:val="BodyText"/>
+              <w:numPr>
+                <w:ilvl w:val="0"/>
+                <w:numId w:val="19"/>
+              </w:numPr>
+              <w:tabs>
+                <w:tab w:val="clear" w:pos="720"/>
+                <w:tab w:val="left" w:pos="0" w:leader="none"/>
+              </w:tabs>
+              <w:ind w:hanging="283" w:start="709" w:end="0"/>
+              <w:rPr/>
+            </w:pPr>
+            <w:r>
+              <w:rPr>
+                <w:rStyle w:val="SourceText"/>
+              </w:rPr>
+              <w:t>_extract_chronicle_entries</w:t>
+            </w:r>
+            <w:r>
+              <w:rPr/>
+              <w:t xml:space="preserve"> word count threshold (15) meant short test messages never extracted — required longer fixture messages to pass </w:t>
+            </w:r>
+          </w:p>
           <w:p>
             <w:pPr>
               <w:pStyle w:val="Normal"/>
@@ -13363,6 +14136,7 @@
       </w:tblGrid>
       <w:tr>
         <w:trPr>
+          <w:trHeight w:val="450" w:hRule="atLeast"/>
           <w:cantSplit w:val="true"/>
         </w:trPr>
         <w:tc>
@@ -13408,6 +14182,7 @@
             </w:pPr>
             <w:r>
               <w:rPr/>
+              <w:t>08 March 2026</w:t>
             </w:r>
           </w:p>
         </w:tc>
@@ -13487,6 +14262,7 @@
             </w:pPr>
             <w:r>
               <w:rPr/>
+              <w:t>80/80</w:t>
             </w:r>
           </w:p>
         </w:tc>
@@ -13562,10 +14338,24 @@
           <w:p>
             <w:pPr>
               <w:pStyle w:val="Normal"/>
-              <w:rPr/>
-            </w:pPr>
-            <w:r>
-              <w:rPr/>
+              <w:ind w:hanging="0" w:start="0" w:end="0"/>
+              <w:rPr>
+                <w:rFonts w:ascii="monospace" w:hAnsi="monospace"/>
+              </w:rPr>
+            </w:pPr>
+            <w:r>
+              <w:rPr>
+                <w:rFonts w:ascii="monospace" w:hAnsi="monospace"/>
+                <w:color w:val="B26818"/>
+                <w:shd w:fill="FFFFFF" w:val="clear"/>
+              </w:rPr>
+              <w:t>325aaf8</w:t>
+            </w:r>
+            <w:r>
+              <w:rPr>
+                <w:rFonts w:ascii="monospace" w:hAnsi="monospace"/>
+              </w:rPr>
+              <w:br/>
             </w:r>
           </w:p>
         </w:tc>
@@ -13897,6 +14687,7 @@
             </w:pPr>
             <w:r>
               <w:rPr/>
+              <w:t>08 March 2026</w:t>
             </w:r>
           </w:p>
         </w:tc>
@@ -13972,10 +14763,24 @@
           <w:p>
             <w:pPr>
               <w:pStyle w:val="Normal"/>
-              <w:rPr/>
-            </w:pPr>
-            <w:r>
-              <w:rPr/>
+              <w:ind w:hanging="0" w:start="0" w:end="0"/>
+              <w:rPr>
+                <w:rFonts w:ascii="monospace" w:hAnsi="monospace"/>
+              </w:rPr>
+            </w:pPr>
+            <w:r>
+              <w:rPr>
+                <w:rFonts w:ascii="monospace" w:hAnsi="monospace"/>
+                <w:color w:val="000000"/>
+                <w:shd w:fill="FFFFFF" w:val="clear"/>
+              </w:rPr>
+              <w:t>phase-6-entity-foundation</w:t>
+            </w:r>
+            <w:r>
+              <w:rPr>
+                <w:rFonts w:ascii="monospace" w:hAnsi="monospace"/>
+              </w:rPr>
+              <w:br/>
             </w:r>
           </w:p>
         </w:tc>
@@ -14055,6 +14860,7 @@
             </w:pPr>
             <w:r>
               <w:rPr/>
+              <w:t>NA</w:t>
             </w:r>
           </w:p>
         </w:tc>
@@ -14149,6 +14955,7 @@
             </w:pPr>
             <w:r>
               <w:rPr/>
+              <w:t>Adds the framework for the emergent entities, or the Council</w:t>
             </w:r>
           </w:p>
         </w:tc>
@@ -14173,6 +14980,7 @@
             </w:pPr>
             <w:r>
               <w:rPr/>
+              <w:t>Adds two base Entities, Luminarious and the Assessor</w:t>
             </w:r>
           </w:p>
         </w:tc>
@@ -24170,7 +24978,7 @@
     </w:r>
     <w:r>
       <w:rPr/>
-      <w:t>33</w:t>
+      <w:t>21</w:t>
     </w:r>
     <w:r>
       <w:rPr/>
@@ -24214,7 +25022,7 @@
     </w:r>
     <w:r>
       <w:rPr/>
-      <w:t>33</w:t>
+      <w:t>21</w:t>
     </w:r>
     <w:r>
       <w:rPr/>
@@ -24663,6 +25471,1862 @@
   <w:abstractNum w:abstractNumId="4">
     <w:lvl w:ilvl="0">
       <w:start w:val="1"/>
+      <w:numFmt w:val="bullet"/>
+      <w:lvlText w:val=""/>
+      <w:lvlJc w:val="start"/>
+      <w:pPr>
+        <w:tabs>
+          <w:tab w:val="num" w:pos="720"/>
+        </w:tabs>
+        <w:ind w:start="720" w:hanging="283"/>
+      </w:pPr>
+      <w:rPr>
+        <w:rFonts w:ascii="Symbol" w:hAnsi="Symbol" w:cs="Symbol" w:hint="default"/>
+      </w:rPr>
+    </w:lvl>
+    <w:lvl w:ilvl="1">
+      <w:start w:val="1"/>
+      <w:numFmt w:val="decimal"/>
+      <w:lvlText w:val="%2."/>
+      <w:lvlJc w:val="start"/>
+      <w:pPr>
+        <w:tabs>
+          <w:tab w:val="num" w:pos="1080"/>
+        </w:tabs>
+        <w:ind w:start="1080" w:hanging="360"/>
+      </w:pPr>
+    </w:lvl>
+    <w:lvl w:ilvl="2">
+      <w:start w:val="1"/>
+      <w:numFmt w:val="decimal"/>
+      <w:lvlText w:val="%3."/>
+      <w:lvlJc w:val="start"/>
+      <w:pPr>
+        <w:tabs>
+          <w:tab w:val="num" w:pos="1440"/>
+        </w:tabs>
+        <w:ind w:start="1440" w:hanging="360"/>
+      </w:pPr>
+    </w:lvl>
+    <w:lvl w:ilvl="3">
+      <w:start w:val="1"/>
+      <w:numFmt w:val="decimal"/>
+      <w:lvlText w:val="%4."/>
+      <w:lvlJc w:val="start"/>
+      <w:pPr>
+        <w:tabs>
+          <w:tab w:val="num" w:pos="1800"/>
+        </w:tabs>
+        <w:ind w:start="1800" w:hanging="360"/>
+      </w:pPr>
+    </w:lvl>
+    <w:lvl w:ilvl="4">
+      <w:start w:val="1"/>
+      <w:numFmt w:val="decimal"/>
+      <w:lvlText w:val="%5."/>
+      <w:lvlJc w:val="start"/>
+      <w:pPr>
+        <w:tabs>
+          <w:tab w:val="num" w:pos="2160"/>
+        </w:tabs>
+        <w:ind w:start="2160" w:hanging="360"/>
+      </w:pPr>
+    </w:lvl>
+    <w:lvl w:ilvl="5">
+      <w:start w:val="1"/>
+      <w:numFmt w:val="decimal"/>
+      <w:lvlText w:val="%6."/>
+      <w:lvlJc w:val="start"/>
+      <w:pPr>
+        <w:tabs>
+          <w:tab w:val="num" w:pos="2520"/>
+        </w:tabs>
+        <w:ind w:start="2520" w:hanging="360"/>
+      </w:pPr>
+    </w:lvl>
+    <w:lvl w:ilvl="6">
+      <w:start w:val="1"/>
+      <w:numFmt w:val="decimal"/>
+      <w:lvlText w:val="%7."/>
+      <w:lvlJc w:val="start"/>
+      <w:pPr>
+        <w:tabs>
+          <w:tab w:val="num" w:pos="2880"/>
+        </w:tabs>
+        <w:ind w:start="2880" w:hanging="360"/>
+      </w:pPr>
+    </w:lvl>
+    <w:lvl w:ilvl="7">
+      <w:start w:val="1"/>
+      <w:numFmt w:val="decimal"/>
+      <w:lvlText w:val="%8."/>
+      <w:lvlJc w:val="start"/>
+      <w:pPr>
+        <w:tabs>
+          <w:tab w:val="num" w:pos="3240"/>
+        </w:tabs>
+        <w:ind w:start="3240" w:hanging="360"/>
+      </w:pPr>
+    </w:lvl>
+    <w:lvl w:ilvl="8">
+      <w:start w:val="1"/>
+      <w:numFmt w:val="decimal"/>
+      <w:lvlText w:val="%9."/>
+      <w:lvlJc w:val="start"/>
+      <w:pPr>
+        <w:tabs>
+          <w:tab w:val="num" w:pos="3600"/>
+        </w:tabs>
+        <w:ind w:start="3600" w:hanging="360"/>
+      </w:pPr>
+    </w:lvl>
+  </w:abstractNum>
+  <w:abstractNum w:abstractNumId="5">
+    <w:lvl w:ilvl="0">
+      <w:start w:val="1"/>
+      <w:numFmt w:val="bullet"/>
+      <w:lvlText w:val=""/>
+      <w:lvlJc w:val="start"/>
+      <w:pPr>
+        <w:tabs>
+          <w:tab w:val="num" w:pos="720"/>
+        </w:tabs>
+        <w:ind w:start="720" w:hanging="283"/>
+      </w:pPr>
+      <w:rPr>
+        <w:rFonts w:ascii="Symbol" w:hAnsi="Symbol" w:cs="Symbol" w:hint="default"/>
+      </w:rPr>
+    </w:lvl>
+    <w:lvl w:ilvl="1">
+      <w:start w:val="1"/>
+      <w:numFmt w:val="decimal"/>
+      <w:lvlText w:val="%2."/>
+      <w:lvlJc w:val="start"/>
+      <w:pPr>
+        <w:tabs>
+          <w:tab w:val="num" w:pos="1080"/>
+        </w:tabs>
+        <w:ind w:start="1080" w:hanging="360"/>
+      </w:pPr>
+    </w:lvl>
+    <w:lvl w:ilvl="2">
+      <w:start w:val="1"/>
+      <w:numFmt w:val="decimal"/>
+      <w:lvlText w:val="%3."/>
+      <w:lvlJc w:val="start"/>
+      <w:pPr>
+        <w:tabs>
+          <w:tab w:val="num" w:pos="1440"/>
+        </w:tabs>
+        <w:ind w:start="1440" w:hanging="360"/>
+      </w:pPr>
+    </w:lvl>
+    <w:lvl w:ilvl="3">
+      <w:start w:val="1"/>
+      <w:numFmt w:val="decimal"/>
+      <w:lvlText w:val="%4."/>
+      <w:lvlJc w:val="start"/>
+      <w:pPr>
+        <w:tabs>
+          <w:tab w:val="num" w:pos="1800"/>
+        </w:tabs>
+        <w:ind w:start="1800" w:hanging="360"/>
+      </w:pPr>
+    </w:lvl>
+    <w:lvl w:ilvl="4">
+      <w:start w:val="1"/>
+      <w:numFmt w:val="decimal"/>
+      <w:lvlText w:val="%5."/>
+      <w:lvlJc w:val="start"/>
+      <w:pPr>
+        <w:tabs>
+          <w:tab w:val="num" w:pos="2160"/>
+        </w:tabs>
+        <w:ind w:start="2160" w:hanging="360"/>
+      </w:pPr>
+    </w:lvl>
+    <w:lvl w:ilvl="5">
+      <w:start w:val="1"/>
+      <w:numFmt w:val="decimal"/>
+      <w:lvlText w:val="%6."/>
+      <w:lvlJc w:val="start"/>
+      <w:pPr>
+        <w:tabs>
+          <w:tab w:val="num" w:pos="2520"/>
+        </w:tabs>
+        <w:ind w:start="2520" w:hanging="360"/>
+      </w:pPr>
+    </w:lvl>
+    <w:lvl w:ilvl="6">
+      <w:start w:val="1"/>
+      <w:numFmt w:val="decimal"/>
+      <w:lvlText w:val="%7."/>
+      <w:lvlJc w:val="start"/>
+      <w:pPr>
+        <w:tabs>
+          <w:tab w:val="num" w:pos="2880"/>
+        </w:tabs>
+        <w:ind w:start="2880" w:hanging="360"/>
+      </w:pPr>
+    </w:lvl>
+    <w:lvl w:ilvl="7">
+      <w:start w:val="1"/>
+      <w:numFmt w:val="decimal"/>
+      <w:lvlText w:val="%8."/>
+      <w:lvlJc w:val="start"/>
+      <w:pPr>
+        <w:tabs>
+          <w:tab w:val="num" w:pos="3240"/>
+        </w:tabs>
+        <w:ind w:start="3240" w:hanging="360"/>
+      </w:pPr>
+    </w:lvl>
+    <w:lvl w:ilvl="8">
+      <w:start w:val="1"/>
+      <w:numFmt w:val="decimal"/>
+      <w:lvlText w:val="%9."/>
+      <w:lvlJc w:val="start"/>
+      <w:pPr>
+        <w:tabs>
+          <w:tab w:val="num" w:pos="3600"/>
+        </w:tabs>
+        <w:ind w:start="3600" w:hanging="360"/>
+      </w:pPr>
+    </w:lvl>
+  </w:abstractNum>
+  <w:abstractNum w:abstractNumId="6">
+    <w:lvl w:ilvl="0">
+      <w:start w:val="1"/>
+      <w:numFmt w:val="bullet"/>
+      <w:lvlText w:val=""/>
+      <w:lvlJc w:val="start"/>
+      <w:pPr>
+        <w:tabs>
+          <w:tab w:val="num" w:pos="720"/>
+        </w:tabs>
+        <w:ind w:start="720" w:hanging="283"/>
+      </w:pPr>
+      <w:rPr>
+        <w:rFonts w:ascii="Symbol" w:hAnsi="Symbol" w:cs="Symbol" w:hint="default"/>
+      </w:rPr>
+    </w:lvl>
+    <w:lvl w:ilvl="1">
+      <w:start w:val="1"/>
+      <w:numFmt w:val="decimal"/>
+      <w:lvlText w:val="%2."/>
+      <w:lvlJc w:val="start"/>
+      <w:pPr>
+        <w:tabs>
+          <w:tab w:val="num" w:pos="1080"/>
+        </w:tabs>
+        <w:ind w:start="1080" w:hanging="360"/>
+      </w:pPr>
+    </w:lvl>
+    <w:lvl w:ilvl="2">
+      <w:start w:val="1"/>
+      <w:numFmt w:val="decimal"/>
+      <w:lvlText w:val="%3."/>
+      <w:lvlJc w:val="start"/>
+      <w:pPr>
+        <w:tabs>
+          <w:tab w:val="num" w:pos="1440"/>
+        </w:tabs>
+        <w:ind w:start="1440" w:hanging="360"/>
+      </w:pPr>
+    </w:lvl>
+    <w:lvl w:ilvl="3">
+      <w:start w:val="1"/>
+      <w:numFmt w:val="decimal"/>
+      <w:lvlText w:val="%4."/>
+      <w:lvlJc w:val="start"/>
+      <w:pPr>
+        <w:tabs>
+          <w:tab w:val="num" w:pos="1800"/>
+        </w:tabs>
+        <w:ind w:start="1800" w:hanging="360"/>
+      </w:pPr>
+    </w:lvl>
+    <w:lvl w:ilvl="4">
+      <w:start w:val="1"/>
+      <w:numFmt w:val="decimal"/>
+      <w:lvlText w:val="%5."/>
+      <w:lvlJc w:val="start"/>
+      <w:pPr>
+        <w:tabs>
+          <w:tab w:val="num" w:pos="2160"/>
+        </w:tabs>
+        <w:ind w:start="2160" w:hanging="360"/>
+      </w:pPr>
+    </w:lvl>
+    <w:lvl w:ilvl="5">
+      <w:start w:val="1"/>
+      <w:numFmt w:val="decimal"/>
+      <w:lvlText w:val="%6."/>
+      <w:lvlJc w:val="start"/>
+      <w:pPr>
+        <w:tabs>
+          <w:tab w:val="num" w:pos="2520"/>
+        </w:tabs>
+        <w:ind w:start="2520" w:hanging="360"/>
+      </w:pPr>
+    </w:lvl>
+    <w:lvl w:ilvl="6">
+      <w:start w:val="1"/>
+      <w:numFmt w:val="decimal"/>
+      <w:lvlText w:val="%7."/>
+      <w:lvlJc w:val="start"/>
+      <w:pPr>
+        <w:tabs>
+          <w:tab w:val="num" w:pos="2880"/>
+        </w:tabs>
+        <w:ind w:start="2880" w:hanging="360"/>
+      </w:pPr>
+    </w:lvl>
+    <w:lvl w:ilvl="7">
+      <w:start w:val="1"/>
+      <w:numFmt w:val="decimal"/>
+      <w:lvlText w:val="%8."/>
+      <w:lvlJc w:val="start"/>
+      <w:pPr>
+        <w:tabs>
+          <w:tab w:val="num" w:pos="3240"/>
+        </w:tabs>
+        <w:ind w:start="3240" w:hanging="360"/>
+      </w:pPr>
+    </w:lvl>
+    <w:lvl w:ilvl="8">
+      <w:start w:val="1"/>
+      <w:numFmt w:val="decimal"/>
+      <w:lvlText w:val="%9."/>
+      <w:lvlJc w:val="start"/>
+      <w:pPr>
+        <w:tabs>
+          <w:tab w:val="num" w:pos="3600"/>
+        </w:tabs>
+        <w:ind w:start="3600" w:hanging="360"/>
+      </w:pPr>
+    </w:lvl>
+  </w:abstractNum>
+  <w:abstractNum w:abstractNumId="7">
+    <w:lvl w:ilvl="0">
+      <w:start w:val="1"/>
+      <w:numFmt w:val="bullet"/>
+      <w:lvlText w:val=""/>
+      <w:lvlJc w:val="start"/>
+      <w:pPr>
+        <w:tabs>
+          <w:tab w:val="num" w:pos="720"/>
+        </w:tabs>
+        <w:ind w:start="720" w:hanging="283"/>
+      </w:pPr>
+      <w:rPr>
+        <w:rFonts w:ascii="Symbol" w:hAnsi="Symbol" w:cs="Symbol" w:hint="default"/>
+      </w:rPr>
+    </w:lvl>
+    <w:lvl w:ilvl="1">
+      <w:start w:val="1"/>
+      <w:numFmt w:val="decimal"/>
+      <w:lvlText w:val="%2."/>
+      <w:lvlJc w:val="start"/>
+      <w:pPr>
+        <w:tabs>
+          <w:tab w:val="num" w:pos="1080"/>
+        </w:tabs>
+        <w:ind w:start="1080" w:hanging="360"/>
+      </w:pPr>
+    </w:lvl>
+    <w:lvl w:ilvl="2">
+      <w:start w:val="1"/>
+      <w:numFmt w:val="decimal"/>
+      <w:lvlText w:val="%3."/>
+      <w:lvlJc w:val="start"/>
+      <w:pPr>
+        <w:tabs>
+          <w:tab w:val="num" w:pos="1440"/>
+        </w:tabs>
+        <w:ind w:start="1440" w:hanging="360"/>
+      </w:pPr>
+    </w:lvl>
+    <w:lvl w:ilvl="3">
+      <w:start w:val="1"/>
+      <w:numFmt w:val="decimal"/>
+      <w:lvlText w:val="%4."/>
+      <w:lvlJc w:val="start"/>
+      <w:pPr>
+        <w:tabs>
+          <w:tab w:val="num" w:pos="1800"/>
+        </w:tabs>
+        <w:ind w:start="1800" w:hanging="360"/>
+      </w:pPr>
+    </w:lvl>
+    <w:lvl w:ilvl="4">
+      <w:start w:val="1"/>
+      <w:numFmt w:val="decimal"/>
+      <w:lvlText w:val="%5."/>
+      <w:lvlJc w:val="start"/>
+      <w:pPr>
+        <w:tabs>
+          <w:tab w:val="num" w:pos="2160"/>
+        </w:tabs>
+        <w:ind w:start="2160" w:hanging="360"/>
+      </w:pPr>
+    </w:lvl>
+    <w:lvl w:ilvl="5">
+      <w:start w:val="1"/>
+      <w:numFmt w:val="decimal"/>
+      <w:lvlText w:val="%6."/>
+      <w:lvlJc w:val="start"/>
+      <w:pPr>
+        <w:tabs>
+          <w:tab w:val="num" w:pos="2520"/>
+        </w:tabs>
+        <w:ind w:start="2520" w:hanging="360"/>
+      </w:pPr>
+    </w:lvl>
+    <w:lvl w:ilvl="6">
+      <w:start w:val="1"/>
+      <w:numFmt w:val="decimal"/>
+      <w:lvlText w:val="%7."/>
+      <w:lvlJc w:val="start"/>
+      <w:pPr>
+        <w:tabs>
+          <w:tab w:val="num" w:pos="2880"/>
+        </w:tabs>
+        <w:ind w:start="2880" w:hanging="360"/>
+      </w:pPr>
+    </w:lvl>
+    <w:lvl w:ilvl="7">
+      <w:start w:val="1"/>
+      <w:numFmt w:val="decimal"/>
+      <w:lvlText w:val="%8."/>
+      <w:lvlJc w:val="start"/>
+      <w:pPr>
+        <w:tabs>
+          <w:tab w:val="num" w:pos="3240"/>
+        </w:tabs>
+        <w:ind w:start="3240" w:hanging="360"/>
+      </w:pPr>
+    </w:lvl>
+    <w:lvl w:ilvl="8">
+      <w:start w:val="1"/>
+      <w:numFmt w:val="decimal"/>
+      <w:lvlText w:val="%9."/>
+      <w:lvlJc w:val="start"/>
+      <w:pPr>
+        <w:tabs>
+          <w:tab w:val="num" w:pos="3600"/>
+        </w:tabs>
+        <w:ind w:start="3600" w:hanging="360"/>
+      </w:pPr>
+    </w:lvl>
+  </w:abstractNum>
+  <w:abstractNum w:abstractNumId="8">
+    <w:lvl w:ilvl="0">
+      <w:start w:val="1"/>
+      <w:numFmt w:val="bullet"/>
+      <w:lvlText w:val=""/>
+      <w:lvlJc w:val="start"/>
+      <w:pPr>
+        <w:tabs>
+          <w:tab w:val="num" w:pos="720"/>
+        </w:tabs>
+        <w:ind w:start="720" w:hanging="283"/>
+      </w:pPr>
+      <w:rPr>
+        <w:rFonts w:ascii="Symbol" w:hAnsi="Symbol" w:cs="Symbol" w:hint="default"/>
+      </w:rPr>
+    </w:lvl>
+    <w:lvl w:ilvl="1">
+      <w:start w:val="1"/>
+      <w:numFmt w:val="decimal"/>
+      <w:lvlText w:val="%2."/>
+      <w:lvlJc w:val="start"/>
+      <w:pPr>
+        <w:tabs>
+          <w:tab w:val="num" w:pos="1080"/>
+        </w:tabs>
+        <w:ind w:start="1080" w:hanging="360"/>
+      </w:pPr>
+    </w:lvl>
+    <w:lvl w:ilvl="2">
+      <w:start w:val="1"/>
+      <w:numFmt w:val="decimal"/>
+      <w:lvlText w:val="%3."/>
+      <w:lvlJc w:val="start"/>
+      <w:pPr>
+        <w:tabs>
+          <w:tab w:val="num" w:pos="1440"/>
+        </w:tabs>
+        <w:ind w:start="1440" w:hanging="360"/>
+      </w:pPr>
+    </w:lvl>
+    <w:lvl w:ilvl="3">
+      <w:start w:val="1"/>
+      <w:numFmt w:val="decimal"/>
+      <w:lvlText w:val="%4."/>
+      <w:lvlJc w:val="start"/>
+      <w:pPr>
+        <w:tabs>
+          <w:tab w:val="num" w:pos="1800"/>
+        </w:tabs>
+        <w:ind w:start="1800" w:hanging="360"/>
+      </w:pPr>
+    </w:lvl>
+    <w:lvl w:ilvl="4">
+      <w:start w:val="1"/>
+      <w:numFmt w:val="decimal"/>
+      <w:lvlText w:val="%5."/>
+      <w:lvlJc w:val="start"/>
+      <w:pPr>
+        <w:tabs>
+          <w:tab w:val="num" w:pos="2160"/>
+        </w:tabs>
+        <w:ind w:start="2160" w:hanging="360"/>
+      </w:pPr>
+    </w:lvl>
+    <w:lvl w:ilvl="5">
+      <w:start w:val="1"/>
+      <w:numFmt w:val="decimal"/>
+      <w:lvlText w:val="%6."/>
+      <w:lvlJc w:val="start"/>
+      <w:pPr>
+        <w:tabs>
+          <w:tab w:val="num" w:pos="2520"/>
+        </w:tabs>
+        <w:ind w:start="2520" w:hanging="360"/>
+      </w:pPr>
+    </w:lvl>
+    <w:lvl w:ilvl="6">
+      <w:start w:val="1"/>
+      <w:numFmt w:val="decimal"/>
+      <w:lvlText w:val="%7."/>
+      <w:lvlJc w:val="start"/>
+      <w:pPr>
+        <w:tabs>
+          <w:tab w:val="num" w:pos="2880"/>
+        </w:tabs>
+        <w:ind w:start="2880" w:hanging="360"/>
+      </w:pPr>
+    </w:lvl>
+    <w:lvl w:ilvl="7">
+      <w:start w:val="1"/>
+      <w:numFmt w:val="decimal"/>
+      <w:lvlText w:val="%8."/>
+      <w:lvlJc w:val="start"/>
+      <w:pPr>
+        <w:tabs>
+          <w:tab w:val="num" w:pos="3240"/>
+        </w:tabs>
+        <w:ind w:start="3240" w:hanging="360"/>
+      </w:pPr>
+    </w:lvl>
+    <w:lvl w:ilvl="8">
+      <w:start w:val="1"/>
+      <w:numFmt w:val="decimal"/>
+      <w:lvlText w:val="%9."/>
+      <w:lvlJc w:val="start"/>
+      <w:pPr>
+        <w:tabs>
+          <w:tab w:val="num" w:pos="3600"/>
+        </w:tabs>
+        <w:ind w:start="3600" w:hanging="360"/>
+      </w:pPr>
+    </w:lvl>
+  </w:abstractNum>
+  <w:abstractNum w:abstractNumId="9">
+    <w:lvl w:ilvl="0">
+      <w:start w:val="1"/>
+      <w:numFmt w:val="bullet"/>
+      <w:lvlText w:val=""/>
+      <w:lvlJc w:val="start"/>
+      <w:pPr>
+        <w:tabs>
+          <w:tab w:val="num" w:pos="720"/>
+        </w:tabs>
+        <w:ind w:start="720" w:hanging="283"/>
+      </w:pPr>
+      <w:rPr>
+        <w:rFonts w:ascii="Symbol" w:hAnsi="Symbol" w:cs="Symbol" w:hint="default"/>
+      </w:rPr>
+    </w:lvl>
+    <w:lvl w:ilvl="1">
+      <w:start w:val="1"/>
+      <w:numFmt w:val="decimal"/>
+      <w:lvlText w:val="%2."/>
+      <w:lvlJc w:val="start"/>
+      <w:pPr>
+        <w:tabs>
+          <w:tab w:val="num" w:pos="1080"/>
+        </w:tabs>
+        <w:ind w:start="1080" w:hanging="360"/>
+      </w:pPr>
+    </w:lvl>
+    <w:lvl w:ilvl="2">
+      <w:start w:val="1"/>
+      <w:numFmt w:val="decimal"/>
+      <w:lvlText w:val="%3."/>
+      <w:lvlJc w:val="start"/>
+      <w:pPr>
+        <w:tabs>
+          <w:tab w:val="num" w:pos="1440"/>
+        </w:tabs>
+        <w:ind w:start="1440" w:hanging="360"/>
+      </w:pPr>
+    </w:lvl>
+    <w:lvl w:ilvl="3">
+      <w:start w:val="1"/>
+      <w:numFmt w:val="decimal"/>
+      <w:lvlText w:val="%4."/>
+      <w:lvlJc w:val="start"/>
+      <w:pPr>
+        <w:tabs>
+          <w:tab w:val="num" w:pos="1800"/>
+        </w:tabs>
+        <w:ind w:start="1800" w:hanging="360"/>
+      </w:pPr>
+    </w:lvl>
+    <w:lvl w:ilvl="4">
+      <w:start w:val="1"/>
+      <w:numFmt w:val="decimal"/>
+      <w:lvlText w:val="%5."/>
+      <w:lvlJc w:val="start"/>
+      <w:pPr>
+        <w:tabs>
+          <w:tab w:val="num" w:pos="2160"/>
+        </w:tabs>
+        <w:ind w:start="2160" w:hanging="360"/>
+      </w:pPr>
+    </w:lvl>
+    <w:lvl w:ilvl="5">
+      <w:start w:val="1"/>
+      <w:numFmt w:val="decimal"/>
+      <w:lvlText w:val="%6."/>
+      <w:lvlJc w:val="start"/>
+      <w:pPr>
+        <w:tabs>
+          <w:tab w:val="num" w:pos="2520"/>
+        </w:tabs>
+        <w:ind w:start="2520" w:hanging="360"/>
+      </w:pPr>
+    </w:lvl>
+    <w:lvl w:ilvl="6">
+      <w:start w:val="1"/>
+      <w:numFmt w:val="decimal"/>
+      <w:lvlText w:val="%7."/>
+      <w:lvlJc w:val="start"/>
+      <w:pPr>
+        <w:tabs>
+          <w:tab w:val="num" w:pos="2880"/>
+        </w:tabs>
+        <w:ind w:start="2880" w:hanging="360"/>
+      </w:pPr>
+    </w:lvl>
+    <w:lvl w:ilvl="7">
+      <w:start w:val="1"/>
+      <w:numFmt w:val="decimal"/>
+      <w:lvlText w:val="%8."/>
+      <w:lvlJc w:val="start"/>
+      <w:pPr>
+        <w:tabs>
+          <w:tab w:val="num" w:pos="3240"/>
+        </w:tabs>
+        <w:ind w:start="3240" w:hanging="360"/>
+      </w:pPr>
+    </w:lvl>
+    <w:lvl w:ilvl="8">
+      <w:start w:val="1"/>
+      <w:numFmt w:val="decimal"/>
+      <w:lvlText w:val="%9."/>
+      <w:lvlJc w:val="start"/>
+      <w:pPr>
+        <w:tabs>
+          <w:tab w:val="num" w:pos="3600"/>
+        </w:tabs>
+        <w:ind w:start="3600" w:hanging="360"/>
+      </w:pPr>
+    </w:lvl>
+  </w:abstractNum>
+  <w:abstractNum w:abstractNumId="10">
+    <w:lvl w:ilvl="0">
+      <w:start w:val="1"/>
+      <w:numFmt w:val="bullet"/>
+      <w:lvlText w:val=""/>
+      <w:lvlJc w:val="start"/>
+      <w:pPr>
+        <w:tabs>
+          <w:tab w:val="num" w:pos="720"/>
+        </w:tabs>
+        <w:ind w:start="720" w:hanging="283"/>
+      </w:pPr>
+      <w:rPr>
+        <w:rFonts w:ascii="Symbol" w:hAnsi="Symbol" w:cs="Symbol" w:hint="default"/>
+      </w:rPr>
+    </w:lvl>
+    <w:lvl w:ilvl="1">
+      <w:start w:val="1"/>
+      <w:numFmt w:val="decimal"/>
+      <w:lvlText w:val="%2."/>
+      <w:lvlJc w:val="start"/>
+      <w:pPr>
+        <w:tabs>
+          <w:tab w:val="num" w:pos="1080"/>
+        </w:tabs>
+        <w:ind w:start="1080" w:hanging="360"/>
+      </w:pPr>
+    </w:lvl>
+    <w:lvl w:ilvl="2">
+      <w:start w:val="1"/>
+      <w:numFmt w:val="decimal"/>
+      <w:lvlText w:val="%3."/>
+      <w:lvlJc w:val="start"/>
+      <w:pPr>
+        <w:tabs>
+          <w:tab w:val="num" w:pos="1440"/>
+        </w:tabs>
+        <w:ind w:start="1440" w:hanging="360"/>
+      </w:pPr>
+    </w:lvl>
+    <w:lvl w:ilvl="3">
+      <w:start w:val="1"/>
+      <w:numFmt w:val="decimal"/>
+      <w:lvlText w:val="%4."/>
+      <w:lvlJc w:val="start"/>
+      <w:pPr>
+        <w:tabs>
+          <w:tab w:val="num" w:pos="1800"/>
+        </w:tabs>
+        <w:ind w:start="1800" w:hanging="360"/>
+      </w:pPr>
+    </w:lvl>
+    <w:lvl w:ilvl="4">
+      <w:start w:val="1"/>
+      <w:numFmt w:val="decimal"/>
+      <w:lvlText w:val="%5."/>
+      <w:lvlJc w:val="start"/>
+      <w:pPr>
+        <w:tabs>
+          <w:tab w:val="num" w:pos="2160"/>
+        </w:tabs>
+        <w:ind w:start="2160" w:hanging="360"/>
+      </w:pPr>
+    </w:lvl>
+    <w:lvl w:ilvl="5">
+      <w:start w:val="1"/>
+      <w:numFmt w:val="decimal"/>
+      <w:lvlText w:val="%6."/>
+      <w:lvlJc w:val="start"/>
+      <w:pPr>
+        <w:tabs>
+          <w:tab w:val="num" w:pos="2520"/>
+        </w:tabs>
+        <w:ind w:start="2520" w:hanging="360"/>
+      </w:pPr>
+    </w:lvl>
+    <w:lvl w:ilvl="6">
+      <w:start w:val="1"/>
+      <w:numFmt w:val="decimal"/>
+      <w:lvlText w:val="%7."/>
+      <w:lvlJc w:val="start"/>
+      <w:pPr>
+        <w:tabs>
+          <w:tab w:val="num" w:pos="2880"/>
+        </w:tabs>
+        <w:ind w:start="2880" w:hanging="360"/>
+      </w:pPr>
+    </w:lvl>
+    <w:lvl w:ilvl="7">
+      <w:start w:val="1"/>
+      <w:numFmt w:val="decimal"/>
+      <w:lvlText w:val="%8."/>
+      <w:lvlJc w:val="start"/>
+      <w:pPr>
+        <w:tabs>
+          <w:tab w:val="num" w:pos="3240"/>
+        </w:tabs>
+        <w:ind w:start="3240" w:hanging="360"/>
+      </w:pPr>
+    </w:lvl>
+    <w:lvl w:ilvl="8">
+      <w:start w:val="1"/>
+      <w:numFmt w:val="decimal"/>
+      <w:lvlText w:val="%9."/>
+      <w:lvlJc w:val="start"/>
+      <w:pPr>
+        <w:tabs>
+          <w:tab w:val="num" w:pos="3600"/>
+        </w:tabs>
+        <w:ind w:start="3600" w:hanging="360"/>
+      </w:pPr>
+    </w:lvl>
+  </w:abstractNum>
+  <w:abstractNum w:abstractNumId="11">
+    <w:lvl w:ilvl="0">
+      <w:start w:val="1"/>
+      <w:numFmt w:val="bullet"/>
+      <w:lvlText w:val=""/>
+      <w:lvlJc w:val="start"/>
+      <w:pPr>
+        <w:tabs>
+          <w:tab w:val="num" w:pos="720"/>
+        </w:tabs>
+        <w:ind w:start="720" w:hanging="283"/>
+      </w:pPr>
+      <w:rPr>
+        <w:rFonts w:ascii="Symbol" w:hAnsi="Symbol" w:cs="Symbol" w:hint="default"/>
+      </w:rPr>
+    </w:lvl>
+    <w:lvl w:ilvl="1">
+      <w:start w:val="1"/>
+      <w:numFmt w:val="decimal"/>
+      <w:lvlText w:val="%2."/>
+      <w:lvlJc w:val="start"/>
+      <w:pPr>
+        <w:tabs>
+          <w:tab w:val="num" w:pos="1080"/>
+        </w:tabs>
+        <w:ind w:start="1080" w:hanging="360"/>
+      </w:pPr>
+    </w:lvl>
+    <w:lvl w:ilvl="2">
+      <w:start w:val="1"/>
+      <w:numFmt w:val="decimal"/>
+      <w:lvlText w:val="%3."/>
+      <w:lvlJc w:val="start"/>
+      <w:pPr>
+        <w:tabs>
+          <w:tab w:val="num" w:pos="1440"/>
+        </w:tabs>
+        <w:ind w:start="1440" w:hanging="360"/>
+      </w:pPr>
+    </w:lvl>
+    <w:lvl w:ilvl="3">
+      <w:start w:val="1"/>
+      <w:numFmt w:val="decimal"/>
+      <w:lvlText w:val="%4."/>
+      <w:lvlJc w:val="start"/>
+      <w:pPr>
+        <w:tabs>
+          <w:tab w:val="num" w:pos="1800"/>
+        </w:tabs>
+        <w:ind w:start="1800" w:hanging="360"/>
+      </w:pPr>
+    </w:lvl>
+    <w:lvl w:ilvl="4">
+      <w:start w:val="1"/>
+      <w:numFmt w:val="decimal"/>
+      <w:lvlText w:val="%5."/>
+      <w:lvlJc w:val="start"/>
+      <w:pPr>
+        <w:tabs>
+          <w:tab w:val="num" w:pos="2160"/>
+        </w:tabs>
+        <w:ind w:start="2160" w:hanging="360"/>
+      </w:pPr>
+    </w:lvl>
+    <w:lvl w:ilvl="5">
+      <w:start w:val="1"/>
+      <w:numFmt w:val="decimal"/>
+      <w:lvlText w:val="%6."/>
+      <w:lvlJc w:val="start"/>
+      <w:pPr>
+        <w:tabs>
+          <w:tab w:val="num" w:pos="2520"/>
+        </w:tabs>
+        <w:ind w:start="2520" w:hanging="360"/>
+      </w:pPr>
+    </w:lvl>
+    <w:lvl w:ilvl="6">
+      <w:start w:val="1"/>
+      <w:numFmt w:val="decimal"/>
+      <w:lvlText w:val="%7."/>
+      <w:lvlJc w:val="start"/>
+      <w:pPr>
+        <w:tabs>
+          <w:tab w:val="num" w:pos="2880"/>
+        </w:tabs>
+        <w:ind w:start="2880" w:hanging="360"/>
+      </w:pPr>
+    </w:lvl>
+    <w:lvl w:ilvl="7">
+      <w:start w:val="1"/>
+      <w:numFmt w:val="decimal"/>
+      <w:lvlText w:val="%8."/>
+      <w:lvlJc w:val="start"/>
+      <w:pPr>
+        <w:tabs>
+          <w:tab w:val="num" w:pos="3240"/>
+        </w:tabs>
+        <w:ind w:start="3240" w:hanging="360"/>
+      </w:pPr>
+    </w:lvl>
+    <w:lvl w:ilvl="8">
+      <w:start w:val="1"/>
+      <w:numFmt w:val="decimal"/>
+      <w:lvlText w:val="%9."/>
+      <w:lvlJc w:val="start"/>
+      <w:pPr>
+        <w:tabs>
+          <w:tab w:val="num" w:pos="3600"/>
+        </w:tabs>
+        <w:ind w:start="3600" w:hanging="360"/>
+      </w:pPr>
+    </w:lvl>
+  </w:abstractNum>
+  <w:abstractNum w:abstractNumId="12">
+    <w:lvl w:ilvl="0">
+      <w:start w:val="1"/>
+      <w:numFmt w:val="bullet"/>
+      <w:lvlText w:val=""/>
+      <w:lvlJc w:val="start"/>
+      <w:pPr>
+        <w:tabs>
+          <w:tab w:val="num" w:pos="720"/>
+        </w:tabs>
+        <w:ind w:start="720" w:hanging="283"/>
+      </w:pPr>
+      <w:rPr>
+        <w:rFonts w:ascii="Symbol" w:hAnsi="Symbol" w:cs="Symbol" w:hint="default"/>
+      </w:rPr>
+    </w:lvl>
+    <w:lvl w:ilvl="1">
+      <w:start w:val="1"/>
+      <w:numFmt w:val="decimal"/>
+      <w:lvlText w:val="%2."/>
+      <w:lvlJc w:val="start"/>
+      <w:pPr>
+        <w:tabs>
+          <w:tab w:val="num" w:pos="1080"/>
+        </w:tabs>
+        <w:ind w:start="1080" w:hanging="360"/>
+      </w:pPr>
+    </w:lvl>
+    <w:lvl w:ilvl="2">
+      <w:start w:val="1"/>
+      <w:numFmt w:val="decimal"/>
+      <w:lvlText w:val="%3."/>
+      <w:lvlJc w:val="start"/>
+      <w:pPr>
+        <w:tabs>
+          <w:tab w:val="num" w:pos="1440"/>
+        </w:tabs>
+        <w:ind w:start="1440" w:hanging="360"/>
+      </w:pPr>
+    </w:lvl>
+    <w:lvl w:ilvl="3">
+      <w:start w:val="1"/>
+      <w:numFmt w:val="decimal"/>
+      <w:lvlText w:val="%4."/>
+      <w:lvlJc w:val="start"/>
+      <w:pPr>
+        <w:tabs>
+          <w:tab w:val="num" w:pos="1800"/>
+        </w:tabs>
+        <w:ind w:start="1800" w:hanging="360"/>
+      </w:pPr>
+    </w:lvl>
+    <w:lvl w:ilvl="4">
+      <w:start w:val="1"/>
+      <w:numFmt w:val="decimal"/>
+      <w:lvlText w:val="%5."/>
+      <w:lvlJc w:val="start"/>
+      <w:pPr>
+        <w:tabs>
+          <w:tab w:val="num" w:pos="2160"/>
+        </w:tabs>
+        <w:ind w:start="2160" w:hanging="360"/>
+      </w:pPr>
+    </w:lvl>
+    <w:lvl w:ilvl="5">
+      <w:start w:val="1"/>
+      <w:numFmt w:val="decimal"/>
+      <w:lvlText w:val="%6."/>
+      <w:lvlJc w:val="start"/>
+      <w:pPr>
+        <w:tabs>
+          <w:tab w:val="num" w:pos="2520"/>
+        </w:tabs>
+        <w:ind w:start="2520" w:hanging="360"/>
+      </w:pPr>
+    </w:lvl>
+    <w:lvl w:ilvl="6">
+      <w:start w:val="1"/>
+      <w:numFmt w:val="decimal"/>
+      <w:lvlText w:val="%7."/>
+      <w:lvlJc w:val="start"/>
+      <w:pPr>
+        <w:tabs>
+          <w:tab w:val="num" w:pos="2880"/>
+        </w:tabs>
+        <w:ind w:start="2880" w:hanging="360"/>
+      </w:pPr>
+    </w:lvl>
+    <w:lvl w:ilvl="7">
+      <w:start w:val="1"/>
+      <w:numFmt w:val="decimal"/>
+      <w:lvlText w:val="%8."/>
+      <w:lvlJc w:val="start"/>
+      <w:pPr>
+        <w:tabs>
+          <w:tab w:val="num" w:pos="3240"/>
+        </w:tabs>
+        <w:ind w:start="3240" w:hanging="360"/>
+      </w:pPr>
+    </w:lvl>
+    <w:lvl w:ilvl="8">
+      <w:start w:val="1"/>
+      <w:numFmt w:val="decimal"/>
+      <w:lvlText w:val="%9."/>
+      <w:lvlJc w:val="start"/>
+      <w:pPr>
+        <w:tabs>
+          <w:tab w:val="num" w:pos="3600"/>
+        </w:tabs>
+        <w:ind w:start="3600" w:hanging="360"/>
+      </w:pPr>
+    </w:lvl>
+  </w:abstractNum>
+  <w:abstractNum w:abstractNumId="13">
+    <w:lvl w:ilvl="0">
+      <w:start w:val="1"/>
+      <w:numFmt w:val="bullet"/>
+      <w:lvlText w:val=""/>
+      <w:lvlJc w:val="start"/>
+      <w:pPr>
+        <w:tabs>
+          <w:tab w:val="num" w:pos="709"/>
+        </w:tabs>
+        <w:ind w:start="709" w:hanging="283"/>
+      </w:pPr>
+      <w:rPr>
+        <w:rFonts w:ascii="Symbol" w:hAnsi="Symbol" w:cs="Symbol" w:hint="default"/>
+      </w:rPr>
+    </w:lvl>
+    <w:lvl w:ilvl="1">
+      <w:start w:val="1"/>
+      <w:numFmt w:val="bullet"/>
+      <w:lvlText w:val=""/>
+      <w:lvlJc w:val="start"/>
+      <w:pPr>
+        <w:tabs>
+          <w:tab w:val="num" w:pos="1418"/>
+        </w:tabs>
+        <w:ind w:start="1418" w:hanging="283"/>
+      </w:pPr>
+      <w:rPr>
+        <w:rFonts w:ascii="Symbol" w:hAnsi="Symbol" w:cs="Symbol" w:hint="default"/>
+      </w:rPr>
+    </w:lvl>
+    <w:lvl w:ilvl="2">
+      <w:start w:val="1"/>
+      <w:numFmt w:val="bullet"/>
+      <w:lvlText w:val=""/>
+      <w:lvlJc w:val="start"/>
+      <w:pPr>
+        <w:tabs>
+          <w:tab w:val="num" w:pos="2127"/>
+        </w:tabs>
+        <w:ind w:start="2127" w:hanging="283"/>
+      </w:pPr>
+      <w:rPr>
+        <w:rFonts w:ascii="Symbol" w:hAnsi="Symbol" w:cs="Symbol" w:hint="default"/>
+      </w:rPr>
+    </w:lvl>
+    <w:lvl w:ilvl="3">
+      <w:start w:val="1"/>
+      <w:numFmt w:val="bullet"/>
+      <w:lvlText w:val=""/>
+      <w:lvlJc w:val="start"/>
+      <w:pPr>
+        <w:tabs>
+          <w:tab w:val="num" w:pos="2836"/>
+        </w:tabs>
+        <w:ind w:start="2836" w:hanging="283"/>
+      </w:pPr>
+      <w:rPr>
+        <w:rFonts w:ascii="Symbol" w:hAnsi="Symbol" w:cs="Symbol" w:hint="default"/>
+      </w:rPr>
+    </w:lvl>
+    <w:lvl w:ilvl="4">
+      <w:start w:val="1"/>
+      <w:numFmt w:val="bullet"/>
+      <w:lvlText w:val=""/>
+      <w:lvlJc w:val="start"/>
+      <w:pPr>
+        <w:tabs>
+          <w:tab w:val="num" w:pos="3545"/>
+        </w:tabs>
+        <w:ind w:start="3545" w:hanging="283"/>
+      </w:pPr>
+      <w:rPr>
+        <w:rFonts w:ascii="Symbol" w:hAnsi="Symbol" w:cs="Symbol" w:hint="default"/>
+      </w:rPr>
+    </w:lvl>
+    <w:lvl w:ilvl="5">
+      <w:start w:val="1"/>
+      <w:numFmt w:val="bullet"/>
+      <w:lvlText w:val=""/>
+      <w:lvlJc w:val="start"/>
+      <w:pPr>
+        <w:tabs>
+          <w:tab w:val="num" w:pos="4254"/>
+        </w:tabs>
+        <w:ind w:start="4254" w:hanging="283"/>
+      </w:pPr>
+      <w:rPr>
+        <w:rFonts w:ascii="Symbol" w:hAnsi="Symbol" w:cs="Symbol" w:hint="default"/>
+      </w:rPr>
+    </w:lvl>
+    <w:lvl w:ilvl="6">
+      <w:start w:val="1"/>
+      <w:numFmt w:val="bullet"/>
+      <w:lvlText w:val=""/>
+      <w:lvlJc w:val="start"/>
+      <w:pPr>
+        <w:tabs>
+          <w:tab w:val="num" w:pos="4963"/>
+        </w:tabs>
+        <w:ind w:start="4963" w:hanging="283"/>
+      </w:pPr>
+      <w:rPr>
+        <w:rFonts w:ascii="Symbol" w:hAnsi="Symbol" w:cs="Symbol" w:hint="default"/>
+      </w:rPr>
+    </w:lvl>
+    <w:lvl w:ilvl="7">
+      <w:start w:val="1"/>
+      <w:numFmt w:val="bullet"/>
+      <w:lvlText w:val=""/>
+      <w:lvlJc w:val="start"/>
+      <w:pPr>
+        <w:tabs>
+          <w:tab w:val="num" w:pos="5672"/>
+        </w:tabs>
+        <w:ind w:start="5672" w:hanging="283"/>
+      </w:pPr>
+      <w:rPr>
+        <w:rFonts w:ascii="Symbol" w:hAnsi="Symbol" w:cs="Symbol" w:hint="default"/>
+      </w:rPr>
+    </w:lvl>
+    <w:lvl w:ilvl="8">
+      <w:start w:val="1"/>
+      <w:numFmt w:val="bullet"/>
+      <w:lvlText w:val=""/>
+      <w:lvlJc w:val="start"/>
+      <w:pPr>
+        <w:tabs>
+          <w:tab w:val="num" w:pos="6381"/>
+        </w:tabs>
+        <w:ind w:start="6381" w:hanging="283"/>
+      </w:pPr>
+      <w:rPr>
+        <w:rFonts w:ascii="Symbol" w:hAnsi="Symbol" w:cs="Symbol" w:hint="default"/>
+      </w:rPr>
+    </w:lvl>
+  </w:abstractNum>
+  <w:abstractNum w:abstractNumId="14">
+    <w:lvl w:ilvl="0">
+      <w:start w:val="1"/>
+      <w:numFmt w:val="bullet"/>
+      <w:lvlText w:val=""/>
+      <w:lvlJc w:val="start"/>
+      <w:pPr>
+        <w:tabs>
+          <w:tab w:val="num" w:pos="720"/>
+        </w:tabs>
+        <w:ind w:start="720" w:hanging="283"/>
+      </w:pPr>
+      <w:rPr>
+        <w:rFonts w:ascii="Symbol" w:hAnsi="Symbol" w:cs="Symbol" w:hint="default"/>
+      </w:rPr>
+    </w:lvl>
+    <w:lvl w:ilvl="1">
+      <w:start w:val="1"/>
+      <w:numFmt w:val="decimal"/>
+      <w:lvlText w:val="%2."/>
+      <w:lvlJc w:val="start"/>
+      <w:pPr>
+        <w:tabs>
+          <w:tab w:val="num" w:pos="1080"/>
+        </w:tabs>
+        <w:ind w:start="1080" w:hanging="360"/>
+      </w:pPr>
+    </w:lvl>
+    <w:lvl w:ilvl="2">
+      <w:start w:val="1"/>
+      <w:numFmt w:val="decimal"/>
+      <w:lvlText w:val="%3."/>
+      <w:lvlJc w:val="start"/>
+      <w:pPr>
+        <w:tabs>
+          <w:tab w:val="num" w:pos="1440"/>
+        </w:tabs>
+        <w:ind w:start="1440" w:hanging="360"/>
+      </w:pPr>
+    </w:lvl>
+    <w:lvl w:ilvl="3">
+      <w:start w:val="1"/>
+      <w:numFmt w:val="decimal"/>
+      <w:lvlText w:val="%4."/>
+      <w:lvlJc w:val="start"/>
+      <w:pPr>
+        <w:tabs>
+          <w:tab w:val="num" w:pos="1800"/>
+        </w:tabs>
+        <w:ind w:start="1800" w:hanging="360"/>
+      </w:pPr>
+    </w:lvl>
+    <w:lvl w:ilvl="4">
+      <w:start w:val="1"/>
+      <w:numFmt w:val="decimal"/>
+      <w:lvlText w:val="%5."/>
+      <w:lvlJc w:val="start"/>
+      <w:pPr>
+        <w:tabs>
+          <w:tab w:val="num" w:pos="2160"/>
+        </w:tabs>
+        <w:ind w:start="2160" w:hanging="360"/>
+      </w:pPr>
+    </w:lvl>
+    <w:lvl w:ilvl="5">
+      <w:start w:val="1"/>
+      <w:numFmt w:val="decimal"/>
+      <w:lvlText w:val="%6."/>
+      <w:lvlJc w:val="start"/>
+      <w:pPr>
+        <w:tabs>
+          <w:tab w:val="num" w:pos="2520"/>
+        </w:tabs>
+        <w:ind w:start="2520" w:hanging="360"/>
+      </w:pPr>
+    </w:lvl>
+    <w:lvl w:ilvl="6">
+      <w:start w:val="1"/>
+      <w:numFmt w:val="decimal"/>
+      <w:lvlText w:val="%7."/>
+      <w:lvlJc w:val="start"/>
+      <w:pPr>
+        <w:tabs>
+          <w:tab w:val="num" w:pos="2880"/>
+        </w:tabs>
+        <w:ind w:start="2880" w:hanging="360"/>
+      </w:pPr>
+    </w:lvl>
+    <w:lvl w:ilvl="7">
+      <w:start w:val="1"/>
+      <w:numFmt w:val="decimal"/>
+      <w:lvlText w:val="%8."/>
+      <w:lvlJc w:val="start"/>
+      <w:pPr>
+        <w:tabs>
+          <w:tab w:val="num" w:pos="3240"/>
+        </w:tabs>
+        <w:ind w:start="3240" w:hanging="360"/>
+      </w:pPr>
+    </w:lvl>
+    <w:lvl w:ilvl="8">
+      <w:start w:val="1"/>
+      <w:numFmt w:val="decimal"/>
+      <w:lvlText w:val="%9."/>
+      <w:lvlJc w:val="start"/>
+      <w:pPr>
+        <w:tabs>
+          <w:tab w:val="num" w:pos="3600"/>
+        </w:tabs>
+        <w:ind w:start="3600" w:hanging="360"/>
+      </w:pPr>
+    </w:lvl>
+  </w:abstractNum>
+  <w:abstractNum w:abstractNumId="15">
+    <w:lvl w:ilvl="0">
+      <w:start w:val="1"/>
+      <w:numFmt w:val="bullet"/>
+      <w:lvlText w:val=""/>
+      <w:lvlJc w:val="start"/>
+      <w:pPr>
+        <w:tabs>
+          <w:tab w:val="num" w:pos="720"/>
+        </w:tabs>
+        <w:ind w:start="720" w:hanging="283"/>
+      </w:pPr>
+      <w:rPr>
+        <w:rFonts w:ascii="Symbol" w:hAnsi="Symbol" w:cs="Symbol" w:hint="default"/>
+      </w:rPr>
+    </w:lvl>
+    <w:lvl w:ilvl="1">
+      <w:start w:val="1"/>
+      <w:numFmt w:val="decimal"/>
+      <w:lvlText w:val="%2."/>
+      <w:lvlJc w:val="start"/>
+      <w:pPr>
+        <w:tabs>
+          <w:tab w:val="num" w:pos="1080"/>
+        </w:tabs>
+        <w:ind w:start="1080" w:hanging="360"/>
+      </w:pPr>
+    </w:lvl>
+    <w:lvl w:ilvl="2">
+      <w:start w:val="1"/>
+      <w:numFmt w:val="decimal"/>
+      <w:lvlText w:val="%3."/>
+      <w:lvlJc w:val="start"/>
+      <w:pPr>
+        <w:tabs>
+          <w:tab w:val="num" w:pos="1440"/>
+        </w:tabs>
+        <w:ind w:start="1440" w:hanging="360"/>
+      </w:pPr>
+    </w:lvl>
+    <w:lvl w:ilvl="3">
+      <w:start w:val="1"/>
+      <w:numFmt w:val="decimal"/>
+      <w:lvlText w:val="%4."/>
+      <w:lvlJc w:val="start"/>
+      <w:pPr>
+        <w:tabs>
+          <w:tab w:val="num" w:pos="1800"/>
+        </w:tabs>
+        <w:ind w:start="1800" w:hanging="360"/>
+      </w:pPr>
+    </w:lvl>
+    <w:lvl w:ilvl="4">
+      <w:start w:val="1"/>
+      <w:numFmt w:val="decimal"/>
+      <w:lvlText w:val="%5."/>
+      <w:lvlJc w:val="start"/>
+      <w:pPr>
+        <w:tabs>
+          <w:tab w:val="num" w:pos="2160"/>
+        </w:tabs>
+        <w:ind w:start="2160" w:hanging="360"/>
+      </w:pPr>
+    </w:lvl>
+    <w:lvl w:ilvl="5">
+      <w:start w:val="1"/>
+      <w:numFmt w:val="decimal"/>
+      <w:lvlText w:val="%6."/>
+      <w:lvlJc w:val="start"/>
+      <w:pPr>
+        <w:tabs>
+          <w:tab w:val="num" w:pos="2520"/>
+        </w:tabs>
+        <w:ind w:start="2520" w:hanging="360"/>
+      </w:pPr>
+    </w:lvl>
+    <w:lvl w:ilvl="6">
+      <w:start w:val="1"/>
+      <w:numFmt w:val="decimal"/>
+      <w:lvlText w:val="%7."/>
+      <w:lvlJc w:val="start"/>
+      <w:pPr>
+        <w:tabs>
+          <w:tab w:val="num" w:pos="2880"/>
+        </w:tabs>
+        <w:ind w:start="2880" w:hanging="360"/>
+      </w:pPr>
+    </w:lvl>
+    <w:lvl w:ilvl="7">
+      <w:start w:val="1"/>
+      <w:numFmt w:val="decimal"/>
+      <w:lvlText w:val="%8."/>
+      <w:lvlJc w:val="start"/>
+      <w:pPr>
+        <w:tabs>
+          <w:tab w:val="num" w:pos="3240"/>
+        </w:tabs>
+        <w:ind w:start="3240" w:hanging="360"/>
+      </w:pPr>
+    </w:lvl>
+    <w:lvl w:ilvl="8">
+      <w:start w:val="1"/>
+      <w:numFmt w:val="decimal"/>
+      <w:lvlText w:val="%9."/>
+      <w:lvlJc w:val="start"/>
+      <w:pPr>
+        <w:tabs>
+          <w:tab w:val="num" w:pos="3600"/>
+        </w:tabs>
+        <w:ind w:start="3600" w:hanging="360"/>
+      </w:pPr>
+    </w:lvl>
+  </w:abstractNum>
+  <w:abstractNum w:abstractNumId="16">
+    <w:lvl w:ilvl="0">
+      <w:start w:val="1"/>
+      <w:numFmt w:val="bullet"/>
+      <w:lvlText w:val=""/>
+      <w:lvlJc w:val="start"/>
+      <w:pPr>
+        <w:tabs>
+          <w:tab w:val="num" w:pos="720"/>
+        </w:tabs>
+        <w:ind w:start="720" w:hanging="283"/>
+      </w:pPr>
+      <w:rPr>
+        <w:rFonts w:ascii="Symbol" w:hAnsi="Symbol" w:cs="Symbol" w:hint="default"/>
+      </w:rPr>
+    </w:lvl>
+    <w:lvl w:ilvl="1">
+      <w:start w:val="1"/>
+      <w:numFmt w:val="decimal"/>
+      <w:lvlText w:val="%2."/>
+      <w:lvlJc w:val="start"/>
+      <w:pPr>
+        <w:tabs>
+          <w:tab w:val="num" w:pos="1080"/>
+        </w:tabs>
+        <w:ind w:start="1080" w:hanging="360"/>
+      </w:pPr>
+    </w:lvl>
+    <w:lvl w:ilvl="2">
+      <w:start w:val="1"/>
+      <w:numFmt w:val="decimal"/>
+      <w:lvlText w:val="%3."/>
+      <w:lvlJc w:val="start"/>
+      <w:pPr>
+        <w:tabs>
+          <w:tab w:val="num" w:pos="1440"/>
+        </w:tabs>
+        <w:ind w:start="1440" w:hanging="360"/>
+      </w:pPr>
+    </w:lvl>
+    <w:lvl w:ilvl="3">
+      <w:start w:val="1"/>
+      <w:numFmt w:val="decimal"/>
+      <w:lvlText w:val="%4."/>
+      <w:lvlJc w:val="start"/>
+      <w:pPr>
+        <w:tabs>
+          <w:tab w:val="num" w:pos="1800"/>
+        </w:tabs>
+        <w:ind w:start="1800" w:hanging="360"/>
+      </w:pPr>
+    </w:lvl>
+    <w:lvl w:ilvl="4">
+      <w:start w:val="1"/>
+      <w:numFmt w:val="decimal"/>
+      <w:lvlText w:val="%5."/>
+      <w:lvlJc w:val="start"/>
+      <w:pPr>
+        <w:tabs>
+          <w:tab w:val="num" w:pos="2160"/>
+        </w:tabs>
+        <w:ind w:start="2160" w:hanging="360"/>
+      </w:pPr>
+    </w:lvl>
+    <w:lvl w:ilvl="5">
+      <w:start w:val="1"/>
+      <w:numFmt w:val="decimal"/>
+      <w:lvlText w:val="%6."/>
+      <w:lvlJc w:val="start"/>
+      <w:pPr>
+        <w:tabs>
+          <w:tab w:val="num" w:pos="2520"/>
+        </w:tabs>
+        <w:ind w:start="2520" w:hanging="360"/>
+      </w:pPr>
+    </w:lvl>
+    <w:lvl w:ilvl="6">
+      <w:start w:val="1"/>
+      <w:numFmt w:val="decimal"/>
+      <w:lvlText w:val="%7."/>
+      <w:lvlJc w:val="start"/>
+      <w:pPr>
+        <w:tabs>
+          <w:tab w:val="num" w:pos="2880"/>
+        </w:tabs>
+        <w:ind w:start="2880" w:hanging="360"/>
+      </w:pPr>
+    </w:lvl>
+    <w:lvl w:ilvl="7">
+      <w:start w:val="1"/>
+      <w:numFmt w:val="decimal"/>
+      <w:lvlText w:val="%8."/>
+      <w:lvlJc w:val="start"/>
+      <w:pPr>
+        <w:tabs>
+          <w:tab w:val="num" w:pos="3240"/>
+        </w:tabs>
+        <w:ind w:start="3240" w:hanging="360"/>
+      </w:pPr>
+    </w:lvl>
+    <w:lvl w:ilvl="8">
+      <w:start w:val="1"/>
+      <w:numFmt w:val="decimal"/>
+      <w:lvlText w:val="%9."/>
+      <w:lvlJc w:val="start"/>
+      <w:pPr>
+        <w:tabs>
+          <w:tab w:val="num" w:pos="3600"/>
+        </w:tabs>
+        <w:ind w:start="3600" w:hanging="360"/>
+      </w:pPr>
+    </w:lvl>
+  </w:abstractNum>
+  <w:abstractNum w:abstractNumId="17">
+    <w:lvl w:ilvl="0">
+      <w:start w:val="1"/>
+      <w:numFmt w:val="bullet"/>
+      <w:lvlText w:val=""/>
+      <w:lvlJc w:val="start"/>
+      <w:pPr>
+        <w:tabs>
+          <w:tab w:val="num" w:pos="720"/>
+        </w:tabs>
+        <w:ind w:start="720" w:hanging="283"/>
+      </w:pPr>
+      <w:rPr>
+        <w:rFonts w:ascii="Symbol" w:hAnsi="Symbol" w:cs="Symbol" w:hint="default"/>
+      </w:rPr>
+    </w:lvl>
+    <w:lvl w:ilvl="1">
+      <w:start w:val="1"/>
+      <w:numFmt w:val="decimal"/>
+      <w:lvlText w:val="%2."/>
+      <w:lvlJc w:val="start"/>
+      <w:pPr>
+        <w:tabs>
+          <w:tab w:val="num" w:pos="1080"/>
+        </w:tabs>
+        <w:ind w:start="1080" w:hanging="360"/>
+      </w:pPr>
+    </w:lvl>
+    <w:lvl w:ilvl="2">
+      <w:start w:val="1"/>
+      <w:numFmt w:val="decimal"/>
+      <w:lvlText w:val="%3."/>
+      <w:lvlJc w:val="start"/>
+      <w:pPr>
+        <w:tabs>
+          <w:tab w:val="num" w:pos="1440"/>
+        </w:tabs>
+        <w:ind w:start="1440" w:hanging="360"/>
+      </w:pPr>
+    </w:lvl>
+    <w:lvl w:ilvl="3">
+      <w:start w:val="1"/>
+      <w:numFmt w:val="decimal"/>
+      <w:lvlText w:val="%4."/>
+      <w:lvlJc w:val="start"/>
+      <w:pPr>
+        <w:tabs>
+          <w:tab w:val="num" w:pos="1800"/>
+        </w:tabs>
+        <w:ind w:start="1800" w:hanging="360"/>
+      </w:pPr>
+    </w:lvl>
+    <w:lvl w:ilvl="4">
+      <w:start w:val="1"/>
+      <w:numFmt w:val="decimal"/>
+      <w:lvlText w:val="%5."/>
+      <w:lvlJc w:val="start"/>
+      <w:pPr>
+        <w:tabs>
+          <w:tab w:val="num" w:pos="2160"/>
+        </w:tabs>
+        <w:ind w:start="2160" w:hanging="360"/>
+      </w:pPr>
+    </w:lvl>
+    <w:lvl w:ilvl="5">
+      <w:start w:val="1"/>
+      <w:numFmt w:val="decimal"/>
+      <w:lvlText w:val="%6."/>
+      <w:lvlJc w:val="start"/>
+      <w:pPr>
+        <w:tabs>
+          <w:tab w:val="num" w:pos="2520"/>
+        </w:tabs>
+        <w:ind w:start="2520" w:hanging="360"/>
+      </w:pPr>
+    </w:lvl>
+    <w:lvl w:ilvl="6">
+      <w:start w:val="1"/>
+      <w:numFmt w:val="decimal"/>
+      <w:lvlText w:val="%7."/>
+      <w:lvlJc w:val="start"/>
+      <w:pPr>
+        <w:tabs>
+          <w:tab w:val="num" w:pos="2880"/>
+        </w:tabs>
+        <w:ind w:start="2880" w:hanging="360"/>
+      </w:pPr>
+    </w:lvl>
+    <w:lvl w:ilvl="7">
+      <w:start w:val="1"/>
+      <w:numFmt w:val="decimal"/>
+      <w:lvlText w:val="%8."/>
+      <w:lvlJc w:val="start"/>
+      <w:pPr>
+        <w:tabs>
+          <w:tab w:val="num" w:pos="3240"/>
+        </w:tabs>
+        <w:ind w:start="3240" w:hanging="360"/>
+      </w:pPr>
+    </w:lvl>
+    <w:lvl w:ilvl="8">
+      <w:start w:val="1"/>
+      <w:numFmt w:val="decimal"/>
+      <w:lvlText w:val="%9."/>
+      <w:lvlJc w:val="start"/>
+      <w:pPr>
+        <w:tabs>
+          <w:tab w:val="num" w:pos="3600"/>
+        </w:tabs>
+        <w:ind w:start="3600" w:hanging="360"/>
+      </w:pPr>
+    </w:lvl>
+  </w:abstractNum>
+  <w:abstractNum w:abstractNumId="18">
+    <w:lvl w:ilvl="0">
+      <w:start w:val="1"/>
+      <w:numFmt w:val="bullet"/>
+      <w:lvlText w:val=""/>
+      <w:lvlJc w:val="start"/>
+      <w:pPr>
+        <w:tabs>
+          <w:tab w:val="num" w:pos="720"/>
+        </w:tabs>
+        <w:ind w:start="720" w:hanging="283"/>
+      </w:pPr>
+      <w:rPr>
+        <w:rFonts w:ascii="Symbol" w:hAnsi="Symbol" w:cs="Symbol" w:hint="default"/>
+      </w:rPr>
+    </w:lvl>
+    <w:lvl w:ilvl="1">
+      <w:start w:val="1"/>
+      <w:numFmt w:val="decimal"/>
+      <w:lvlText w:val="%2."/>
+      <w:lvlJc w:val="start"/>
+      <w:pPr>
+        <w:tabs>
+          <w:tab w:val="num" w:pos="1080"/>
+        </w:tabs>
+        <w:ind w:start="1080" w:hanging="360"/>
+      </w:pPr>
+    </w:lvl>
+    <w:lvl w:ilvl="2">
+      <w:start w:val="1"/>
+      <w:numFmt w:val="decimal"/>
+      <w:lvlText w:val="%3."/>
+      <w:lvlJc w:val="start"/>
+      <w:pPr>
+        <w:tabs>
+          <w:tab w:val="num" w:pos="1440"/>
+        </w:tabs>
+        <w:ind w:start="1440" w:hanging="360"/>
+      </w:pPr>
+    </w:lvl>
+    <w:lvl w:ilvl="3">
+      <w:start w:val="1"/>
+      <w:numFmt w:val="decimal"/>
+      <w:lvlText w:val="%4."/>
+      <w:lvlJc w:val="start"/>
+      <w:pPr>
+        <w:tabs>
+          <w:tab w:val="num" w:pos="1800"/>
+        </w:tabs>
+        <w:ind w:start="1800" w:hanging="360"/>
+      </w:pPr>
+    </w:lvl>
+    <w:lvl w:ilvl="4">
+      <w:start w:val="1"/>
+      <w:numFmt w:val="decimal"/>
+      <w:lvlText w:val="%5."/>
+      <w:lvlJc w:val="start"/>
+      <w:pPr>
+        <w:tabs>
+          <w:tab w:val="num" w:pos="2160"/>
+        </w:tabs>
+        <w:ind w:start="2160" w:hanging="360"/>
+      </w:pPr>
+    </w:lvl>
+    <w:lvl w:ilvl="5">
+      <w:start w:val="1"/>
+      <w:numFmt w:val="decimal"/>
+      <w:lvlText w:val="%6."/>
+      <w:lvlJc w:val="start"/>
+      <w:pPr>
+        <w:tabs>
+          <w:tab w:val="num" w:pos="2520"/>
+        </w:tabs>
+        <w:ind w:start="2520" w:hanging="360"/>
+      </w:pPr>
+    </w:lvl>
+    <w:lvl w:ilvl="6">
+      <w:start w:val="1"/>
+      <w:numFmt w:val="decimal"/>
+      <w:lvlText w:val="%7."/>
+      <w:lvlJc w:val="start"/>
+      <w:pPr>
+        <w:tabs>
+          <w:tab w:val="num" w:pos="2880"/>
+        </w:tabs>
+        <w:ind w:start="2880" w:hanging="360"/>
+      </w:pPr>
+    </w:lvl>
+    <w:lvl w:ilvl="7">
+      <w:start w:val="1"/>
+      <w:numFmt w:val="decimal"/>
+      <w:lvlText w:val="%8."/>
+      <w:lvlJc w:val="start"/>
+      <w:pPr>
+        <w:tabs>
+          <w:tab w:val="num" w:pos="3240"/>
+        </w:tabs>
+        <w:ind w:start="3240" w:hanging="360"/>
+      </w:pPr>
+    </w:lvl>
+    <w:lvl w:ilvl="8">
+      <w:start w:val="1"/>
+      <w:numFmt w:val="decimal"/>
+      <w:lvlText w:val="%9."/>
+      <w:lvlJc w:val="start"/>
+      <w:pPr>
+        <w:tabs>
+          <w:tab w:val="num" w:pos="3600"/>
+        </w:tabs>
+        <w:ind w:start="3600" w:hanging="360"/>
+      </w:pPr>
+    </w:lvl>
+  </w:abstractNum>
+  <w:abstractNum w:abstractNumId="19">
+    <w:lvl w:ilvl="0">
+      <w:start w:val="1"/>
+      <w:numFmt w:val="bullet"/>
+      <w:lvlText w:val=""/>
+      <w:lvlJc w:val="start"/>
+      <w:pPr>
+        <w:tabs>
+          <w:tab w:val="num" w:pos="709"/>
+        </w:tabs>
+        <w:ind w:start="709" w:hanging="283"/>
+      </w:pPr>
+      <w:rPr>
+        <w:rFonts w:ascii="Symbol" w:hAnsi="Symbol" w:cs="Symbol" w:hint="default"/>
+      </w:rPr>
+    </w:lvl>
+    <w:lvl w:ilvl="1">
+      <w:start w:val="1"/>
+      <w:numFmt w:val="bullet"/>
+      <w:lvlText w:val=""/>
+      <w:lvlJc w:val="start"/>
+      <w:pPr>
+        <w:tabs>
+          <w:tab w:val="num" w:pos="1418"/>
+        </w:tabs>
+        <w:ind w:start="1418" w:hanging="283"/>
+      </w:pPr>
+      <w:rPr>
+        <w:rFonts w:ascii="Symbol" w:hAnsi="Symbol" w:cs="Symbol" w:hint="default"/>
+      </w:rPr>
+    </w:lvl>
+    <w:lvl w:ilvl="2">
+      <w:start w:val="1"/>
+      <w:numFmt w:val="bullet"/>
+      <w:lvlText w:val=""/>
+      <w:lvlJc w:val="start"/>
+      <w:pPr>
+        <w:tabs>
+          <w:tab w:val="num" w:pos="2127"/>
+        </w:tabs>
+        <w:ind w:start="2127" w:hanging="283"/>
+      </w:pPr>
+      <w:rPr>
+        <w:rFonts w:ascii="Symbol" w:hAnsi="Symbol" w:cs="Symbol" w:hint="default"/>
+      </w:rPr>
+    </w:lvl>
+    <w:lvl w:ilvl="3">
+      <w:start w:val="1"/>
+      <w:numFmt w:val="bullet"/>
+      <w:lvlText w:val=""/>
+      <w:lvlJc w:val="start"/>
+      <w:pPr>
+        <w:tabs>
+          <w:tab w:val="num" w:pos="2836"/>
+        </w:tabs>
+        <w:ind w:start="2836" w:hanging="283"/>
+      </w:pPr>
+      <w:rPr>
+        <w:rFonts w:ascii="Symbol" w:hAnsi="Symbol" w:cs="Symbol" w:hint="default"/>
+      </w:rPr>
+    </w:lvl>
+    <w:lvl w:ilvl="4">
+      <w:start w:val="1"/>
+      <w:numFmt w:val="bullet"/>
+      <w:lvlText w:val=""/>
+      <w:lvlJc w:val="start"/>
+      <w:pPr>
+        <w:tabs>
+          <w:tab w:val="num" w:pos="3545"/>
+        </w:tabs>
+        <w:ind w:start="3545" w:hanging="283"/>
+      </w:pPr>
+      <w:rPr>
+        <w:rFonts w:ascii="Symbol" w:hAnsi="Symbol" w:cs="Symbol" w:hint="default"/>
+      </w:rPr>
+    </w:lvl>
+    <w:lvl w:ilvl="5">
+      <w:start w:val="1"/>
+      <w:numFmt w:val="bullet"/>
+      <w:lvlText w:val=""/>
+      <w:lvlJc w:val="start"/>
+      <w:pPr>
+        <w:tabs>
+          <w:tab w:val="num" w:pos="4254"/>
+        </w:tabs>
+        <w:ind w:start="4254" w:hanging="283"/>
+      </w:pPr>
+      <w:rPr>
+        <w:rFonts w:ascii="Symbol" w:hAnsi="Symbol" w:cs="Symbol" w:hint="default"/>
+      </w:rPr>
+    </w:lvl>
+    <w:lvl w:ilvl="6">
+      <w:start w:val="1"/>
+      <w:numFmt w:val="bullet"/>
+      <w:lvlText w:val=""/>
+      <w:lvlJc w:val="start"/>
+      <w:pPr>
+        <w:tabs>
+          <w:tab w:val="num" w:pos="4963"/>
+        </w:tabs>
+        <w:ind w:start="4963" w:hanging="283"/>
+      </w:pPr>
+      <w:rPr>
+        <w:rFonts w:ascii="Symbol" w:hAnsi="Symbol" w:cs="Symbol" w:hint="default"/>
+      </w:rPr>
+    </w:lvl>
+    <w:lvl w:ilvl="7">
+      <w:start w:val="1"/>
+      <w:numFmt w:val="bullet"/>
+      <w:lvlText w:val=""/>
+      <w:lvlJc w:val="start"/>
+      <w:pPr>
+        <w:tabs>
+          <w:tab w:val="num" w:pos="5672"/>
+        </w:tabs>
+        <w:ind w:start="5672" w:hanging="283"/>
+      </w:pPr>
+      <w:rPr>
+        <w:rFonts w:ascii="Symbol" w:hAnsi="Symbol" w:cs="Symbol" w:hint="default"/>
+      </w:rPr>
+    </w:lvl>
+    <w:lvl w:ilvl="8">
+      <w:start w:val="1"/>
+      <w:numFmt w:val="bullet"/>
+      <w:lvlText w:val=""/>
+      <w:lvlJc w:val="start"/>
+      <w:pPr>
+        <w:tabs>
+          <w:tab w:val="num" w:pos="6381"/>
+        </w:tabs>
+        <w:ind w:start="6381" w:hanging="283"/>
+      </w:pPr>
+      <w:rPr>
+        <w:rFonts w:ascii="Symbol" w:hAnsi="Symbol" w:cs="Symbol" w:hint="default"/>
+      </w:rPr>
+    </w:lvl>
+  </w:abstractNum>
+  <w:abstractNum w:abstractNumId="20">
+    <w:lvl w:ilvl="0">
+      <w:start w:val="1"/>
       <w:numFmt w:val="none"/>
       <w:suff w:val="nothing"/>
       <w:lvlText w:val=""/>
@@ -24792,6 +27456,54 @@
     <w:abstractNumId w:val="4"/>
   </w:num>
   <w:num w:numId="5">
+    <w:abstractNumId w:val="5"/>
+  </w:num>
+  <w:num w:numId="6">
+    <w:abstractNumId w:val="6"/>
+  </w:num>
+  <w:num w:numId="7">
+    <w:abstractNumId w:val="7"/>
+  </w:num>
+  <w:num w:numId="8">
+    <w:abstractNumId w:val="8"/>
+  </w:num>
+  <w:num w:numId="9">
+    <w:abstractNumId w:val="9"/>
+  </w:num>
+  <w:num w:numId="10">
+    <w:abstractNumId w:val="10"/>
+  </w:num>
+  <w:num w:numId="11">
+    <w:abstractNumId w:val="11"/>
+  </w:num>
+  <w:num w:numId="12">
+    <w:abstractNumId w:val="12"/>
+  </w:num>
+  <w:num w:numId="13">
+    <w:abstractNumId w:val="13"/>
+  </w:num>
+  <w:num w:numId="14">
+    <w:abstractNumId w:val="14"/>
+  </w:num>
+  <w:num w:numId="15">
+    <w:abstractNumId w:val="15"/>
+  </w:num>
+  <w:num w:numId="16">
+    <w:abstractNumId w:val="16"/>
+  </w:num>
+  <w:num w:numId="17">
+    <w:abstractNumId w:val="17"/>
+  </w:num>
+  <w:num w:numId="18">
+    <w:abstractNumId w:val="18"/>
+  </w:num>
+  <w:num w:numId="19">
+    <w:abstractNumId w:val="19"/>
+  </w:num>
+  <w:num w:numId="20">
+    <w:abstractNumId w:val="20"/>
+  </w:num>
+  <w:num w:numId="21">
     <w:abstractNumId w:val="1"/>
     <w:lvlOverride w:ilvl="0">
       <w:startOverride w:val="1"/>
@@ -24974,6 +27686,20 @@
     <w:rPr>
       <w:sz w:val="20"/>
       <w:szCs w:val="20"/>
+    </w:rPr>
+  </w:style>
+  <w:style w:type="character" w:styleId="Bullets">
+    <w:name w:val="Bullets"/>
+    <w:qFormat/>
+    <w:rPr>
+      <w:rFonts w:ascii="OpenSymbol" w:hAnsi="OpenSymbol" w:eastAsia="OpenSymbol" w:cs="OpenSymbol"/>
+    </w:rPr>
+  </w:style>
+  <w:style w:type="character" w:styleId="SourceText">
+    <w:name w:val="Source Text"/>
+    <w:qFormat/>
+    <w:rPr>
+      <w:rFonts w:ascii="Liberation Mono" w:hAnsi="Liberation Mono" w:eastAsia="Noto Sans Mono CJK SC" w:cs="Liberation Mono"/>
     </w:rPr>
   </w:style>
   <w:style w:type="paragraph" w:styleId="Heading">

</xml_diff>

<commit_message>
Phase 7 complete: Routing Intelligence — signal scoring, Reflection baseline, model override commands
</commit_message>
<xml_diff>
--- a/Referentia/Build-Journal.lumin.docx
+++ b/Referentia/Build-Journal.lumin.docx
@@ -212,15 +212,7 @@
           <w:sz w:val="20"/>
           <w:szCs w:val="20"/>
         </w:rPr>
-        <w:t>03 March</w:t>
-      </w:r>
-      <w:r>
-        <w:rPr>
-          <w:rFonts w:eastAsia="Latin Modern Roman" w:cs="Latin Modern Roman"/>
-          <w:sz w:val="20"/>
-          <w:szCs w:val="20"/>
-        </w:rPr>
-        <w:t xml:space="preserve">                                 </w:t>
+        <w:t xml:space="preserve">03 March                                 </w:t>
       </w:r>
     </w:p>
     <w:p>
@@ -333,7 +325,7 @@
         <w:pStyle w:val="ListParagraph"/>
         <w:numPr>
           <w:ilvl w:val="0"/>
-          <w:numId w:val="1"/>
+          <w:numId w:val="2"/>
         </w:numPr>
         <w:spacing w:before="50" w:after="50"/>
         <w:rPr/>
@@ -357,7 +349,7 @@
         <w:pStyle w:val="ListParagraph"/>
         <w:numPr>
           <w:ilvl w:val="0"/>
-          <w:numId w:val="1"/>
+          <w:numId w:val="2"/>
         </w:numPr>
         <w:spacing w:before="50" w:after="50"/>
         <w:rPr/>
@@ -4395,8 +4387,8 @@
         </w:tblCellMar>
       </w:tblPr>
       <w:tblGrid>
-        <w:gridCol w:w="60"/>
-        <w:gridCol w:w="9299"/>
+        <w:gridCol w:w="59"/>
+        <w:gridCol w:w="9300"/>
       </w:tblGrid>
       <w:tr>
         <w:trPr>
@@ -4404,7 +4396,7 @@
         </w:trPr>
         <w:tc>
           <w:tcPr>
-            <w:tcW w:w="60" w:type="dxa"/>
+            <w:tcW w:w="59" w:type="dxa"/>
             <w:tcBorders>
               <w:bottom w:val="single" w:sz="2" w:space="0" w:color="AAAAAA"/>
             </w:tcBorders>
@@ -4435,7 +4427,7 @@
         </w:tc>
         <w:tc>
           <w:tcPr>
-            <w:tcW w:w="9299" w:type="dxa"/>
+            <w:tcW w:w="9300" w:type="dxa"/>
             <w:tcBorders>
               <w:bottom w:val="single" w:sz="2" w:space="0" w:color="AAAAAA"/>
             </w:tcBorders>
@@ -4465,29 +4457,7 @@
                 <w:sz w:val="19"/>
                 <w:szCs w:val="19"/>
               </w:rPr>
-              <w:t xml:space="preserve">Git branch                          </w:t>
-            </w:r>
-            <w:r>
-              <w:rPr>
-                <w:rFonts w:eastAsia="Latin Modern Roman" w:cs="Latin Modern Roman"/>
-                <w:b/>
-                <w:bCs/>
-                <w:color w:val="BDAB5D"/>
-                <w:sz w:val="19"/>
-                <w:szCs w:val="19"/>
-              </w:rPr>
-              <w:t>phase-2-status-visibility</w:t>
-            </w:r>
-            <w:r>
-              <w:rPr>
-                <w:rFonts w:eastAsia="Latin Modern Roman" w:cs="Latin Modern Roman"/>
-                <w:b/>
-                <w:bCs/>
-                <w:color w:val="BDAB5D"/>
-                <w:sz w:val="19"/>
-                <w:szCs w:val="19"/>
-              </w:rPr>
-              <w:t xml:space="preserve"> </w:t>
+              <w:t>Git branch                          phase-2-status-visibility</w:t>
             </w:r>
           </w:p>
         </w:tc>
@@ -4878,7 +4848,7 @@
               <w:pStyle w:val="BodyText"/>
               <w:numPr>
                 <w:ilvl w:val="0"/>
-                <w:numId w:val="2"/>
+                <w:numId w:val="3"/>
               </w:numPr>
               <w:tabs>
                 <w:tab w:val="clear" w:pos="720"/>
@@ -9543,8 +9513,8 @@
         </w:tblCellMar>
       </w:tblPr>
       <w:tblGrid>
-        <w:gridCol w:w="60"/>
-        <w:gridCol w:w="9299"/>
+        <w:gridCol w:w="59"/>
+        <w:gridCol w:w="9300"/>
       </w:tblGrid>
       <w:tr>
         <w:trPr>
@@ -9552,7 +9522,7 @@
         </w:trPr>
         <w:tc>
           <w:tcPr>
-            <w:tcW w:w="60" w:type="dxa"/>
+            <w:tcW w:w="59" w:type="dxa"/>
             <w:tcBorders>
               <w:bottom w:val="single" w:sz="2" w:space="0" w:color="AAAAAA"/>
             </w:tcBorders>
@@ -9584,7 +9554,7 @@
         </w:tc>
         <w:tc>
           <w:tcPr>
-            <w:tcW w:w="9299" w:type="dxa"/>
+            <w:tcW w:w="9300" w:type="dxa"/>
             <w:tcBorders>
               <w:bottom w:val="single" w:sz="2" w:space="0" w:color="AAAAAA"/>
             </w:tcBorders>
@@ -9614,9 +9584,26 @@
                 <w:sz w:val="19"/>
                 <w:szCs w:val="19"/>
               </w:rPr>
-              <w:t xml:space="preserve">Git branch:                         </w:t>
-            </w:r>
-            <w:r>
+              <w:t>Git branch:                         phase-4-tome</w:t>
+            </w:r>
+          </w:p>
+        </w:tc>
+      </w:tr>
+      <w:tr>
+        <w:trPr>
+          <w:trHeight w:val="459" w:hRule="atLeast"/>
+          <w:cantSplit w:val="true"/>
+        </w:trPr>
+        <w:tc>
+          <w:tcPr>
+            <w:tcW w:w="59" w:type="dxa"/>
+            <w:tcBorders>
+              <w:bottom w:val="single" w:sz="2" w:space="0" w:color="AAAAAA"/>
+            </w:tcBorders>
+          </w:tcPr>
+          <w:p>
+            <w:pPr>
+              <w:pStyle w:val="Normal"/>
               <w:rPr>
                 <w:rFonts w:eastAsia="Latin Modern Roman" w:cs="Latin Modern Roman"/>
                 <w:b/>
@@ -9625,26 +9612,8 @@
                 <w:sz w:val="19"/>
                 <w:szCs w:val="19"/>
               </w:rPr>
-              <w:t>phase-4-tome</w:t>
-            </w:r>
-          </w:p>
-        </w:tc>
-      </w:tr>
-      <w:tr>
-        <w:trPr>
-          <w:trHeight w:val="459" w:hRule="atLeast"/>
-          <w:cantSplit w:val="true"/>
-        </w:trPr>
-        <w:tc>
-          <w:tcPr>
-            <w:tcW w:w="60" w:type="dxa"/>
-            <w:tcBorders>
-              <w:bottom w:val="single" w:sz="2" w:space="0" w:color="AAAAAA"/>
-            </w:tcBorders>
-          </w:tcPr>
-          <w:p>
-            <w:pPr>
-              <w:pStyle w:val="Normal"/>
+            </w:pPr>
+            <w:r>
               <w:rPr>
                 <w:rFonts w:eastAsia="Latin Modern Roman" w:cs="Latin Modern Roman"/>
                 <w:b/>
@@ -9653,22 +9622,12 @@
                 <w:sz w:val="19"/>
                 <w:szCs w:val="19"/>
               </w:rPr>
-            </w:pPr>
-            <w:r>
-              <w:rPr>
-                <w:rFonts w:eastAsia="Latin Modern Roman" w:cs="Latin Modern Roman"/>
-                <w:b/>
-                <w:bCs/>
-                <w:color w:val="BDAB5D"/>
-                <w:sz w:val="19"/>
-                <w:szCs w:val="19"/>
-              </w:rPr>
-            </w:r>
-          </w:p>
-        </w:tc>
-        <w:tc>
-          <w:tcPr>
-            <w:tcW w:w="9299" w:type="dxa"/>
+            </w:r>
+          </w:p>
+        </w:tc>
+        <w:tc>
+          <w:tcPr>
+            <w:tcW w:w="9300" w:type="dxa"/>
             <w:tcBorders>
               <w:bottom w:val="single" w:sz="2" w:space="0" w:color="AAAAAA"/>
             </w:tcBorders>
@@ -9781,10 +9740,6 @@
             <w:r>
               <w:rPr/>
               <w:t>NA</w:t>
-            </w:r>
-            <w:r>
-              <w:rPr/>
-              <w:t xml:space="preserve">        </w:t>
             </w:r>
           </w:p>
         </w:tc>
@@ -12346,7 +12301,7 @@
             </w:r>
             <w:r>
               <w:rPr/>
-              <w:t xml:space="preserve"> — cfg not needed, api_client is the only dependency </w:t>
+              <w:t xml:space="preserve"> — cfg not needed, api_client is the only dependency</w:t>
             </w:r>
           </w:p>
           <w:p>
@@ -12426,7 +12381,7 @@
             </w:r>
             <w:r>
               <w:rPr/>
-              <w:t xml:space="preserve"> — Phase 1 naming pass item missed at the time </w:t>
+              <w:t xml:space="preserve"> — Phase 1 naming pass item missed at the time</w:t>
             </w:r>
           </w:p>
           <w:p>
@@ -12496,7 +12451,7 @@
             </w:r>
             <w:r>
               <w:rPr/>
-              <w:t xml:space="preserve"> to match rename </w:t>
+              <w:t xml:space="preserve"> to match rename</w:t>
             </w:r>
           </w:p>
           <w:p>
@@ -12560,7 +12515,7 @@
             </w:r>
             <w:r>
               <w:rPr/>
-              <w:t xml:space="preserve"> loop — fires synchronously before API call, returns early with compressed message if triggered </w:t>
+              <w:t xml:space="preserve"> loop — fires synchronously before API call, returns early with compressed message if triggered</w:t>
             </w:r>
           </w:p>
           <w:p>
@@ -12638,10 +12593,6 @@
               </w:rPr>
               <w:t>source=distillation</w:t>
             </w:r>
-            <w:r>
-              <w:rPr/>
-              <w:t xml:space="preserve"> </w:t>
-            </w:r>
           </w:p>
           <w:p>
             <w:pPr>
@@ -12710,7 +12661,7 @@
             </w:r>
             <w:r>
               <w:rPr/>
-              <w:t xml:space="preserve">, returns dict for immediate use </w:t>
+              <w:t>, returns dict for immediate use</w:t>
             </w:r>
           </w:p>
           <w:p>
@@ -12771,7 +12722,7 @@
             </w:r>
             <w:r>
               <w:rPr/>
-              <w:t xml:space="preserve"> created — was missing, caused two Phase 2 tests to fail </w:t>
+              <w:t xml:space="preserve"> created — was missing, caused two Phase 2 tests to fail</w:t>
             </w:r>
           </w:p>
           <w:p>
@@ -12815,7 +12766,7 @@
             </w:pPr>
             <w:r>
               <w:rPr/>
-              <w:t xml:space="preserve">FAT_PATTERNS had a split string across two list entries — merged into single valid regex </w:t>
+              <w:t>FAT_PATTERNS had a split string across two list entries — merged into single valid regex</w:t>
             </w:r>
           </w:p>
           <w:p>
@@ -12865,7 +12816,7 @@
             </w:r>
             <w:r>
               <w:rPr/>
-              <w:t xml:space="preserve"> was never written to disk despite being designed — created during Phase 5 test run when Phase 4 tests first ran </w:t>
+              <w:t xml:space="preserve"> was never written to disk despite being designed — created during Phase 5 test run when Phase 4 tests first ran</w:t>
             </w:r>
           </w:p>
           <w:p>
@@ -12928,7 +12879,7 @@
             </w:r>
             <w:r>
               <w:rPr/>
-              <w:t xml:space="preserve"> was accidentally overwritten by an older version from an open text editor </w:t>
+              <w:t xml:space="preserve"> was accidentally overwritten by an older version from an open text editor</w:t>
             </w:r>
           </w:p>
           <w:p>
@@ -13768,7 +13719,7 @@
             </w:r>
             <w:r>
               <w:rPr/>
-              <w:t xml:space="preserve"> git commit </w:t>
+              <w:t xml:space="preserve"> git commit</w:t>
             </w:r>
           </w:p>
           <w:p>
@@ -13822,7 +13773,7 @@
             </w:r>
             <w:r>
               <w:rPr/>
-              <w:t xml:space="preserve"> rename, Distillation signature fix, distillation trigger, Grimoire store path </w:t>
+              <w:t xml:space="preserve"> rename, Distillation signature fix, distillation trigger, Grimoire store path</w:t>
             </w:r>
           </w:p>
           <w:p>
@@ -13866,7 +13817,7 @@
             </w:pPr>
             <w:r>
               <w:rPr/>
-              <w:t xml:space="preserve">FAT_PATTERNS broken regex — pattern split across two string literals in the list </w:t>
+              <w:t>FAT_PATTERNS broken regex — pattern split across two string literals in the list</w:t>
             </w:r>
           </w:p>
           <w:p>
@@ -13916,7 +13867,7 @@
             </w:r>
             <w:r>
               <w:rPr/>
-              <w:t xml:space="preserve"> missing from disk despite being fully designed — silent until Phase 4 tests ran for the first time in Phase 5 </w:t>
+              <w:t xml:space="preserve"> missing from disk despite being fully designed — silent until Phase 4 tests ran for the first time in Phase 5</w:t>
             </w:r>
           </w:p>
           <w:p>
@@ -13980,7 +13931,7 @@
             </w:r>
             <w:r>
               <w:rPr/>
-              <w:t xml:space="preserve"> override </w:t>
+              <w:t xml:space="preserve"> override</w:t>
             </w:r>
           </w:p>
         </w:tc>
@@ -14025,7 +13976,7 @@
             </w:r>
             <w:r>
               <w:rPr/>
-              <w:t xml:space="preserve"> kwarg that doesn't exist — tests written against imagined API, not real signature </w:t>
+              <w:t xml:space="preserve"> kwarg that doesn't exist — tests written against imagined API, not real signature</w:t>
             </w:r>
           </w:p>
           <w:p>
@@ -14074,7 +14025,7 @@
             </w:r>
             <w:r>
               <w:rPr/>
-              <w:t xml:space="preserve"> word count threshold (15) meant short test messages never extracted — required longer fixture messages to pass </w:t>
+              <w:t xml:space="preserve"> word count threshold (15) meant short test messages never extracted — required longer fixture messages to pass</w:t>
             </w:r>
           </w:p>
           <w:p>
@@ -15145,11 +15096,24 @@
           </w:tcPr>
           <w:p>
             <w:pPr>
-              <w:pStyle w:val="Normal"/>
-              <w:rPr/>
-            </w:pPr>
-            <w:r>
-              <w:rPr/>
+              <w:pStyle w:val="ListParagraph"/>
+              <w:numPr>
+                <w:ilvl w:val="0"/>
+                <w:numId w:val="3"/>
+              </w:numPr>
+              <w:spacing w:before="40" w:after="40"/>
+              <w:rPr/>
+            </w:pPr>
+            <w:r>
+              <w:rPr>
+                <w:rFonts w:eastAsia="Latin Modern Roman" w:cs="Latin Modern Roman"/>
+                <w:b w:val="false"/>
+                <w:bCs w:val="false"/>
+                <w:color w:val="BDAB5D"/>
+                <w:sz w:val="20"/>
+                <w:szCs w:val="20"/>
+              </w:rPr>
+              <w:t>EntityCompiler built with compile(), cache, _validate_traits(), _build_instruction_string()</w:t>
             </w:r>
           </w:p>
         </w:tc>
@@ -15169,11 +15133,24 @@
           </w:tcPr>
           <w:p>
             <w:pPr>
-              <w:pStyle w:val="Normal"/>
-              <w:rPr/>
-            </w:pPr>
-            <w:r>
-              <w:rPr/>
+              <w:pStyle w:val="ListParagraph"/>
+              <w:numPr>
+                <w:ilvl w:val="0"/>
+                <w:numId w:val="3"/>
+              </w:numPr>
+              <w:spacing w:before="40" w:after="40"/>
+              <w:rPr/>
+            </w:pPr>
+            <w:r>
+              <w:rPr>
+                <w:rFonts w:eastAsia="Latin Modern Roman" w:cs="Latin Modern Roman"/>
+                <w:b w:val="false"/>
+                <w:bCs w:val="false"/>
+                <w:color w:val="BDAB5D"/>
+                <w:sz w:val="20"/>
+                <w:szCs w:val="20"/>
+              </w:rPr>
+              <w:t>Council built with .active property, summon(), dismiss(), get_compiled()</w:t>
             </w:r>
           </w:p>
         </w:tc>
@@ -15193,11 +15170,24 @@
           </w:tcPr>
           <w:p>
             <w:pPr>
-              <w:pStyle w:val="Normal"/>
-              <w:rPr/>
-            </w:pPr>
-            <w:r>
-              <w:rPr/>
+              <w:pStyle w:val="ListParagraph"/>
+              <w:numPr>
+                <w:ilvl w:val="0"/>
+                <w:numId w:val="3"/>
+              </w:numPr>
+              <w:spacing w:before="40" w:after="40"/>
+              <w:rPr/>
+            </w:pPr>
+            <w:r>
+              <w:rPr>
+                <w:rFonts w:eastAsia="Latin Modern Roman" w:cs="Latin Modern Roman"/>
+                <w:b w:val="false"/>
+                <w:bCs w:val="false"/>
+                <w:color w:val="BDAB5D"/>
+                <w:sz w:val="20"/>
+                <w:szCs w:val="20"/>
+              </w:rPr>
+              <w:t>entities/canon/entity_canon.yaml — all 10 Council entities defined</w:t>
             </w:r>
           </w:p>
         </w:tc>
@@ -15217,11 +15207,24 @@
           </w:tcPr>
           <w:p>
             <w:pPr>
-              <w:pStyle w:val="Normal"/>
-              <w:rPr/>
-            </w:pPr>
-            <w:r>
-              <w:rPr/>
+              <w:pStyle w:val="ListParagraph"/>
+              <w:numPr>
+                <w:ilvl w:val="0"/>
+                <w:numId w:val="3"/>
+              </w:numPr>
+              <w:spacing w:before="40" w:after="40"/>
+              <w:rPr/>
+            </w:pPr>
+            <w:r>
+              <w:rPr>
+                <w:rFonts w:eastAsia="Latin Modern Roman" w:cs="Latin Modern Roman"/>
+                <w:b w:val="false"/>
+                <w:bCs w:val="false"/>
+                <w:color w:val="BDAB5D"/>
+                <w:sz w:val="20"/>
+                <w:szCs w:val="20"/>
+              </w:rPr>
+              <w:t>entities/profiles/profiles.yaml — precise profile with max_output_tokens=5000</w:t>
             </w:r>
           </w:p>
         </w:tc>
@@ -15241,11 +15244,24 @@
           </w:tcPr>
           <w:p>
             <w:pPr>
-              <w:pStyle w:val="Normal"/>
-              <w:rPr/>
-            </w:pPr>
-            <w:r>
-              <w:rPr/>
+              <w:pStyle w:val="ListParagraph"/>
+              <w:numPr>
+                <w:ilvl w:val="0"/>
+                <w:numId w:val="3"/>
+              </w:numPr>
+              <w:spacing w:before="40" w:after="40"/>
+              <w:rPr/>
+            </w:pPr>
+            <w:r>
+              <w:rPr>
+                <w:rFonts w:eastAsia="Latin Modern Roman" w:cs="Latin Modern Roman"/>
+                <w:b w:val="false"/>
+                <w:bCs w:val="false"/>
+                <w:color w:val="BDAB5D"/>
+                <w:sz w:val="20"/>
+                <w:szCs w:val="20"/>
+              </w:rPr>
+              <w:t>temperature removed from all API calls permanently — reasoning models reject it</w:t>
             </w:r>
           </w:p>
         </w:tc>
@@ -15265,11 +15281,24 @@
           </w:tcPr>
           <w:p>
             <w:pPr>
-              <w:pStyle w:val="Normal"/>
-              <w:rPr/>
-            </w:pPr>
-            <w:r>
-              <w:rPr/>
+              <w:pStyle w:val="ListParagraph"/>
+              <w:numPr>
+                <w:ilvl w:val="0"/>
+                <w:numId w:val="3"/>
+              </w:numPr>
+              <w:spacing w:before="40" w:after="40"/>
+              <w:rPr/>
+            </w:pPr>
+            <w:r>
+              <w:rPr>
+                <w:rFonts w:eastAsia="Latin Modern Roman" w:cs="Latin Modern Roman"/>
+                <w:b w:val="false"/>
+                <w:bCs w:val="false"/>
+                <w:color w:val="BDAB5D"/>
+                <w:sz w:val="20"/>
+                <w:szCs w:val="20"/>
+              </w:rPr>
+              <w:t>Entity behavioral differentiation via instruction_str only — no temperature manipulation</w:t>
             </w:r>
           </w:p>
         </w:tc>
@@ -15289,11 +15318,394 @@
           </w:tcPr>
           <w:p>
             <w:pPr>
-              <w:pStyle w:val="Normal"/>
-              <w:rPr/>
-            </w:pPr>
-            <w:r>
-              <w:rPr/>
+              <w:pStyle w:val="ListParagraph"/>
+              <w:numPr>
+                <w:ilvl w:val="0"/>
+                <w:numId w:val="3"/>
+              </w:numPr>
+              <w:spacing w:before="40" w:after="40"/>
+              <w:rPr/>
+            </w:pPr>
+            <w:r>
+              <w:rPr>
+                <w:rFonts w:eastAsia="Latin Modern Roman" w:cs="Latin Modern Roman"/>
+                <w:b w:val="false"/>
+                <w:bCs w:val="false"/>
+                <w:color w:val="BDAB5D"/>
+                <w:sz w:val="20"/>
+                <w:szCs w:val="20"/>
+              </w:rPr>
+              <w:t>council.active property used (not council.get_active())</w:t>
+            </w:r>
+          </w:p>
+        </w:tc>
+      </w:tr>
+      <w:tr>
+        <w:trPr>
+          <w:cantSplit w:val="true"/>
+        </w:trPr>
+        <w:tc>
+          <w:tcPr>
+            <w:tcW w:w="9360" w:type="dxa"/>
+            <w:tcBorders>
+              <w:start w:val="single" w:sz="2" w:space="0" w:color="AAAAAA"/>
+              <w:bottom w:val="single" w:sz="2" w:space="0" w:color="AAAAAA"/>
+              <w:end w:val="single" w:sz="2" w:space="0" w:color="AAAAAA"/>
+            </w:tcBorders>
+          </w:tcPr>
+          <w:p>
+            <w:pPr>
+              <w:pStyle w:val="ListParagraph"/>
+              <w:numPr>
+                <w:ilvl w:val="0"/>
+                <w:numId w:val="3"/>
+              </w:numPr>
+              <w:spacing w:before="40" w:after="40"/>
+              <w:rPr/>
+            </w:pPr>
+            <w:r>
+              <w:rPr>
+                <w:rFonts w:eastAsia="Latin Modern Roman" w:cs="Latin Modern Roman"/>
+                <w:b w:val="false"/>
+                <w:bCs w:val="false"/>
+                <w:color w:val="BDAB5D"/>
+                <w:sz w:val="20"/>
+                <w:szCs w:val="20"/>
+              </w:rPr>
+              <w:t>_handle_summon_command(), _run_assessor(), _assessor_api_call() added to app.py</w:t>
+            </w:r>
+          </w:p>
+        </w:tc>
+      </w:tr>
+      <w:tr>
+        <w:trPr>
+          <w:cantSplit w:val="true"/>
+        </w:trPr>
+        <w:tc>
+          <w:tcPr>
+            <w:tcW w:w="9360" w:type="dxa"/>
+            <w:tcBorders>
+              <w:start w:val="single" w:sz="2" w:space="0" w:color="AAAAAA"/>
+              <w:bottom w:val="single" w:sz="2" w:space="0" w:color="AAAAAA"/>
+              <w:end w:val="single" w:sz="2" w:space="0" w:color="AAAAAA"/>
+            </w:tcBorders>
+          </w:tcPr>
+          <w:p>
+            <w:pPr>
+              <w:pStyle w:val="ListParagraph"/>
+              <w:numPr>
+                <w:ilvl w:val="0"/>
+                <w:numId w:val="3"/>
+              </w:numPr>
+              <w:spacing w:before="40" w:after="40"/>
+              <w:rPr/>
+            </w:pPr>
+            <w:r>
+              <w:rPr>
+                <w:rFonts w:eastAsia="Latin Modern Roman" w:cs="Latin Modern Roman"/>
+                <w:b w:val="false"/>
+                <w:bCs w:val="false"/>
+                <w:color w:val="BDAB5D"/>
+                <w:sz w:val="20"/>
+                <w:szCs w:val="20"/>
+              </w:rPr>
+              <w:t>MIGRATION: Switched from OpenAI Responses API to Claude + ClaudeBox — reasoning token exhaustion and instructions= friction eliminated</w:t>
+            </w:r>
+          </w:p>
+        </w:tc>
+      </w:tr>
+      <w:tr>
+        <w:trPr>
+          <w:cantSplit w:val="true"/>
+        </w:trPr>
+        <w:tc>
+          <w:tcPr>
+            <w:tcW w:w="9360" w:type="dxa"/>
+            <w:tcBorders>
+              <w:start w:val="single" w:sz="2" w:space="0" w:color="AAAAAA"/>
+              <w:bottom w:val="single" w:sz="2" w:space="0" w:color="AAAAAA"/>
+              <w:end w:val="single" w:sz="2" w:space="0" w:color="AAAAAA"/>
+            </w:tcBorders>
+          </w:tcPr>
+          <w:p>
+            <w:pPr>
+              <w:pStyle w:val="ListParagraph"/>
+              <w:numPr>
+                <w:ilvl w:val="0"/>
+                <w:numId w:val="3"/>
+              </w:numPr>
+              <w:spacing w:before="40" w:after="40"/>
+              <w:rPr/>
+            </w:pPr>
+            <w:r>
+              <w:rPr>
+                <w:rFonts w:eastAsia="Latin Modern Roman" w:cs="Latin Modern Roman"/>
+                <w:b w:val="false"/>
+                <w:bCs w:val="false"/>
+                <w:color w:val="BDAB5D"/>
+                <w:sz w:val="20"/>
+                <w:szCs w:val="20"/>
+              </w:rPr>
+              <w:t>MIGRATION: router.py replaced — ClaudeBox stream() generator, same public signature: ModelDecision, ModelRouter, decide(), stream_response_text()</w:t>
+            </w:r>
+          </w:p>
+        </w:tc>
+      </w:tr>
+      <w:tr>
+        <w:trPr>
+          <w:cantSplit w:val="true"/>
+        </w:trPr>
+        <w:tc>
+          <w:tcPr>
+            <w:tcW w:w="9360" w:type="dxa"/>
+            <w:tcBorders>
+              <w:start w:val="single" w:sz="2" w:space="0" w:color="AAAAAA"/>
+              <w:bottom w:val="single" w:sz="2" w:space="0" w:color="AAAAAA"/>
+              <w:end w:val="single" w:sz="2" w:space="0" w:color="AAAAAA"/>
+            </w:tcBorders>
+          </w:tcPr>
+          <w:p>
+            <w:pPr>
+              <w:pStyle w:val="ListParagraph"/>
+              <w:numPr>
+                <w:ilvl w:val="0"/>
+                <w:numId w:val="3"/>
+              </w:numPr>
+              <w:spacing w:before="40" w:after="40"/>
+              <w:rPr/>
+            </w:pPr>
+            <w:r>
+              <w:rPr>
+                <w:rFonts w:eastAsia="Latin Modern Roman" w:cs="Latin Modern Roman"/>
+                <w:b w:val="false"/>
+                <w:bCs w:val="false"/>
+                <w:color w:val="BDAB5D"/>
+                <w:sz w:val="20"/>
+                <w:szCs w:val="20"/>
+              </w:rPr>
+              <w:t>MIGRATION: config.yaml updated — models use claude-* names, api_key_env_var → CLAUDE_API_KEY, embeddings key removed</w:t>
+            </w:r>
+          </w:p>
+        </w:tc>
+      </w:tr>
+      <w:tr>
+        <w:trPr>
+          <w:cantSplit w:val="true"/>
+        </w:trPr>
+        <w:tc>
+          <w:tcPr>
+            <w:tcW w:w="9360" w:type="dxa"/>
+            <w:tcBorders>
+              <w:start w:val="single" w:sz="2" w:space="0" w:color="AAAAAA"/>
+              <w:bottom w:val="single" w:sz="2" w:space="0" w:color="AAAAAA"/>
+              <w:end w:val="single" w:sz="2" w:space="0" w:color="AAAAAA"/>
+            </w:tcBorders>
+          </w:tcPr>
+          <w:p>
+            <w:pPr>
+              <w:pStyle w:val="ListParagraph"/>
+              <w:numPr>
+                <w:ilvl w:val="0"/>
+                <w:numId w:val="3"/>
+              </w:numPr>
+              <w:spacing w:before="40" w:after="40"/>
+              <w:rPr/>
+            </w:pPr>
+            <w:r>
+              <w:rPr>
+                <w:rFonts w:eastAsia="Latin Modern Roman" w:cs="Latin Modern Roman"/>
+                <w:b w:val="false"/>
+                <w:bCs w:val="false"/>
+                <w:color w:val="BDAB5D"/>
+                <w:sz w:val="20"/>
+                <w:szCs w:val="20"/>
+              </w:rPr>
+              <w:t>MIGRATION: Chronicle refactored — removed OpenAI client, switched to local sentence-transformers (all-MiniLM-L6-v2)</w:t>
+            </w:r>
+          </w:p>
+        </w:tc>
+      </w:tr>
+      <w:tr>
+        <w:trPr>
+          <w:cantSplit w:val="true"/>
+        </w:trPr>
+        <w:tc>
+          <w:tcPr>
+            <w:tcW w:w="9360" w:type="dxa"/>
+            <w:tcBorders>
+              <w:start w:val="single" w:sz="2" w:space="0" w:color="AAAAAA"/>
+              <w:bottom w:val="single" w:sz="2" w:space="0" w:color="AAAAAA"/>
+              <w:end w:val="single" w:sz="2" w:space="0" w:color="AAAAAA"/>
+            </w:tcBorders>
+          </w:tcPr>
+          <w:p>
+            <w:pPr>
+              <w:pStyle w:val="ListParagraph"/>
+              <w:numPr>
+                <w:ilvl w:val="0"/>
+                <w:numId w:val="3"/>
+              </w:numPr>
+              <w:spacing w:before="40" w:after="40"/>
+              <w:rPr/>
+            </w:pPr>
+            <w:r>
+              <w:rPr>
+                <w:rFonts w:eastAsia="Latin Modern Roman" w:cs="Latin Modern Roman"/>
+                <w:b w:val="false"/>
+                <w:bCs w:val="false"/>
+                <w:color w:val="BDAB5D"/>
+                <w:sz w:val="20"/>
+                <w:szCs w:val="20"/>
+              </w:rPr>
+              <w:t>MIGRATION: Distillation refactored — constructor changed from api_client= to box=, cfg=. _compress() uses box.send()</w:t>
+            </w:r>
+          </w:p>
+        </w:tc>
+      </w:tr>
+      <w:tr>
+        <w:trPr>
+          <w:cantSplit w:val="true"/>
+        </w:trPr>
+        <w:tc>
+          <w:tcPr>
+            <w:tcW w:w="9360" w:type="dxa"/>
+            <w:tcBorders>
+              <w:start w:val="single" w:sz="2" w:space="0" w:color="AAAAAA"/>
+              <w:bottom w:val="single" w:sz="2" w:space="0" w:color="AAAAAA"/>
+              <w:end w:val="single" w:sz="2" w:space="0" w:color="AAAAAA"/>
+            </w:tcBorders>
+          </w:tcPr>
+          <w:p>
+            <w:pPr>
+              <w:pStyle w:val="ListParagraph"/>
+              <w:numPr>
+                <w:ilvl w:val="0"/>
+                <w:numId w:val="3"/>
+              </w:numPr>
+              <w:spacing w:before="40" w:after="40"/>
+              <w:rPr/>
+            </w:pPr>
+            <w:r>
+              <w:rPr>
+                <w:rFonts w:eastAsia="Latin Modern Roman" w:cs="Latin Modern Roman"/>
+                <w:b w:val="false"/>
+                <w:bCs w:val="false"/>
+                <w:color w:val="BDAB5D"/>
+                <w:sz w:val="20"/>
+                <w:szCs w:val="20"/>
+              </w:rPr>
+              <w:t>MIGRATION: Reflection refactored — constructor changed from client= to box=. observe() uses box.send()</w:t>
+            </w:r>
+          </w:p>
+        </w:tc>
+      </w:tr>
+      <w:tr>
+        <w:trPr>
+          <w:cantSplit w:val="true"/>
+        </w:trPr>
+        <w:tc>
+          <w:tcPr>
+            <w:tcW w:w="9360" w:type="dxa"/>
+            <w:tcBorders>
+              <w:start w:val="single" w:sz="2" w:space="0" w:color="AAAAAA"/>
+              <w:bottom w:val="single" w:sz="2" w:space="0" w:color="AAAAAA"/>
+              <w:end w:val="single" w:sz="2" w:space="0" w:color="AAAAAA"/>
+            </w:tcBorders>
+          </w:tcPr>
+          <w:p>
+            <w:pPr>
+              <w:pStyle w:val="ListParagraph"/>
+              <w:numPr>
+                <w:ilvl w:val="0"/>
+                <w:numId w:val="3"/>
+              </w:numPr>
+              <w:spacing w:before="40" w:after="40"/>
+              <w:rPr/>
+            </w:pPr>
+            <w:r>
+              <w:rPr>
+                <w:rFonts w:eastAsia="Latin Modern Roman" w:cs="Latin Modern Roman"/>
+                <w:b w:val="false"/>
+                <w:bCs w:val="false"/>
+                <w:color w:val="BDAB5D"/>
+                <w:sz w:val="20"/>
+                <w:szCs w:val="20"/>
+              </w:rPr>
+              <w:t>MIGRATION: sentence-transformers 5.2.3 + torch 2.10.0 installed to venv</w:t>
+            </w:r>
+          </w:p>
+        </w:tc>
+      </w:tr>
+      <w:tr>
+        <w:trPr>
+          <w:cantSplit w:val="true"/>
+        </w:trPr>
+        <w:tc>
+          <w:tcPr>
+            <w:tcW w:w="9360" w:type="dxa"/>
+            <w:tcBorders>
+              <w:start w:val="single" w:sz="2" w:space="0" w:color="AAAAAA"/>
+              <w:bottom w:val="single" w:sz="2" w:space="0" w:color="AAAAAA"/>
+              <w:end w:val="single" w:sz="2" w:space="0" w:color="AAAAAA"/>
+            </w:tcBorders>
+          </w:tcPr>
+          <w:p>
+            <w:pPr>
+              <w:pStyle w:val="ListParagraph"/>
+              <w:numPr>
+                <w:ilvl w:val="0"/>
+                <w:numId w:val="3"/>
+              </w:numPr>
+              <w:spacing w:before="40" w:after="40"/>
+              <w:rPr/>
+            </w:pPr>
+            <w:r>
+              <w:rPr>
+                <w:rFonts w:eastAsia="Latin Modern Roman" w:cs="Latin Modern Roman"/>
+                <w:b w:val="false"/>
+                <w:bCs w:val="false"/>
+                <w:color w:val="BDAB5D"/>
+                <w:sz w:val="20"/>
+                <w:szCs w:val="20"/>
+              </w:rPr>
+              <w:t>self.conversations missing from app.__init__ — restored after migration</w:t>
+            </w:r>
+          </w:p>
+        </w:tc>
+      </w:tr>
+      <w:tr>
+        <w:trPr>
+          <w:cantSplit w:val="true"/>
+        </w:trPr>
+        <w:tc>
+          <w:tcPr>
+            <w:tcW w:w="9360" w:type="dxa"/>
+            <w:tcBorders>
+              <w:start w:val="single" w:sz="2" w:space="0" w:color="AAAAAA"/>
+              <w:bottom w:val="single" w:sz="2" w:space="0" w:color="AAAAAA"/>
+              <w:end w:val="single" w:sz="2" w:space="0" w:color="AAAAAA"/>
+            </w:tcBorders>
+          </w:tcPr>
+          <w:p>
+            <w:pPr>
+              <w:pStyle w:val="ListParagraph"/>
+              <w:numPr>
+                <w:ilvl w:val="0"/>
+                <w:numId w:val="3"/>
+              </w:numPr>
+              <w:spacing w:before="40" w:after="40"/>
+              <w:rPr/>
+            </w:pPr>
+            <w:r>
+              <w:rPr>
+                <w:rFonts w:eastAsia="Latin Modern Roman" w:cs="Latin Modern Roman"/>
+                <w:b w:val="false"/>
+                <w:bCs w:val="false"/>
+                <w:color w:val="BDAB5D"/>
+                <w:sz w:val="20"/>
+                <w:szCs w:val="20"/>
+              </w:rPr>
+              <w:t>Tests updated: client= / api_client= kwargs replaced with box= throughout test_phase1_naming.py and test_phase5_distillation.py</w:t>
             </w:r>
           </w:p>
         </w:tc>
@@ -15544,7 +15956,15 @@
               <w:rPr/>
             </w:pPr>
             <w:r>
-              <w:rPr/>
+              <w:rPr>
+                <w:rFonts w:eastAsia="Latin Modern Roman" w:cs="Latin Modern Roman"/>
+                <w:b w:val="false"/>
+                <w:bCs w:val="false"/>
+                <w:color w:val="BDAB5D"/>
+                <w:sz w:val="18"/>
+                <w:szCs w:val="18"/>
+              </w:rPr>
+              <w:t>API provider</w:t>
             </w:r>
           </w:p>
         </w:tc>
@@ -15569,7 +15989,15 @@
               <w:rPr/>
             </w:pPr>
             <w:r>
-              <w:rPr/>
+              <w:rPr>
+                <w:rFonts w:eastAsia="Latin Modern Roman" w:cs="Latin Modern Roman"/>
+                <w:b w:val="false"/>
+                <w:bCs w:val="false"/>
+                <w:color w:val="BDAB5D"/>
+                <w:sz w:val="18"/>
+                <w:szCs w:val="18"/>
+              </w:rPr>
+              <w:t>OpenAI Responses API</w:t>
             </w:r>
           </w:p>
         </w:tc>
@@ -15594,7 +16022,15 @@
               <w:rPr/>
             </w:pPr>
             <w:r>
-              <w:rPr/>
+              <w:rPr>
+                <w:rFonts w:eastAsia="Latin Modern Roman" w:cs="Latin Modern Roman"/>
+                <w:b w:val="false"/>
+                <w:bCs w:val="false"/>
+                <w:color w:val="BDAB5D"/>
+                <w:sz w:val="18"/>
+                <w:szCs w:val="18"/>
+              </w:rPr>
+              <w:t>Anthropic Claude via ClaudeBox</w:t>
             </w:r>
           </w:p>
         </w:tc>
@@ -15603,6 +16039,39 @@
             <w:tcW w:w="2559" w:type="dxa"/>
             <w:tcBorders>
               <w:top w:val="single" w:sz="2" w:space="0" w:color="AAAAAA"/>
+              <w:start w:val="single" w:sz="2" w:space="0" w:color="AAAAAA"/>
+              <w:bottom w:val="single" w:sz="2" w:space="0" w:color="AAAAAA"/>
+              <w:end w:val="single" w:sz="2" w:space="0" w:color="AAAAAA"/>
+            </w:tcBorders>
+            <w:shd w:fill="1A1040" w:val="clear"/>
+          </w:tcPr>
+          <w:p>
+            <w:pPr>
+              <w:pStyle w:val="Normal"/>
+              <w:rPr/>
+            </w:pPr>
+            <w:r>
+              <w:rPr>
+                <w:rFonts w:eastAsia="Latin Modern Roman" w:cs="Latin Modern Roman"/>
+                <w:b w:val="false"/>
+                <w:bCs w:val="false"/>
+                <w:color w:val="BDAB5D"/>
+                <w:sz w:val="18"/>
+                <w:szCs w:val="18"/>
+              </w:rPr>
+              <w:t>Reasoning token exhaustion + instructions= friction.</w:t>
+            </w:r>
+          </w:p>
+        </w:tc>
+      </w:tr>
+      <w:tr>
+        <w:trPr>
+          <w:cantSplit w:val="true"/>
+        </w:trPr>
+        <w:tc>
+          <w:tcPr>
+            <w:tcW w:w="1599" w:type="dxa"/>
+            <w:tcBorders>
               <w:start w:val="single" w:sz="2" w:space="0" w:color="AAAAAA"/>
               <w:bottom w:val="single" w:sz="2" w:space="0" w:color="AAAAAA"/>
               <w:end w:val="single" w:sz="2" w:space="0" w:color="AAAAAA"/>
@@ -15619,20 +16088,22 @@
               <w:rPr/>
             </w:pPr>
             <w:r>
-              <w:rPr/>
-            </w:r>
-          </w:p>
-        </w:tc>
-      </w:tr>
-      <w:tr>
-        <w:trPr>
-          <w:cantSplit w:val="true"/>
-        </w:trPr>
-        <w:tc>
-          <w:tcPr>
-            <w:tcW w:w="1599" w:type="dxa"/>
-            <w:tcBorders>
-              <w:top w:val="single" w:sz="2" w:space="0" w:color="AAAAAA"/>
+              <w:rPr>
+                <w:rFonts w:eastAsia="Latin Modern Roman" w:cs="Latin Modern Roman"/>
+                <w:b w:val="false"/>
+                <w:bCs w:val="false"/>
+                <w:color w:val="BDAB5D"/>
+                <w:sz w:val="18"/>
+                <w:szCs w:val="18"/>
+              </w:rPr>
+              <w:t>temperature</w:t>
+            </w:r>
+          </w:p>
+        </w:tc>
+        <w:tc>
+          <w:tcPr>
+            <w:tcW w:w="2401" w:type="dxa"/>
+            <w:tcBorders>
               <w:start w:val="single" w:sz="2" w:space="0" w:color="AAAAAA"/>
               <w:bottom w:val="single" w:sz="2" w:space="0" w:color="AAAAAA"/>
               <w:end w:val="single" w:sz="2" w:space="0" w:color="AAAAAA"/>
@@ -15649,15 +16120,22 @@
               <w:rPr/>
             </w:pPr>
             <w:r>
-              <w:rPr/>
-            </w:r>
-          </w:p>
-        </w:tc>
-        <w:tc>
-          <w:tcPr>
-            <w:tcW w:w="2401" w:type="dxa"/>
-            <w:tcBorders>
-              <w:top w:val="single" w:sz="2" w:space="0" w:color="AAAAAA"/>
+              <w:rPr>
+                <w:rFonts w:eastAsia="Latin Modern Roman" w:cs="Latin Modern Roman"/>
+                <w:b w:val="false"/>
+                <w:bCs w:val="false"/>
+                <w:color w:val="BDAB5D"/>
+                <w:sz w:val="18"/>
+                <w:szCs w:val="18"/>
+              </w:rPr>
+              <w:t>Was set on all calls</w:t>
+            </w:r>
+          </w:p>
+        </w:tc>
+        <w:tc>
+          <w:tcPr>
+            <w:tcW w:w="2800" w:type="dxa"/>
+            <w:tcBorders>
               <w:start w:val="single" w:sz="2" w:space="0" w:color="AAAAAA"/>
               <w:bottom w:val="single" w:sz="2" w:space="0" w:color="AAAAAA"/>
               <w:end w:val="single" w:sz="2" w:space="0" w:color="AAAAAA"/>
@@ -15674,15 +16152,22 @@
               <w:rPr/>
             </w:pPr>
             <w:r>
-              <w:rPr/>
-            </w:r>
-          </w:p>
-        </w:tc>
-        <w:tc>
-          <w:tcPr>
-            <w:tcW w:w="2800" w:type="dxa"/>
-            <w:tcBorders>
-              <w:top w:val="single" w:sz="2" w:space="0" w:color="AAAAAA"/>
+              <w:rPr>
+                <w:rFonts w:eastAsia="Latin Modern Roman" w:cs="Latin Modern Roman"/>
+                <w:b w:val="false"/>
+                <w:bCs w:val="false"/>
+                <w:color w:val="BDAB5D"/>
+                <w:sz w:val="18"/>
+                <w:szCs w:val="18"/>
+              </w:rPr>
+              <w:t>Removed permanently</w:t>
+            </w:r>
+          </w:p>
+        </w:tc>
+        <w:tc>
+          <w:tcPr>
+            <w:tcW w:w="2559" w:type="dxa"/>
+            <w:tcBorders>
               <w:start w:val="single" w:sz="2" w:space="0" w:color="AAAAAA"/>
               <w:bottom w:val="single" w:sz="2" w:space="0" w:color="AAAAAA"/>
               <w:end w:val="single" w:sz="2" w:space="0" w:color="AAAAAA"/>
@@ -15699,13 +16184,26 @@
               <w:rPr/>
             </w:pPr>
             <w:r>
-              <w:rPr/>
-            </w:r>
-          </w:p>
-        </w:tc>
-        <w:tc>
-          <w:tcPr>
-            <w:tcW w:w="2559" w:type="dxa"/>
+              <w:rPr>
+                <w:rFonts w:eastAsia="Latin Modern Roman" w:cs="Latin Modern Roman"/>
+                <w:b w:val="false"/>
+                <w:bCs w:val="false"/>
+                <w:color w:val="BDAB5D"/>
+                <w:sz w:val="18"/>
+                <w:szCs w:val="18"/>
+              </w:rPr>
+              <w:t>Reasoning models reject temperature. Permanent.</w:t>
+            </w:r>
+          </w:p>
+        </w:tc>
+      </w:tr>
+      <w:tr>
+        <w:trPr>
+          <w:cantSplit w:val="true"/>
+        </w:trPr>
+        <w:tc>
+          <w:tcPr>
+            <w:tcW w:w="1599" w:type="dxa"/>
             <w:tcBorders>
               <w:top w:val="single" w:sz="2" w:space="0" w:color="AAAAAA"/>
               <w:start w:val="single" w:sz="2" w:space="0" w:color="AAAAAA"/>
@@ -15724,18 +16222,21 @@
               <w:rPr/>
             </w:pPr>
             <w:r>
-              <w:rPr/>
-            </w:r>
-          </w:p>
-        </w:tc>
-      </w:tr>
-      <w:tr>
-        <w:trPr>
-          <w:cantSplit w:val="true"/>
-        </w:trPr>
-        <w:tc>
-          <w:tcPr>
-            <w:tcW w:w="1599" w:type="dxa"/>
+              <w:rPr>
+                <w:rFonts w:eastAsia="Latin Modern Roman" w:cs="Latin Modern Roman"/>
+                <w:b w:val="false"/>
+                <w:bCs w:val="false"/>
+                <w:color w:val="BDAB5D"/>
+                <w:sz w:val="18"/>
+                <w:szCs w:val="18"/>
+              </w:rPr>
+              <w:t>Chronicle embeddings</w:t>
+            </w:r>
+          </w:p>
+        </w:tc>
+        <w:tc>
+          <w:tcPr>
+            <w:tcW w:w="2401" w:type="dxa"/>
             <w:tcBorders>
               <w:top w:val="single" w:sz="2" w:space="0" w:color="AAAAAA"/>
               <w:start w:val="single" w:sz="2" w:space="0" w:color="AAAAAA"/>
@@ -15754,13 +16255,21 @@
               <w:rPr/>
             </w:pPr>
             <w:r>
-              <w:rPr/>
-            </w:r>
-          </w:p>
-        </w:tc>
-        <w:tc>
-          <w:tcPr>
-            <w:tcW w:w="2401" w:type="dxa"/>
+              <w:rPr>
+                <w:rFonts w:eastAsia="Latin Modern Roman" w:cs="Latin Modern Roman"/>
+                <w:b w:val="false"/>
+                <w:bCs w:val="false"/>
+                <w:color w:val="BDAB5D"/>
+                <w:sz w:val="18"/>
+                <w:szCs w:val="18"/>
+              </w:rPr>
+              <w:t>OpenAI embeddings.create()</w:t>
+            </w:r>
+          </w:p>
+        </w:tc>
+        <w:tc>
+          <w:tcPr>
+            <w:tcW w:w="2800" w:type="dxa"/>
             <w:tcBorders>
               <w:top w:val="single" w:sz="2" w:space="0" w:color="AAAAAA"/>
               <w:start w:val="single" w:sz="2" w:space="0" w:color="AAAAAA"/>
@@ -15779,13 +16288,21 @@
               <w:rPr/>
             </w:pPr>
             <w:r>
-              <w:rPr/>
-            </w:r>
-          </w:p>
-        </w:tc>
-        <w:tc>
-          <w:tcPr>
-            <w:tcW w:w="2800" w:type="dxa"/>
+              <w:rPr>
+                <w:rFonts w:eastAsia="Latin Modern Roman" w:cs="Latin Modern Roman"/>
+                <w:b w:val="false"/>
+                <w:bCs w:val="false"/>
+                <w:color w:val="BDAB5D"/>
+                <w:sz w:val="18"/>
+                <w:szCs w:val="18"/>
+              </w:rPr>
+              <w:t>Local sentence-transformers</w:t>
+            </w:r>
+          </w:p>
+        </w:tc>
+        <w:tc>
+          <w:tcPr>
+            <w:tcW w:w="2559" w:type="dxa"/>
             <w:tcBorders>
               <w:top w:val="single" w:sz="2" w:space="0" w:color="AAAAAA"/>
               <w:start w:val="single" w:sz="2" w:space="0" w:color="AAAAAA"/>
@@ -15804,13 +16321,26 @@
               <w:rPr/>
             </w:pPr>
             <w:r>
-              <w:rPr/>
-            </w:r>
-          </w:p>
-        </w:tc>
-        <w:tc>
-          <w:tcPr>
-            <w:tcW w:w="2559" w:type="dxa"/>
+              <w:rPr>
+                <w:rFonts w:eastAsia="Latin Modern Roman" w:cs="Latin Modern Roman"/>
+                <w:b w:val="false"/>
+                <w:bCs w:val="false"/>
+                <w:color w:val="BDAB5D"/>
+                <w:sz w:val="18"/>
+                <w:szCs w:val="18"/>
+              </w:rPr>
+              <w:t>No API call needed for embeddings. Permanent.</w:t>
+            </w:r>
+          </w:p>
+        </w:tc>
+      </w:tr>
+      <w:tr>
+        <w:trPr>
+          <w:cantSplit w:val="true"/>
+        </w:trPr>
+        <w:tc>
+          <w:tcPr>
+            <w:tcW w:w="1599" w:type="dxa"/>
             <w:tcBorders>
               <w:top w:val="single" w:sz="2" w:space="0" w:color="AAAAAA"/>
               <w:start w:val="single" w:sz="2" w:space="0" w:color="AAAAAA"/>
@@ -15829,18 +16359,21 @@
               <w:rPr/>
             </w:pPr>
             <w:r>
-              <w:rPr/>
-            </w:r>
-          </w:p>
-        </w:tc>
-      </w:tr>
-      <w:tr>
-        <w:trPr>
-          <w:cantSplit w:val="true"/>
-        </w:trPr>
-        <w:tc>
-          <w:tcPr>
-            <w:tcW w:w="1599" w:type="dxa"/>
+              <w:rPr>
+                <w:rFonts w:eastAsia="Latin Modern Roman" w:cs="Latin Modern Roman"/>
+                <w:b w:val="false"/>
+                <w:bCs w:val="false"/>
+                <w:color w:val="BDAB5D"/>
+                <w:sz w:val="18"/>
+                <w:szCs w:val="18"/>
+              </w:rPr>
+              <w:t>Distillation constructor</w:t>
+            </w:r>
+          </w:p>
+        </w:tc>
+        <w:tc>
+          <w:tcPr>
+            <w:tcW w:w="2401" w:type="dxa"/>
             <w:tcBorders>
               <w:top w:val="single" w:sz="2" w:space="0" w:color="AAAAAA"/>
               <w:start w:val="single" w:sz="2" w:space="0" w:color="AAAAAA"/>
@@ -15859,13 +16392,21 @@
               <w:rPr/>
             </w:pPr>
             <w:r>
-              <w:rPr/>
-            </w:r>
-          </w:p>
-        </w:tc>
-        <w:tc>
-          <w:tcPr>
-            <w:tcW w:w="2401" w:type="dxa"/>
+              <w:rPr>
+                <w:rFonts w:eastAsia="Latin Modern Roman" w:cs="Latin Modern Roman"/>
+                <w:b w:val="false"/>
+                <w:bCs w:val="false"/>
+                <w:color w:val="BDAB5D"/>
+                <w:sz w:val="18"/>
+                <w:szCs w:val="18"/>
+              </w:rPr>
+              <w:t>api_client=</w:t>
+            </w:r>
+          </w:p>
+        </w:tc>
+        <w:tc>
+          <w:tcPr>
+            <w:tcW w:w="2800" w:type="dxa"/>
             <w:tcBorders>
               <w:top w:val="single" w:sz="2" w:space="0" w:color="AAAAAA"/>
               <w:start w:val="single" w:sz="2" w:space="0" w:color="AAAAAA"/>
@@ -15884,7 +16425,385 @@
               <w:rPr/>
             </w:pPr>
             <w:r>
-              <w:rPr/>
+              <w:rPr>
+                <w:rFonts w:eastAsia="Latin Modern Roman" w:cs="Latin Modern Roman"/>
+                <w:b w:val="false"/>
+                <w:bCs w:val="false"/>
+                <w:color w:val="BDAB5D"/>
+                <w:sz w:val="18"/>
+                <w:szCs w:val="18"/>
+              </w:rPr>
+              <w:t>box=, cfg=</w:t>
+            </w:r>
+          </w:p>
+        </w:tc>
+        <w:tc>
+          <w:tcPr>
+            <w:tcW w:w="2559" w:type="dxa"/>
+            <w:tcBorders>
+              <w:top w:val="single" w:sz="2" w:space="0" w:color="AAAAAA"/>
+              <w:start w:val="single" w:sz="2" w:space="0" w:color="AAAAAA"/>
+              <w:bottom w:val="single" w:sz="2" w:space="0" w:color="AAAAAA"/>
+              <w:end w:val="single" w:sz="2" w:space="0" w:color="AAAAAA"/>
+            </w:tcBorders>
+            <w:shd w:fill="1A1040" w:val="clear"/>
+          </w:tcPr>
+          <w:p>
+            <w:pPr>
+              <w:pStyle w:val="Normal"/>
+              <w:pBdr>
+                <w:left w:val="single" w:sz="12" w:space="6" w:color="6B4E8A"/>
+                <w:right w:val="single" w:sz="12" w:space="6" w:color="6B4E8A"/>
+              </w:pBdr>
+              <w:rPr/>
+            </w:pPr>
+            <w:r>
+              <w:rPr>
+                <w:rFonts w:eastAsia="Latin Modern Roman" w:cs="Latin Modern Roman"/>
+                <w:b w:val="false"/>
+                <w:bCs w:val="false"/>
+                <w:color w:val="BDAB5D"/>
+                <w:sz w:val="18"/>
+                <w:szCs w:val="18"/>
+              </w:rPr>
+              <w:t>Follows ClaudeBox interface. Permanent.</w:t>
+            </w:r>
+          </w:p>
+        </w:tc>
+      </w:tr>
+      <w:tr>
+        <w:trPr>
+          <w:cantSplit w:val="true"/>
+        </w:trPr>
+        <w:tc>
+          <w:tcPr>
+            <w:tcW w:w="1599" w:type="dxa"/>
+            <w:tcBorders>
+              <w:start w:val="single" w:sz="2" w:space="0" w:color="AAAAAA"/>
+              <w:bottom w:val="single" w:sz="2" w:space="0" w:color="AAAAAA"/>
+              <w:end w:val="single" w:sz="2" w:space="0" w:color="AAAAAA"/>
+            </w:tcBorders>
+            <w:shd w:fill="1A1040" w:val="clear"/>
+          </w:tcPr>
+          <w:p>
+            <w:pPr>
+              <w:pStyle w:val="Normal"/>
+              <w:pBdr>
+                <w:left w:val="single" w:sz="12" w:space="6" w:color="6B4E8A"/>
+                <w:right w:val="single" w:sz="12" w:space="6" w:color="6B4E8A"/>
+              </w:pBdr>
+              <w:rPr/>
+            </w:pPr>
+            <w:r>
+              <w:rPr>
+                <w:rFonts w:eastAsia="Latin Modern Roman" w:cs="Latin Modern Roman"/>
+                <w:b w:val="false"/>
+                <w:bCs w:val="false"/>
+                <w:color w:val="BDAB5D"/>
+                <w:sz w:val="18"/>
+                <w:szCs w:val="18"/>
+              </w:rPr>
+              <w:t>Reflection constructor</w:t>
+            </w:r>
+          </w:p>
+        </w:tc>
+        <w:tc>
+          <w:tcPr>
+            <w:tcW w:w="2401" w:type="dxa"/>
+            <w:tcBorders>
+              <w:start w:val="single" w:sz="2" w:space="0" w:color="AAAAAA"/>
+              <w:bottom w:val="single" w:sz="2" w:space="0" w:color="AAAAAA"/>
+              <w:end w:val="single" w:sz="2" w:space="0" w:color="AAAAAA"/>
+            </w:tcBorders>
+            <w:shd w:fill="1A1040" w:val="clear"/>
+          </w:tcPr>
+          <w:p>
+            <w:pPr>
+              <w:pStyle w:val="Normal"/>
+              <w:pBdr>
+                <w:left w:val="single" w:sz="12" w:space="6" w:color="6B4E8A"/>
+                <w:right w:val="single" w:sz="12" w:space="6" w:color="6B4E8A"/>
+              </w:pBdr>
+              <w:rPr/>
+            </w:pPr>
+            <w:r>
+              <w:rPr>
+                <w:rFonts w:eastAsia="Latin Modern Roman" w:cs="Latin Modern Roman"/>
+                <w:b w:val="false"/>
+                <w:bCs w:val="false"/>
+                <w:color w:val="BDAB5D"/>
+                <w:sz w:val="18"/>
+                <w:szCs w:val="18"/>
+              </w:rPr>
+              <w:t>client=</w:t>
+            </w:r>
+          </w:p>
+        </w:tc>
+        <w:tc>
+          <w:tcPr>
+            <w:tcW w:w="2800" w:type="dxa"/>
+            <w:tcBorders>
+              <w:start w:val="single" w:sz="2" w:space="0" w:color="AAAAAA"/>
+              <w:bottom w:val="single" w:sz="2" w:space="0" w:color="AAAAAA"/>
+              <w:end w:val="single" w:sz="2" w:space="0" w:color="AAAAAA"/>
+            </w:tcBorders>
+            <w:shd w:fill="1A1040" w:val="clear"/>
+          </w:tcPr>
+          <w:p>
+            <w:pPr>
+              <w:pStyle w:val="Normal"/>
+              <w:pBdr>
+                <w:left w:val="single" w:sz="12" w:space="6" w:color="6B4E8A"/>
+                <w:right w:val="single" w:sz="12" w:space="6" w:color="6B4E8A"/>
+              </w:pBdr>
+              <w:rPr/>
+            </w:pPr>
+            <w:r>
+              <w:rPr>
+                <w:rFonts w:eastAsia="Latin Modern Roman" w:cs="Latin Modern Roman"/>
+                <w:b w:val="false"/>
+                <w:bCs w:val="false"/>
+                <w:color w:val="BDAB5D"/>
+                <w:sz w:val="18"/>
+                <w:szCs w:val="18"/>
+              </w:rPr>
+              <w:t>box=</w:t>
+            </w:r>
+          </w:p>
+        </w:tc>
+        <w:tc>
+          <w:tcPr>
+            <w:tcW w:w="2559" w:type="dxa"/>
+            <w:tcBorders>
+              <w:start w:val="single" w:sz="2" w:space="0" w:color="AAAAAA"/>
+              <w:bottom w:val="single" w:sz="2" w:space="0" w:color="AAAAAA"/>
+              <w:end w:val="single" w:sz="2" w:space="0" w:color="AAAAAA"/>
+            </w:tcBorders>
+            <w:shd w:fill="1A1040" w:val="clear"/>
+          </w:tcPr>
+          <w:p>
+            <w:pPr>
+              <w:pStyle w:val="Normal"/>
+              <w:pBdr>
+                <w:left w:val="single" w:sz="12" w:space="6" w:color="6B4E8A"/>
+                <w:right w:val="single" w:sz="12" w:space="6" w:color="6B4E8A"/>
+              </w:pBdr>
+              <w:rPr/>
+            </w:pPr>
+            <w:r>
+              <w:rPr>
+                <w:rFonts w:eastAsia="Latin Modern Roman" w:cs="Latin Modern Roman"/>
+                <w:b w:val="false"/>
+                <w:bCs w:val="false"/>
+                <w:color w:val="BDAB5D"/>
+                <w:sz w:val="18"/>
+                <w:szCs w:val="18"/>
+              </w:rPr>
+              <w:t>Follows ClaudeBox interface. Permanent.</w:t>
+            </w:r>
+          </w:p>
+        </w:tc>
+      </w:tr>
+      <w:tr>
+        <w:trPr>
+          <w:cantSplit w:val="true"/>
+        </w:trPr>
+        <w:tc>
+          <w:tcPr>
+            <w:tcW w:w="1599" w:type="dxa"/>
+            <w:tcBorders>
+              <w:start w:val="single" w:sz="2" w:space="0" w:color="AAAAAA"/>
+              <w:bottom w:val="single" w:sz="2" w:space="0" w:color="AAAAAA"/>
+              <w:end w:val="single" w:sz="2" w:space="0" w:color="AAAAAA"/>
+            </w:tcBorders>
+            <w:shd w:fill="1A1040" w:val="clear"/>
+          </w:tcPr>
+          <w:p>
+            <w:pPr>
+              <w:pStyle w:val="Normal"/>
+              <w:pBdr>
+                <w:left w:val="single" w:sz="12" w:space="6" w:color="6B4E8A"/>
+                <w:right w:val="single" w:sz="12" w:space="6" w:color="6B4E8A"/>
+              </w:pBdr>
+              <w:rPr/>
+            </w:pPr>
+            <w:r>
+              <w:rPr>
+                <w:rFonts w:eastAsia="Latin Modern Roman" w:cs="Latin Modern Roman"/>
+                <w:b w:val="false"/>
+                <w:bCs w:val="false"/>
+                <w:color w:val="BDAB5D"/>
+                <w:sz w:val="18"/>
+                <w:szCs w:val="18"/>
+              </w:rPr>
+              <w:t>config model keys</w:t>
+            </w:r>
+          </w:p>
+        </w:tc>
+        <w:tc>
+          <w:tcPr>
+            <w:tcW w:w="2401" w:type="dxa"/>
+            <w:tcBorders>
+              <w:start w:val="single" w:sz="2" w:space="0" w:color="AAAAAA"/>
+              <w:bottom w:val="single" w:sz="2" w:space="0" w:color="AAAAAA"/>
+              <w:end w:val="single" w:sz="2" w:space="0" w:color="AAAAAA"/>
+            </w:tcBorders>
+            <w:shd w:fill="1A1040" w:val="clear"/>
+          </w:tcPr>
+          <w:p>
+            <w:pPr>
+              <w:pStyle w:val="Normal"/>
+              <w:pBdr>
+                <w:left w:val="single" w:sz="12" w:space="6" w:color="6B4E8A"/>
+                <w:right w:val="single" w:sz="12" w:space="6" w:color="6B4E8A"/>
+              </w:pBdr>
+              <w:rPr/>
+            </w:pPr>
+            <w:r>
+              <w:rPr>
+                <w:rFonts w:eastAsia="Latin Modern Roman" w:cs="Latin Modern Roman"/>
+                <w:b w:val="false"/>
+                <w:bCs w:val="false"/>
+                <w:color w:val="BDAB5D"/>
+                <w:sz w:val="18"/>
+                <w:szCs w:val="18"/>
+              </w:rPr>
+              <w:t>gpt-5 series</w:t>
+            </w:r>
+          </w:p>
+        </w:tc>
+        <w:tc>
+          <w:tcPr>
+            <w:tcW w:w="2800" w:type="dxa"/>
+            <w:tcBorders>
+              <w:start w:val="single" w:sz="2" w:space="0" w:color="AAAAAA"/>
+              <w:bottom w:val="single" w:sz="2" w:space="0" w:color="AAAAAA"/>
+              <w:end w:val="single" w:sz="2" w:space="0" w:color="AAAAAA"/>
+            </w:tcBorders>
+            <w:shd w:fill="1A1040" w:val="clear"/>
+          </w:tcPr>
+          <w:p>
+            <w:pPr>
+              <w:pStyle w:val="Normal"/>
+              <w:pBdr>
+                <w:left w:val="single" w:sz="12" w:space="6" w:color="6B4E8A"/>
+                <w:right w:val="single" w:sz="12" w:space="6" w:color="6B4E8A"/>
+              </w:pBdr>
+              <w:rPr/>
+            </w:pPr>
+            <w:r>
+              <w:rPr>
+                <w:rFonts w:eastAsia="Latin Modern Roman" w:cs="Latin Modern Roman"/>
+                <w:b w:val="false"/>
+                <w:bCs w:val="false"/>
+                <w:color w:val="BDAB5D"/>
+                <w:sz w:val="18"/>
+                <w:szCs w:val="18"/>
+              </w:rPr>
+              <w:t>claude-* series</w:t>
+            </w:r>
+          </w:p>
+        </w:tc>
+        <w:tc>
+          <w:tcPr>
+            <w:tcW w:w="2559" w:type="dxa"/>
+            <w:tcBorders>
+              <w:start w:val="single" w:sz="2" w:space="0" w:color="AAAAAA"/>
+              <w:bottom w:val="single" w:sz="2" w:space="0" w:color="AAAAAA"/>
+              <w:end w:val="single" w:sz="2" w:space="0" w:color="AAAAAA"/>
+            </w:tcBorders>
+            <w:shd w:fill="1A1040" w:val="clear"/>
+          </w:tcPr>
+          <w:p>
+            <w:pPr>
+              <w:pStyle w:val="Normal"/>
+              <w:pBdr>
+                <w:left w:val="single" w:sz="12" w:space="6" w:color="6B4E8A"/>
+                <w:right w:val="single" w:sz="12" w:space="6" w:color="6B4E8A"/>
+              </w:pBdr>
+              <w:rPr/>
+            </w:pPr>
+            <w:r>
+              <w:rPr>
+                <w:rFonts w:eastAsia="Latin Modern Roman" w:cs="Latin Modern Roman"/>
+                <w:b w:val="false"/>
+                <w:bCs w:val="false"/>
+                <w:color w:val="BDAB5D"/>
+                <w:sz w:val="18"/>
+                <w:szCs w:val="18"/>
+              </w:rPr>
+              <w:t>API migration. Permanent.</w:t>
+            </w:r>
+          </w:p>
+        </w:tc>
+      </w:tr>
+      <w:tr>
+        <w:trPr>
+          <w:cantSplit w:val="true"/>
+        </w:trPr>
+        <w:tc>
+          <w:tcPr>
+            <w:tcW w:w="1599" w:type="dxa"/>
+            <w:tcBorders>
+              <w:top w:val="single" w:sz="2" w:space="0" w:color="AAAAAA"/>
+              <w:start w:val="single" w:sz="2" w:space="0" w:color="AAAAAA"/>
+              <w:bottom w:val="single" w:sz="2" w:space="0" w:color="AAAAAA"/>
+              <w:end w:val="single" w:sz="2" w:space="0" w:color="AAAAAA"/>
+            </w:tcBorders>
+            <w:shd w:fill="1A1040" w:val="clear"/>
+          </w:tcPr>
+          <w:p>
+            <w:pPr>
+              <w:pStyle w:val="Normal"/>
+              <w:pBdr>
+                <w:left w:val="single" w:sz="12" w:space="6" w:color="6B4E8A"/>
+                <w:right w:val="single" w:sz="12" w:space="6" w:color="6B4E8A"/>
+              </w:pBdr>
+              <w:rPr/>
+            </w:pPr>
+            <w:r>
+              <w:rPr>
+                <w:rFonts w:eastAsia="Latin Modern Roman" w:cs="Latin Modern Roman"/>
+                <w:b w:val="false"/>
+                <w:bCs w:val="false"/>
+                <w:color w:val="BDAB5D"/>
+                <w:sz w:val="18"/>
+                <w:szCs w:val="18"/>
+              </w:rPr>
+              <w:t>council.get_active()</w:t>
+            </w:r>
+          </w:p>
+        </w:tc>
+        <w:tc>
+          <w:tcPr>
+            <w:tcW w:w="2401" w:type="dxa"/>
+            <w:tcBorders>
+              <w:top w:val="single" w:sz="2" w:space="0" w:color="AAAAAA"/>
+              <w:start w:val="single" w:sz="2" w:space="0" w:color="AAAAAA"/>
+              <w:bottom w:val="single" w:sz="2" w:space="0" w:color="AAAAAA"/>
+              <w:end w:val="single" w:sz="2" w:space="0" w:color="AAAAAA"/>
+            </w:tcBorders>
+            <w:shd w:fill="1A1040" w:val="clear"/>
+          </w:tcPr>
+          <w:p>
+            <w:pPr>
+              <w:pStyle w:val="Normal"/>
+              <w:pBdr>
+                <w:left w:val="single" w:sz="12" w:space="6" w:color="6B4E8A"/>
+                <w:right w:val="single" w:sz="12" w:space="6" w:color="6B4E8A"/>
+              </w:pBdr>
+              <w:rPr/>
+            </w:pPr>
+            <w:r>
+              <w:rPr>
+                <w:rFonts w:eastAsia="Latin Modern Roman" w:cs="Latin Modern Roman"/>
+                <w:b w:val="false"/>
+                <w:bCs w:val="false"/>
+                <w:color w:val="BDAB5D"/>
+                <w:sz w:val="18"/>
+                <w:szCs w:val="18"/>
+              </w:rPr>
+              <w:t>Spec implied method call</w:t>
             </w:r>
           </w:p>
         </w:tc>
@@ -15910,7 +16829,15 @@
               <w:rPr/>
             </w:pPr>
             <w:r>
-              <w:rPr/>
+              <w:rPr>
+                <w:rFonts w:eastAsia="Latin Modern Roman" w:cs="Latin Modern Roman"/>
+                <w:b w:val="false"/>
+                <w:bCs w:val="false"/>
+                <w:color w:val="BDAB5D"/>
+                <w:sz w:val="18"/>
+                <w:szCs w:val="18"/>
+              </w:rPr>
+              <w:t>council.active property</w:t>
             </w:r>
           </w:p>
         </w:tc>
@@ -15931,7 +16858,15 @@
               <w:rPr/>
             </w:pPr>
             <w:r>
-              <w:rPr/>
+              <w:rPr>
+                <w:rFonts w:eastAsia="Latin Modern Roman" w:cs="Latin Modern Roman"/>
+                <w:b w:val="false"/>
+                <w:bCs w:val="false"/>
+                <w:color w:val="BDAB5D"/>
+                <w:sz w:val="18"/>
+                <w:szCs w:val="18"/>
+              </w:rPr>
+              <w:t>Implementation choice. Permanent.</w:t>
             </w:r>
           </w:p>
         </w:tc>
@@ -16059,11 +16994,24 @@
           </w:tcPr>
           <w:p>
             <w:pPr>
-              <w:pStyle w:val="Normal"/>
-              <w:rPr/>
-            </w:pPr>
-            <w:r>
-              <w:rPr/>
+              <w:pStyle w:val="ListParagraph"/>
+              <w:numPr>
+                <w:ilvl w:val="0"/>
+                <w:numId w:val="3"/>
+              </w:numPr>
+              <w:spacing w:before="40" w:after="40"/>
+              <w:rPr/>
+            </w:pPr>
+            <w:r>
+              <w:rPr>
+                <w:rFonts w:eastAsia="Latin Modern Roman" w:cs="Latin Modern Roman"/>
+                <w:b w:val="false"/>
+                <w:bCs w:val="false"/>
+                <w:color w:val="BDAB5D"/>
+                <w:sz w:val="20"/>
+                <w:szCs w:val="20"/>
+              </w:rPr>
+              <w:t>OpenAI Responses API reasoning token exhaustion blocked builds — migrated to Claude mid-phase</w:t>
             </w:r>
           </w:p>
         </w:tc>
@@ -16083,11 +17031,24 @@
           </w:tcPr>
           <w:p>
             <w:pPr>
-              <w:pStyle w:val="Normal"/>
-              <w:rPr/>
-            </w:pPr>
-            <w:r>
-              <w:rPr/>
+              <w:pStyle w:val="ListParagraph"/>
+              <w:numPr>
+                <w:ilvl w:val="0"/>
+                <w:numId w:val="3"/>
+              </w:numPr>
+              <w:spacing w:before="40" w:after="40"/>
+              <w:rPr/>
+            </w:pPr>
+            <w:r>
+              <w:rPr>
+                <w:rFonts w:eastAsia="Latin Modern Roman" w:cs="Latin Modern Roman"/>
+                <w:b w:val="false"/>
+                <w:bCs w:val="false"/>
+                <w:color w:val="BDAB5D"/>
+                <w:sz w:val="20"/>
+                <w:szCs w:val="20"/>
+              </w:rPr>
+              <w:t>ClaudeBox setup in flat directory (not a package install) — import path required careful handling</w:t>
             </w:r>
           </w:p>
         </w:tc>
@@ -16107,11 +17068,24 @@
           </w:tcPr>
           <w:p>
             <w:pPr>
-              <w:pStyle w:val="Normal"/>
-              <w:rPr/>
-            </w:pPr>
-            <w:r>
-              <w:rPr/>
+              <w:pStyle w:val="ListParagraph"/>
+              <w:numPr>
+                <w:ilvl w:val="0"/>
+                <w:numId w:val="3"/>
+              </w:numPr>
+              <w:spacing w:before="40" w:after="40"/>
+              <w:rPr/>
+            </w:pPr>
+            <w:r>
+              <w:rPr>
+                <w:rFonts w:eastAsia="Latin Modern Roman" w:cs="Latin Modern Roman"/>
+                <w:b w:val="false"/>
+                <w:bCs w:val="false"/>
+                <w:color w:val="BDAB5D"/>
+                <w:sz w:val="20"/>
+                <w:szCs w:val="20"/>
+              </w:rPr>
+              <w:t>self.conversations dropped from app.__init__ during migration rewrite — caused AttributeError on boot</w:t>
             </w:r>
           </w:p>
         </w:tc>
@@ -16131,11 +17105,24 @@
           </w:tcPr>
           <w:p>
             <w:pPr>
-              <w:pStyle w:val="Normal"/>
-              <w:rPr/>
-            </w:pPr>
-            <w:r>
-              <w:rPr/>
+              <w:pStyle w:val="ListParagraph"/>
+              <w:numPr>
+                <w:ilvl w:val="0"/>
+                <w:numId w:val="3"/>
+              </w:numPr>
+              <w:spacing w:before="40" w:after="40"/>
+              <w:rPr/>
+            </w:pPr>
+            <w:r>
+              <w:rPr>
+                <w:rFonts w:eastAsia="Latin Modern Roman" w:cs="Latin Modern Roman"/>
+                <w:b w:val="false"/>
+                <w:bCs w:val="false"/>
+                <w:color w:val="BDAB5D"/>
+                <w:sz w:val="20"/>
+                <w:szCs w:val="20"/>
+              </w:rPr>
+              <w:t>sentence-transformers pulled in torch 2.10.0 + full CUDA stack — large install but functional</w:t>
             </w:r>
           </w:p>
         </w:tc>
@@ -16155,11 +17142,61 @@
           </w:tcPr>
           <w:p>
             <w:pPr>
-              <w:pStyle w:val="Normal"/>
-              <w:rPr/>
-            </w:pPr>
-            <w:r>
-              <w:rPr/>
+              <w:pStyle w:val="ListParagraph"/>
+              <w:numPr>
+                <w:ilvl w:val="0"/>
+                <w:numId w:val="3"/>
+              </w:numPr>
+              <w:spacing w:before="40" w:after="40"/>
+              <w:rPr/>
+            </w:pPr>
+            <w:r>
+              <w:rPr>
+                <w:rFonts w:eastAsia="Latin Modern Roman" w:cs="Latin Modern Roman"/>
+                <w:b w:val="false"/>
+                <w:bCs w:val="false"/>
+                <w:color w:val="BDAB5D"/>
+                <w:sz w:val="20"/>
+                <w:szCs w:val="20"/>
+              </w:rPr>
+              <w:t>Test files still had old client= / api_client= kwarg signatures after migration — required update pass</w:t>
+            </w:r>
+          </w:p>
+        </w:tc>
+      </w:tr>
+      <w:tr>
+        <w:trPr>
+          <w:cantSplit w:val="true"/>
+        </w:trPr>
+        <w:tc>
+          <w:tcPr>
+            <w:tcW w:w="9360" w:type="dxa"/>
+            <w:tcBorders>
+              <w:start w:val="single" w:sz="2" w:space="0" w:color="AAAAAA"/>
+              <w:bottom w:val="single" w:sz="2" w:space="0" w:color="AAAAAA"/>
+              <w:end w:val="single" w:sz="2" w:space="0" w:color="AAAAAA"/>
+            </w:tcBorders>
+          </w:tcPr>
+          <w:p>
+            <w:pPr>
+              <w:pStyle w:val="ListParagraph"/>
+              <w:numPr>
+                <w:ilvl w:val="0"/>
+                <w:numId w:val="3"/>
+              </w:numPr>
+              <w:spacing w:before="40" w:after="40"/>
+              <w:rPr/>
+            </w:pPr>
+            <w:r>
+              <w:rPr>
+                <w:rFonts w:eastAsia="Latin Modern Roman" w:cs="Latin Modern Roman"/>
+                <w:b w:val="false"/>
+                <w:bCs w:val="false"/>
+                <w:color w:val="BDAB5D"/>
+                <w:sz w:val="20"/>
+                <w:szCs w:val="20"/>
+              </w:rPr>
+              <w:t>Stray files os and sys accidentally committed to project root — need removal</w:t>
             </w:r>
           </w:p>
         </w:tc>
@@ -16256,7 +17293,15 @@
               <w:rPr/>
             </w:pPr>
             <w:r>
-              <w:rPr/>
+              <w:rPr>
+                <w:rFonts w:eastAsia="Latin Modern Roman" w:cs="Latin Modern Roman"/>
+                <w:b w:val="false"/>
+                <w:bCs w:val="false"/>
+                <w:color w:val="BDAB5D"/>
+                <w:sz w:val="18"/>
+                <w:szCs w:val="18"/>
+              </w:rPr>
+              <w:t>08 March 2026</w:t>
             </w:r>
           </w:p>
         </w:tc>
@@ -16335,7 +17380,15 @@
               <w:rPr/>
             </w:pPr>
             <w:r>
-              <w:rPr/>
+              <w:rPr>
+                <w:rFonts w:eastAsia="Latin Modern Roman" w:cs="Latin Modern Roman"/>
+                <w:b w:val="false"/>
+                <w:bCs w:val="false"/>
+                <w:color w:val="BDAB5D"/>
+                <w:sz w:val="18"/>
+                <w:szCs w:val="18"/>
+              </w:rPr>
+              <w:t>97/97</w:t>
             </w:r>
           </w:p>
         </w:tc>
@@ -16411,10 +17464,282 @@
           <w:p>
             <w:pPr>
               <w:pStyle w:val="Normal"/>
-              <w:rPr/>
-            </w:pPr>
-            <w:r>
-              <w:rPr/>
+              <w:rPr>
+                <w:rFonts w:ascii="monospace" w:hAnsi="monospace" w:eastAsia="Latin Modern Roman" w:cs="Latin Modern Roman"/>
+                <w:b w:val="false"/>
+                <w:bCs w:val="false"/>
+                <w:color w:val="BDAB5D"/>
+                <w:sz w:val="18"/>
+                <w:szCs w:val="18"/>
+              </w:rPr>
+            </w:pPr>
+            <w:r>
+              <w:rPr>
+                <w:rFonts w:eastAsia="Latin Modern Roman" w:cs="Latin Modern Roman" w:ascii="monospace" w:hAnsi="monospace"/>
+                <w:b w:val="false"/>
+                <w:bCs w:val="false"/>
+                <w:color w:val="B26818"/>
+                <w:sz w:val="18"/>
+                <w:szCs w:val="18"/>
+                <w:shd w:fill="FFFFFF" w:val="clear"/>
+              </w:rPr>
+              <w:t>203ab79 (</w:t>
+            </w:r>
+            <w:r>
+              <w:rPr>
+                <w:rFonts w:eastAsia="Latin Modern Roman" w:cs="Latin Modern Roman" w:ascii="monospace" w:hAnsi="monospace"/>
+                <w:b/>
+                <w:bCs w:val="false"/>
+                <w:color w:val="54FFFF"/>
+                <w:sz w:val="18"/>
+                <w:szCs w:val="18"/>
+                <w:shd w:fill="FFFFFF" w:val="clear"/>
+              </w:rPr>
+              <w:t>HEAD</w:t>
+            </w:r>
+            <w:r>
+              <w:rPr>
+                <w:rFonts w:eastAsia="Latin Modern Roman" w:cs="Latin Modern Roman" w:ascii="monospace" w:hAnsi="monospace"/>
+                <w:b w:val="false"/>
+                <w:bCs w:val="false"/>
+                <w:color w:val="B26818"/>
+                <w:sz w:val="18"/>
+                <w:szCs w:val="18"/>
+                <w:shd w:fill="FFFFFF" w:val="clear"/>
+              </w:rPr>
+              <w:t xml:space="preserve"> -&gt; </w:t>
+            </w:r>
+            <w:r>
+              <w:rPr>
+                <w:rFonts w:eastAsia="Latin Modern Roman" w:cs="Latin Modern Roman" w:ascii="monospace" w:hAnsi="monospace"/>
+                <w:b/>
+                <w:bCs w:val="false"/>
+                <w:color w:val="54FF54"/>
+                <w:sz w:val="18"/>
+                <w:szCs w:val="18"/>
+                <w:shd w:fill="FFFFFF" w:val="clear"/>
+              </w:rPr>
+              <w:t>migrate-claude-api</w:t>
+            </w:r>
+            <w:r>
+              <w:rPr>
+                <w:rFonts w:eastAsia="Latin Modern Roman" w:cs="Latin Modern Roman" w:ascii="monospace" w:hAnsi="monospace"/>
+                <w:b w:val="false"/>
+                <w:bCs w:val="false"/>
+                <w:color w:val="B26818"/>
+                <w:sz w:val="18"/>
+                <w:szCs w:val="18"/>
+                <w:shd w:fill="FFFFFF" w:val="clear"/>
+              </w:rPr>
+              <w:t>)</w:t>
+            </w:r>
+            <w:r>
+              <w:rPr>
+                <w:rFonts w:eastAsia="Latin Modern Roman" w:cs="Latin Modern Roman" w:ascii="monospace" w:hAnsi="monospace"/>
+                <w:b w:val="false"/>
+                <w:bCs w:val="false"/>
+                <w:color w:val="000000"/>
+                <w:sz w:val="18"/>
+                <w:szCs w:val="18"/>
+                <w:shd w:fill="FFFFFF" w:val="clear"/>
+              </w:rPr>
+              <w:t xml:space="preserve"> Migrate: update tests for Claude API — remove client/api_client kwargs </w:t>
+            </w:r>
+            <w:r>
+              <w:rPr>
+                <w:rFonts w:eastAsia="Latin Modern Roman" w:cs="Latin Modern Roman" w:ascii="monospace" w:hAnsi="monospace"/>
+                <w:b w:val="false"/>
+                <w:bCs w:val="false"/>
+                <w:color w:val="B26818"/>
+                <w:sz w:val="18"/>
+                <w:szCs w:val="18"/>
+                <w:shd w:fill="FFFFFF" w:val="clear"/>
+              </w:rPr>
+              <w:br/>
+              <w:t>42279be</w:t>
+            </w:r>
+            <w:r>
+              <w:rPr>
+                <w:rFonts w:eastAsia="Latin Modern Roman" w:cs="Latin Modern Roman" w:ascii="monospace" w:hAnsi="monospace"/>
+                <w:b w:val="false"/>
+                <w:bCs w:val="false"/>
+                <w:color w:val="000000"/>
+                <w:sz w:val="18"/>
+                <w:szCs w:val="18"/>
+                <w:shd w:fill="FFFFFF" w:val="clear"/>
+              </w:rPr>
+              <w:t xml:space="preserve"> Migrate: OpenAI → Claude via ClaudeBox — router, chronicle, distillation, reflection </w:t>
+            </w:r>
+            <w:r>
+              <w:rPr>
+                <w:rFonts w:eastAsia="Latin Modern Roman" w:cs="Latin Modern Roman" w:ascii="monospace" w:hAnsi="monospace"/>
+                <w:b w:val="false"/>
+                <w:bCs w:val="false"/>
+                <w:color w:val="B26818"/>
+                <w:sz w:val="18"/>
+                <w:szCs w:val="18"/>
+                <w:shd w:fill="FFFFFF" w:val="clear"/>
+              </w:rPr>
+              <w:br/>
+              <w:t>049d67b (</w:t>
+            </w:r>
+            <w:r>
+              <w:rPr>
+                <w:rFonts w:eastAsia="Latin Modern Roman" w:cs="Latin Modern Roman" w:ascii="monospace" w:hAnsi="monospace"/>
+                <w:b/>
+                <w:bCs w:val="false"/>
+                <w:color w:val="54FF54"/>
+                <w:sz w:val="18"/>
+                <w:szCs w:val="18"/>
+                <w:shd w:fill="FFFFFF" w:val="clear"/>
+              </w:rPr>
+              <w:t>phase-6-entity-foundation</w:t>
+            </w:r>
+            <w:r>
+              <w:rPr>
+                <w:rFonts w:eastAsia="Latin Modern Roman" w:cs="Latin Modern Roman" w:ascii="monospace" w:hAnsi="monospace"/>
+                <w:b w:val="false"/>
+                <w:bCs w:val="false"/>
+                <w:color w:val="B26818"/>
+                <w:sz w:val="18"/>
+                <w:szCs w:val="18"/>
+                <w:shd w:fill="FFFFFF" w:val="clear"/>
+              </w:rPr>
+              <w:t>)</w:t>
+            </w:r>
+            <w:r>
+              <w:rPr>
+                <w:rFonts w:eastAsia="Latin Modern Roman" w:cs="Latin Modern Roman" w:ascii="monospace" w:hAnsi="monospace"/>
+                <w:b w:val="false"/>
+                <w:bCs w:val="false"/>
+                <w:color w:val="000000"/>
+                <w:sz w:val="18"/>
+                <w:szCs w:val="18"/>
+                <w:shd w:fill="FFFFFF" w:val="clear"/>
+              </w:rPr>
+              <w:t xml:space="preserve"> Phase 6 complete: Entity Foundation — compiler, Council, Luminarious anchor, Assessor </w:t>
+            </w:r>
+            <w:r>
+              <w:rPr>
+                <w:rFonts w:eastAsia="Latin Modern Roman" w:cs="Latin Modern Roman" w:ascii="monospace" w:hAnsi="monospace"/>
+                <w:b w:val="false"/>
+                <w:bCs w:val="false"/>
+                <w:color w:val="B26818"/>
+                <w:sz w:val="18"/>
+                <w:szCs w:val="18"/>
+                <w:shd w:fill="FFFFFF" w:val="clear"/>
+              </w:rPr>
+              <w:br/>
+              <w:t>325aaf8 (</w:t>
+            </w:r>
+            <w:r>
+              <w:rPr>
+                <w:rFonts w:eastAsia="Latin Modern Roman" w:cs="Latin Modern Roman" w:ascii="monospace" w:hAnsi="monospace"/>
+                <w:b/>
+                <w:bCs w:val="false"/>
+                <w:color w:val="54FF54"/>
+                <w:sz w:val="18"/>
+                <w:szCs w:val="18"/>
+                <w:shd w:fill="FFFFFF" w:val="clear"/>
+              </w:rPr>
+              <w:t>phase-5-distillation</w:t>
+            </w:r>
+            <w:r>
+              <w:rPr>
+                <w:rFonts w:eastAsia="Latin Modern Roman" w:cs="Latin Modern Roman" w:ascii="monospace" w:hAnsi="monospace"/>
+                <w:b w:val="false"/>
+                <w:bCs w:val="false"/>
+                <w:color w:val="B26818"/>
+                <w:sz w:val="18"/>
+                <w:szCs w:val="18"/>
+                <w:shd w:fill="FFFFFF" w:val="clear"/>
+              </w:rPr>
+              <w:t>)</w:t>
+            </w:r>
+            <w:r>
+              <w:rPr>
+                <w:rFonts w:eastAsia="Latin Modern Roman" w:cs="Latin Modern Roman" w:ascii="monospace" w:hAnsi="monospace"/>
+                <w:b w:val="false"/>
+                <w:bCs w:val="false"/>
+                <w:color w:val="000000"/>
+                <w:sz w:val="18"/>
+                <w:szCs w:val="18"/>
+                <w:shd w:fill="FFFFFF" w:val="clear"/>
+              </w:rPr>
+              <w:t xml:space="preserve"> Phase 5 complete: Smarter Distillation — fat/muscle classifier, Chronicle extraction, Reflection signals </w:t>
+            </w:r>
+            <w:r>
+              <w:rPr>
+                <w:rFonts w:eastAsia="Latin Modern Roman" w:cs="Latin Modern Roman" w:ascii="monospace" w:hAnsi="monospace"/>
+                <w:b w:val="false"/>
+                <w:bCs w:val="false"/>
+                <w:color w:val="B26818"/>
+                <w:sz w:val="18"/>
+                <w:szCs w:val="18"/>
+                <w:shd w:fill="FFFFFF" w:val="clear"/>
+              </w:rPr>
+              <w:br/>
+              <w:t>6854a6e (</w:t>
+            </w:r>
+            <w:r>
+              <w:rPr>
+                <w:rFonts w:eastAsia="Latin Modern Roman" w:cs="Latin Modern Roman" w:ascii="monospace" w:hAnsi="monospace"/>
+                <w:b/>
+                <w:bCs w:val="false"/>
+                <w:color w:val="54FF54"/>
+                <w:sz w:val="18"/>
+                <w:szCs w:val="18"/>
+                <w:shd w:fill="FFFFFF" w:val="clear"/>
+              </w:rPr>
+              <w:t>phase-3-grimoire</w:t>
+            </w:r>
+            <w:r>
+              <w:rPr>
+                <w:rFonts w:eastAsia="Latin Modern Roman" w:cs="Latin Modern Roman" w:ascii="monospace" w:hAnsi="monospace"/>
+                <w:b w:val="false"/>
+                <w:bCs w:val="false"/>
+                <w:color w:val="B26818"/>
+                <w:sz w:val="18"/>
+                <w:szCs w:val="18"/>
+                <w:shd w:fill="FFFFFF" w:val="clear"/>
+              </w:rPr>
+              <w:t>)</w:t>
+            </w:r>
+            <w:r>
+              <w:rPr>
+                <w:rFonts w:eastAsia="Latin Modern Roman" w:cs="Latin Modern Roman" w:ascii="monospace" w:hAnsi="monospace"/>
+                <w:b w:val="false"/>
+                <w:bCs w:val="false"/>
+                <w:color w:val="000000"/>
+                <w:sz w:val="18"/>
+                <w:szCs w:val="18"/>
+                <w:shd w:fill="FFFFFF" w:val="clear"/>
+              </w:rPr>
+              <w:t xml:space="preserve"> Phase 3 complete: Grimoire — persistent memory layer, injection, commands, management page</w:t>
+            </w:r>
+            <w:r>
+              <w:rPr>
+                <w:rFonts w:eastAsia="Latin Modern Roman" w:cs="Latin Modern Roman" w:ascii="monospace" w:hAnsi="monospace"/>
+                <w:b w:val="false"/>
+                <w:bCs w:val="false"/>
+                <w:color w:val="B26818"/>
+                <w:sz w:val="18"/>
+                <w:szCs w:val="18"/>
+                <w:shd w:fill="FFFFFF" w:val="clear"/>
+              </w:rPr>
+              <w:br/>
+              <w:br/>
+            </w:r>
+            <w:r>
+              <w:rPr>
+                <w:rFonts w:eastAsia="Latin Modern Roman" w:cs="Latin Modern Roman" w:ascii="monospace" w:hAnsi="monospace"/>
+                <w:b w:val="false"/>
+                <w:bCs w:val="false"/>
+                <w:color w:val="BDAB5D"/>
+                <w:sz w:val="18"/>
+                <w:szCs w:val="18"/>
+              </w:rPr>
+              <w:br/>
             </w:r>
           </w:p>
         </w:tc>
@@ -16745,7 +18070,15 @@
               <w:rPr/>
             </w:pPr>
             <w:r>
-              <w:rPr/>
+              <w:rPr>
+                <w:rFonts w:eastAsia="Latin Modern Roman" w:cs="Latin Modern Roman"/>
+                <w:b w:val="false"/>
+                <w:bCs w:val="false"/>
+                <w:color w:val="BDAB5D"/>
+                <w:sz w:val="18"/>
+                <w:szCs w:val="18"/>
+              </w:rPr>
+              <w:t>08 March 2026</w:t>
             </w:r>
           </w:p>
         </w:tc>
@@ -16903,7 +18236,15 @@
               <w:rPr/>
             </w:pPr>
             <w:r>
-              <w:rPr/>
+              <w:rPr>
+                <w:rFonts w:eastAsia="Latin Modern Roman" w:cs="Latin Modern Roman"/>
+                <w:b w:val="false"/>
+                <w:bCs w:val="false"/>
+                <w:color w:val="BDAB5D"/>
+                <w:sz w:val="18"/>
+                <w:szCs w:val="18"/>
+              </w:rPr>
+              <w:t>NA</w:t>
             </w:r>
           </w:p>
         </w:tc>
@@ -24978,7 +26319,7 @@
     </w:r>
     <w:r>
       <w:rPr/>
-      <w:t>21</w:t>
+      <w:t>35</w:t>
     </w:r>
     <w:r>
       <w:rPr/>
@@ -25022,7 +26363,7 @@
     </w:r>
     <w:r>
       <w:rPr/>
-      <w:t>21</w:t>
+      <w:t>35</w:t>
     </w:r>
     <w:r>
       <w:rPr/>
@@ -25099,6 +26440,125 @@
   <w:abstractNum w:abstractNumId="1">
     <w:lvl w:ilvl="0">
       <w:start w:val="1"/>
+      <w:numFmt w:val="none"/>
+      <w:suff w:val="nothing"/>
+      <w:lvlText w:val=""/>
+      <w:lvlJc w:val="start"/>
+      <w:pPr>
+        <w:tabs>
+          <w:tab w:val="num" w:pos="0"/>
+        </w:tabs>
+        <w:ind w:start="0" w:hanging="0"/>
+      </w:pPr>
+    </w:lvl>
+    <w:lvl w:ilvl="1">
+      <w:start w:val="1"/>
+      <w:numFmt w:val="none"/>
+      <w:suff w:val="nothing"/>
+      <w:lvlText w:val=""/>
+      <w:lvlJc w:val="start"/>
+      <w:pPr>
+        <w:tabs>
+          <w:tab w:val="num" w:pos="0"/>
+        </w:tabs>
+        <w:ind w:start="0" w:hanging="0"/>
+      </w:pPr>
+    </w:lvl>
+    <w:lvl w:ilvl="2">
+      <w:start w:val="1"/>
+      <w:numFmt w:val="none"/>
+      <w:suff w:val="nothing"/>
+      <w:lvlText w:val=""/>
+      <w:lvlJc w:val="start"/>
+      <w:pPr>
+        <w:tabs>
+          <w:tab w:val="num" w:pos="0"/>
+        </w:tabs>
+        <w:ind w:start="0" w:hanging="0"/>
+      </w:pPr>
+    </w:lvl>
+    <w:lvl w:ilvl="3">
+      <w:start w:val="1"/>
+      <w:numFmt w:val="none"/>
+      <w:suff w:val="nothing"/>
+      <w:lvlText w:val=""/>
+      <w:lvlJc w:val="start"/>
+      <w:pPr>
+        <w:tabs>
+          <w:tab w:val="num" w:pos="0"/>
+        </w:tabs>
+        <w:ind w:start="0" w:hanging="0"/>
+      </w:pPr>
+    </w:lvl>
+    <w:lvl w:ilvl="4">
+      <w:start w:val="1"/>
+      <w:numFmt w:val="none"/>
+      <w:suff w:val="nothing"/>
+      <w:lvlText w:val=""/>
+      <w:lvlJc w:val="start"/>
+      <w:pPr>
+        <w:tabs>
+          <w:tab w:val="num" w:pos="0"/>
+        </w:tabs>
+        <w:ind w:start="0" w:hanging="0"/>
+      </w:pPr>
+    </w:lvl>
+    <w:lvl w:ilvl="5">
+      <w:start w:val="1"/>
+      <w:numFmt w:val="none"/>
+      <w:suff w:val="nothing"/>
+      <w:lvlText w:val=""/>
+      <w:lvlJc w:val="start"/>
+      <w:pPr>
+        <w:tabs>
+          <w:tab w:val="num" w:pos="0"/>
+        </w:tabs>
+        <w:ind w:start="0" w:hanging="0"/>
+      </w:pPr>
+    </w:lvl>
+    <w:lvl w:ilvl="6">
+      <w:start w:val="1"/>
+      <w:numFmt w:val="none"/>
+      <w:suff w:val="nothing"/>
+      <w:lvlText w:val=""/>
+      <w:lvlJc w:val="start"/>
+      <w:pPr>
+        <w:tabs>
+          <w:tab w:val="num" w:pos="0"/>
+        </w:tabs>
+        <w:ind w:start="0" w:hanging="0"/>
+      </w:pPr>
+    </w:lvl>
+    <w:lvl w:ilvl="7">
+      <w:start w:val="1"/>
+      <w:numFmt w:val="none"/>
+      <w:suff w:val="nothing"/>
+      <w:lvlText w:val=""/>
+      <w:lvlJc w:val="start"/>
+      <w:pPr>
+        <w:tabs>
+          <w:tab w:val="num" w:pos="0"/>
+        </w:tabs>
+        <w:ind w:start="0" w:hanging="0"/>
+      </w:pPr>
+    </w:lvl>
+    <w:lvl w:ilvl="8">
+      <w:start w:val="1"/>
+      <w:numFmt w:val="none"/>
+      <w:suff w:val="nothing"/>
+      <w:lvlText w:val=""/>
+      <w:lvlJc w:val="start"/>
+      <w:pPr>
+        <w:tabs>
+          <w:tab w:val="num" w:pos="0"/>
+        </w:tabs>
+        <w:ind w:start="0" w:hanging="0"/>
+      </w:pPr>
+    </w:lvl>
+  </w:abstractNum>
+  <w:abstractNum w:abstractNumId="2">
+    <w:lvl w:ilvl="0">
+      <w:start w:val="1"/>
       <w:numFmt w:val="bullet"/>
       <w:lvlText w:val="◆"/>
       <w:lvlJc w:val="start"/>
@@ -25218,7 +26678,7 @@
       <w:rPr/>
     </w:lvl>
   </w:abstractNum>
-  <w:abstractNum w:abstractNumId="2">
+  <w:abstractNum w:abstractNumId="3">
     <w:lvl w:ilvl="0">
       <w:start w:val="1"/>
       <w:numFmt w:val="none"/>
@@ -25342,128 +26802,6 @@
           <w:tab w:val="num" w:pos="0"/>
         </w:tabs>
         <w:ind w:start="0" w:hanging="0"/>
-      </w:pPr>
-      <w:rPr/>
-    </w:lvl>
-  </w:abstractNum>
-  <w:abstractNum w:abstractNumId="3">
-    <w:lvl w:ilvl="0">
-      <w:start w:val="1"/>
-      <w:numFmt w:val="bullet"/>
-      <w:lvlText w:val="◆"/>
-      <w:lvlJc w:val="start"/>
-      <w:pPr>
-        <w:tabs>
-          <w:tab w:val="num" w:pos="0"/>
-        </w:tabs>
-        <w:ind w:start="720" w:hanging="360"/>
-      </w:pPr>
-      <w:rPr>
-        <w:rFonts w:ascii="Latin Modern Roman" w:hAnsi="Latin Modern Roman" w:cs="Latin Modern Roman" w:hint="default"/>
-        <w:color w:val="BDAB5D"/>
-      </w:rPr>
-    </w:lvl>
-    <w:lvl w:ilvl="1">
-      <w:start w:val="1"/>
-      <w:numFmt w:val="decimal"/>
-      <w:lvlText w:val="%2."/>
-      <w:lvlJc w:val="start"/>
-      <w:pPr>
-        <w:tabs>
-          <w:tab w:val="num" w:pos="1080"/>
-        </w:tabs>
-        <w:ind w:start="1080" w:hanging="360"/>
-      </w:pPr>
-      <w:rPr/>
-    </w:lvl>
-    <w:lvl w:ilvl="2">
-      <w:start w:val="1"/>
-      <w:numFmt w:val="decimal"/>
-      <w:lvlText w:val="%3."/>
-      <w:lvlJc w:val="start"/>
-      <w:pPr>
-        <w:tabs>
-          <w:tab w:val="num" w:pos="1440"/>
-        </w:tabs>
-        <w:ind w:start="1440" w:hanging="360"/>
-      </w:pPr>
-      <w:rPr/>
-    </w:lvl>
-    <w:lvl w:ilvl="3">
-      <w:start w:val="1"/>
-      <w:numFmt w:val="decimal"/>
-      <w:lvlText w:val="%4."/>
-      <w:lvlJc w:val="start"/>
-      <w:pPr>
-        <w:tabs>
-          <w:tab w:val="num" w:pos="1800"/>
-        </w:tabs>
-        <w:ind w:start="1800" w:hanging="360"/>
-      </w:pPr>
-      <w:rPr/>
-    </w:lvl>
-    <w:lvl w:ilvl="4">
-      <w:start w:val="1"/>
-      <w:numFmt w:val="decimal"/>
-      <w:lvlText w:val="%5."/>
-      <w:lvlJc w:val="start"/>
-      <w:pPr>
-        <w:tabs>
-          <w:tab w:val="num" w:pos="2160"/>
-        </w:tabs>
-        <w:ind w:start="2160" w:hanging="360"/>
-      </w:pPr>
-      <w:rPr/>
-    </w:lvl>
-    <w:lvl w:ilvl="5">
-      <w:start w:val="1"/>
-      <w:numFmt w:val="decimal"/>
-      <w:lvlText w:val="%6."/>
-      <w:lvlJc w:val="start"/>
-      <w:pPr>
-        <w:tabs>
-          <w:tab w:val="num" w:pos="2520"/>
-        </w:tabs>
-        <w:ind w:start="2520" w:hanging="360"/>
-      </w:pPr>
-      <w:rPr/>
-    </w:lvl>
-    <w:lvl w:ilvl="6">
-      <w:start w:val="1"/>
-      <w:numFmt w:val="decimal"/>
-      <w:lvlText w:val="%7."/>
-      <w:lvlJc w:val="start"/>
-      <w:pPr>
-        <w:tabs>
-          <w:tab w:val="num" w:pos="2880"/>
-        </w:tabs>
-        <w:ind w:start="2880" w:hanging="360"/>
-      </w:pPr>
-      <w:rPr/>
-    </w:lvl>
-    <w:lvl w:ilvl="7">
-      <w:start w:val="1"/>
-      <w:numFmt w:val="decimal"/>
-      <w:lvlText w:val="%8."/>
-      <w:lvlJc w:val="start"/>
-      <w:pPr>
-        <w:tabs>
-          <w:tab w:val="num" w:pos="3240"/>
-        </w:tabs>
-        <w:ind w:start="3240" w:hanging="360"/>
-      </w:pPr>
-      <w:rPr/>
-    </w:lvl>
-    <w:lvl w:ilvl="8">
-      <w:start w:val="1"/>
-      <w:numFmt w:val="decimal"/>
-      <w:lvlText w:val="%9."/>
-      <w:lvlJc w:val="start"/>
-      <w:pPr>
-        <w:tabs>
-          <w:tab w:val="num" w:pos="3600"/>
-        </w:tabs>
-        <w:ind w:start="3600" w:hanging="360"/>
       </w:pPr>
       <w:rPr/>
     </w:lvl>
@@ -25495,6 +26833,7 @@
         </w:tabs>
         <w:ind w:start="1080" w:hanging="360"/>
       </w:pPr>
+      <w:rPr/>
     </w:lvl>
     <w:lvl w:ilvl="2">
       <w:start w:val="1"/>
@@ -25507,6 +26846,7 @@
         </w:tabs>
         <w:ind w:start="1440" w:hanging="360"/>
       </w:pPr>
+      <w:rPr/>
     </w:lvl>
     <w:lvl w:ilvl="3">
       <w:start w:val="1"/>
@@ -25519,6 +26859,7 @@
         </w:tabs>
         <w:ind w:start="1800" w:hanging="360"/>
       </w:pPr>
+      <w:rPr/>
     </w:lvl>
     <w:lvl w:ilvl="4">
       <w:start w:val="1"/>
@@ -25531,6 +26872,7 @@
         </w:tabs>
         <w:ind w:start="2160" w:hanging="360"/>
       </w:pPr>
+      <w:rPr/>
     </w:lvl>
     <w:lvl w:ilvl="5">
       <w:start w:val="1"/>
@@ -25543,6 +26885,7 @@
         </w:tabs>
         <w:ind w:start="2520" w:hanging="360"/>
       </w:pPr>
+      <w:rPr/>
     </w:lvl>
     <w:lvl w:ilvl="6">
       <w:start w:val="1"/>
@@ -25555,6 +26898,7 @@
         </w:tabs>
         <w:ind w:start="2880" w:hanging="360"/>
       </w:pPr>
+      <w:rPr/>
     </w:lvl>
     <w:lvl w:ilvl="7">
       <w:start w:val="1"/>
@@ -25567,6 +26911,7 @@
         </w:tabs>
         <w:ind w:start="3240" w:hanging="360"/>
       </w:pPr>
+      <w:rPr/>
     </w:lvl>
     <w:lvl w:ilvl="8">
       <w:start w:val="1"/>
@@ -25579,6 +26924,7 @@
         </w:tabs>
         <w:ind w:start="3600" w:hanging="360"/>
       </w:pPr>
+      <w:rPr/>
     </w:lvl>
   </w:abstractNum>
   <w:abstractNum w:abstractNumId="5">
@@ -25608,6 +26954,7 @@
         </w:tabs>
         <w:ind w:start="1080" w:hanging="360"/>
       </w:pPr>
+      <w:rPr/>
     </w:lvl>
     <w:lvl w:ilvl="2">
       <w:start w:val="1"/>
@@ -25620,6 +26967,7 @@
         </w:tabs>
         <w:ind w:start="1440" w:hanging="360"/>
       </w:pPr>
+      <w:rPr/>
     </w:lvl>
     <w:lvl w:ilvl="3">
       <w:start w:val="1"/>
@@ -25632,6 +26980,7 @@
         </w:tabs>
         <w:ind w:start="1800" w:hanging="360"/>
       </w:pPr>
+      <w:rPr/>
     </w:lvl>
     <w:lvl w:ilvl="4">
       <w:start w:val="1"/>
@@ -25644,6 +26993,7 @@
         </w:tabs>
         <w:ind w:start="2160" w:hanging="360"/>
       </w:pPr>
+      <w:rPr/>
     </w:lvl>
     <w:lvl w:ilvl="5">
       <w:start w:val="1"/>
@@ -25656,6 +27006,7 @@
         </w:tabs>
         <w:ind w:start="2520" w:hanging="360"/>
       </w:pPr>
+      <w:rPr/>
     </w:lvl>
     <w:lvl w:ilvl="6">
       <w:start w:val="1"/>
@@ -25668,6 +27019,7 @@
         </w:tabs>
         <w:ind w:start="2880" w:hanging="360"/>
       </w:pPr>
+      <w:rPr/>
     </w:lvl>
     <w:lvl w:ilvl="7">
       <w:start w:val="1"/>
@@ -25680,6 +27032,7 @@
         </w:tabs>
         <w:ind w:start="3240" w:hanging="360"/>
       </w:pPr>
+      <w:rPr/>
     </w:lvl>
     <w:lvl w:ilvl="8">
       <w:start w:val="1"/>
@@ -25692,6 +27045,7 @@
         </w:tabs>
         <w:ind w:start="3600" w:hanging="360"/>
       </w:pPr>
+      <w:rPr/>
     </w:lvl>
   </w:abstractNum>
   <w:abstractNum w:abstractNumId="6">
@@ -25721,6 +27075,7 @@
         </w:tabs>
         <w:ind w:start="1080" w:hanging="360"/>
       </w:pPr>
+      <w:rPr/>
     </w:lvl>
     <w:lvl w:ilvl="2">
       <w:start w:val="1"/>
@@ -25733,6 +27088,7 @@
         </w:tabs>
         <w:ind w:start="1440" w:hanging="360"/>
       </w:pPr>
+      <w:rPr/>
     </w:lvl>
     <w:lvl w:ilvl="3">
       <w:start w:val="1"/>
@@ -25745,6 +27101,7 @@
         </w:tabs>
         <w:ind w:start="1800" w:hanging="360"/>
       </w:pPr>
+      <w:rPr/>
     </w:lvl>
     <w:lvl w:ilvl="4">
       <w:start w:val="1"/>
@@ -25757,6 +27114,7 @@
         </w:tabs>
         <w:ind w:start="2160" w:hanging="360"/>
       </w:pPr>
+      <w:rPr/>
     </w:lvl>
     <w:lvl w:ilvl="5">
       <w:start w:val="1"/>
@@ -25769,6 +27127,7 @@
         </w:tabs>
         <w:ind w:start="2520" w:hanging="360"/>
       </w:pPr>
+      <w:rPr/>
     </w:lvl>
     <w:lvl w:ilvl="6">
       <w:start w:val="1"/>
@@ -25781,6 +27140,7 @@
         </w:tabs>
         <w:ind w:start="2880" w:hanging="360"/>
       </w:pPr>
+      <w:rPr/>
     </w:lvl>
     <w:lvl w:ilvl="7">
       <w:start w:val="1"/>
@@ -25793,6 +27153,7 @@
         </w:tabs>
         <w:ind w:start="3240" w:hanging="360"/>
       </w:pPr>
+      <w:rPr/>
     </w:lvl>
     <w:lvl w:ilvl="8">
       <w:start w:val="1"/>
@@ -25805,6 +27166,7 @@
         </w:tabs>
         <w:ind w:start="3600" w:hanging="360"/>
       </w:pPr>
+      <w:rPr/>
     </w:lvl>
   </w:abstractNum>
   <w:abstractNum w:abstractNumId="7">
@@ -25834,6 +27196,7 @@
         </w:tabs>
         <w:ind w:start="1080" w:hanging="360"/>
       </w:pPr>
+      <w:rPr/>
     </w:lvl>
     <w:lvl w:ilvl="2">
       <w:start w:val="1"/>
@@ -25846,6 +27209,7 @@
         </w:tabs>
         <w:ind w:start="1440" w:hanging="360"/>
       </w:pPr>
+      <w:rPr/>
     </w:lvl>
     <w:lvl w:ilvl="3">
       <w:start w:val="1"/>
@@ -25858,6 +27222,7 @@
         </w:tabs>
         <w:ind w:start="1800" w:hanging="360"/>
       </w:pPr>
+      <w:rPr/>
     </w:lvl>
     <w:lvl w:ilvl="4">
       <w:start w:val="1"/>
@@ -25870,6 +27235,7 @@
         </w:tabs>
         <w:ind w:start="2160" w:hanging="360"/>
       </w:pPr>
+      <w:rPr/>
     </w:lvl>
     <w:lvl w:ilvl="5">
       <w:start w:val="1"/>
@@ -25882,6 +27248,7 @@
         </w:tabs>
         <w:ind w:start="2520" w:hanging="360"/>
       </w:pPr>
+      <w:rPr/>
     </w:lvl>
     <w:lvl w:ilvl="6">
       <w:start w:val="1"/>
@@ -25894,6 +27261,7 @@
         </w:tabs>
         <w:ind w:start="2880" w:hanging="360"/>
       </w:pPr>
+      <w:rPr/>
     </w:lvl>
     <w:lvl w:ilvl="7">
       <w:start w:val="1"/>
@@ -25906,6 +27274,7 @@
         </w:tabs>
         <w:ind w:start="3240" w:hanging="360"/>
       </w:pPr>
+      <w:rPr/>
     </w:lvl>
     <w:lvl w:ilvl="8">
       <w:start w:val="1"/>
@@ -25918,6 +27287,7 @@
         </w:tabs>
         <w:ind w:start="3600" w:hanging="360"/>
       </w:pPr>
+      <w:rPr/>
     </w:lvl>
   </w:abstractNum>
   <w:abstractNum w:abstractNumId="8">
@@ -25947,6 +27317,7 @@
         </w:tabs>
         <w:ind w:start="1080" w:hanging="360"/>
       </w:pPr>
+      <w:rPr/>
     </w:lvl>
     <w:lvl w:ilvl="2">
       <w:start w:val="1"/>
@@ -25959,6 +27330,7 @@
         </w:tabs>
         <w:ind w:start="1440" w:hanging="360"/>
       </w:pPr>
+      <w:rPr/>
     </w:lvl>
     <w:lvl w:ilvl="3">
       <w:start w:val="1"/>
@@ -25971,6 +27343,7 @@
         </w:tabs>
         <w:ind w:start="1800" w:hanging="360"/>
       </w:pPr>
+      <w:rPr/>
     </w:lvl>
     <w:lvl w:ilvl="4">
       <w:start w:val="1"/>
@@ -25983,6 +27356,7 @@
         </w:tabs>
         <w:ind w:start="2160" w:hanging="360"/>
       </w:pPr>
+      <w:rPr/>
     </w:lvl>
     <w:lvl w:ilvl="5">
       <w:start w:val="1"/>
@@ -25995,6 +27369,7 @@
         </w:tabs>
         <w:ind w:start="2520" w:hanging="360"/>
       </w:pPr>
+      <w:rPr/>
     </w:lvl>
     <w:lvl w:ilvl="6">
       <w:start w:val="1"/>
@@ -26007,6 +27382,7 @@
         </w:tabs>
         <w:ind w:start="2880" w:hanging="360"/>
       </w:pPr>
+      <w:rPr/>
     </w:lvl>
     <w:lvl w:ilvl="7">
       <w:start w:val="1"/>
@@ -26019,6 +27395,7 @@
         </w:tabs>
         <w:ind w:start="3240" w:hanging="360"/>
       </w:pPr>
+      <w:rPr/>
     </w:lvl>
     <w:lvl w:ilvl="8">
       <w:start w:val="1"/>
@@ -26031,6 +27408,7 @@
         </w:tabs>
         <w:ind w:start="3600" w:hanging="360"/>
       </w:pPr>
+      <w:rPr/>
     </w:lvl>
   </w:abstractNum>
   <w:abstractNum w:abstractNumId="9">
@@ -26060,6 +27438,7 @@
         </w:tabs>
         <w:ind w:start="1080" w:hanging="360"/>
       </w:pPr>
+      <w:rPr/>
     </w:lvl>
     <w:lvl w:ilvl="2">
       <w:start w:val="1"/>
@@ -26072,6 +27451,7 @@
         </w:tabs>
         <w:ind w:start="1440" w:hanging="360"/>
       </w:pPr>
+      <w:rPr/>
     </w:lvl>
     <w:lvl w:ilvl="3">
       <w:start w:val="1"/>
@@ -26084,6 +27464,7 @@
         </w:tabs>
         <w:ind w:start="1800" w:hanging="360"/>
       </w:pPr>
+      <w:rPr/>
     </w:lvl>
     <w:lvl w:ilvl="4">
       <w:start w:val="1"/>
@@ -26096,6 +27477,7 @@
         </w:tabs>
         <w:ind w:start="2160" w:hanging="360"/>
       </w:pPr>
+      <w:rPr/>
     </w:lvl>
     <w:lvl w:ilvl="5">
       <w:start w:val="1"/>
@@ -26108,6 +27490,7 @@
         </w:tabs>
         <w:ind w:start="2520" w:hanging="360"/>
       </w:pPr>
+      <w:rPr/>
     </w:lvl>
     <w:lvl w:ilvl="6">
       <w:start w:val="1"/>
@@ -26120,6 +27503,7 @@
         </w:tabs>
         <w:ind w:start="2880" w:hanging="360"/>
       </w:pPr>
+      <w:rPr/>
     </w:lvl>
     <w:lvl w:ilvl="7">
       <w:start w:val="1"/>
@@ -26132,6 +27516,7 @@
         </w:tabs>
         <w:ind w:start="3240" w:hanging="360"/>
       </w:pPr>
+      <w:rPr/>
     </w:lvl>
     <w:lvl w:ilvl="8">
       <w:start w:val="1"/>
@@ -26144,6 +27529,7 @@
         </w:tabs>
         <w:ind w:start="3600" w:hanging="360"/>
       </w:pPr>
+      <w:rPr/>
     </w:lvl>
   </w:abstractNum>
   <w:abstractNum w:abstractNumId="10">
@@ -26173,6 +27559,7 @@
         </w:tabs>
         <w:ind w:start="1080" w:hanging="360"/>
       </w:pPr>
+      <w:rPr/>
     </w:lvl>
     <w:lvl w:ilvl="2">
       <w:start w:val="1"/>
@@ -26185,6 +27572,7 @@
         </w:tabs>
         <w:ind w:start="1440" w:hanging="360"/>
       </w:pPr>
+      <w:rPr/>
     </w:lvl>
     <w:lvl w:ilvl="3">
       <w:start w:val="1"/>
@@ -26197,6 +27585,7 @@
         </w:tabs>
         <w:ind w:start="1800" w:hanging="360"/>
       </w:pPr>
+      <w:rPr/>
     </w:lvl>
     <w:lvl w:ilvl="4">
       <w:start w:val="1"/>
@@ -26209,6 +27598,7 @@
         </w:tabs>
         <w:ind w:start="2160" w:hanging="360"/>
       </w:pPr>
+      <w:rPr/>
     </w:lvl>
     <w:lvl w:ilvl="5">
       <w:start w:val="1"/>
@@ -26221,6 +27611,7 @@
         </w:tabs>
         <w:ind w:start="2520" w:hanging="360"/>
       </w:pPr>
+      <w:rPr/>
     </w:lvl>
     <w:lvl w:ilvl="6">
       <w:start w:val="1"/>
@@ -26233,6 +27624,7 @@
         </w:tabs>
         <w:ind w:start="2880" w:hanging="360"/>
       </w:pPr>
+      <w:rPr/>
     </w:lvl>
     <w:lvl w:ilvl="7">
       <w:start w:val="1"/>
@@ -26245,6 +27637,7 @@
         </w:tabs>
         <w:ind w:start="3240" w:hanging="360"/>
       </w:pPr>
+      <w:rPr/>
     </w:lvl>
     <w:lvl w:ilvl="8">
       <w:start w:val="1"/>
@@ -26257,6 +27650,7 @@
         </w:tabs>
         <w:ind w:start="3600" w:hanging="360"/>
       </w:pPr>
+      <w:rPr/>
     </w:lvl>
   </w:abstractNum>
   <w:abstractNum w:abstractNumId="11">
@@ -26286,6 +27680,7 @@
         </w:tabs>
         <w:ind w:start="1080" w:hanging="360"/>
       </w:pPr>
+      <w:rPr/>
     </w:lvl>
     <w:lvl w:ilvl="2">
       <w:start w:val="1"/>
@@ -26298,6 +27693,7 @@
         </w:tabs>
         <w:ind w:start="1440" w:hanging="360"/>
       </w:pPr>
+      <w:rPr/>
     </w:lvl>
     <w:lvl w:ilvl="3">
       <w:start w:val="1"/>
@@ -26310,6 +27706,7 @@
         </w:tabs>
         <w:ind w:start="1800" w:hanging="360"/>
       </w:pPr>
+      <w:rPr/>
     </w:lvl>
     <w:lvl w:ilvl="4">
       <w:start w:val="1"/>
@@ -26322,6 +27719,7 @@
         </w:tabs>
         <w:ind w:start="2160" w:hanging="360"/>
       </w:pPr>
+      <w:rPr/>
     </w:lvl>
     <w:lvl w:ilvl="5">
       <w:start w:val="1"/>
@@ -26334,6 +27732,7 @@
         </w:tabs>
         <w:ind w:start="2520" w:hanging="360"/>
       </w:pPr>
+      <w:rPr/>
     </w:lvl>
     <w:lvl w:ilvl="6">
       <w:start w:val="1"/>
@@ -26346,6 +27745,7 @@
         </w:tabs>
         <w:ind w:start="2880" w:hanging="360"/>
       </w:pPr>
+      <w:rPr/>
     </w:lvl>
     <w:lvl w:ilvl="7">
       <w:start w:val="1"/>
@@ -26358,6 +27758,7 @@
         </w:tabs>
         <w:ind w:start="3240" w:hanging="360"/>
       </w:pPr>
+      <w:rPr/>
     </w:lvl>
     <w:lvl w:ilvl="8">
       <w:start w:val="1"/>
@@ -26370,6 +27771,7 @@
         </w:tabs>
         <w:ind w:start="3600" w:hanging="360"/>
       </w:pPr>
+      <w:rPr/>
     </w:lvl>
   </w:abstractNum>
   <w:abstractNum w:abstractNumId="12">
@@ -26399,6 +27801,7 @@
         </w:tabs>
         <w:ind w:start="1080" w:hanging="360"/>
       </w:pPr>
+      <w:rPr/>
     </w:lvl>
     <w:lvl w:ilvl="2">
       <w:start w:val="1"/>
@@ -26411,6 +27814,7 @@
         </w:tabs>
         <w:ind w:start="1440" w:hanging="360"/>
       </w:pPr>
+      <w:rPr/>
     </w:lvl>
     <w:lvl w:ilvl="3">
       <w:start w:val="1"/>
@@ -26423,6 +27827,7 @@
         </w:tabs>
         <w:ind w:start="1800" w:hanging="360"/>
       </w:pPr>
+      <w:rPr/>
     </w:lvl>
     <w:lvl w:ilvl="4">
       <w:start w:val="1"/>
@@ -26435,6 +27840,7 @@
         </w:tabs>
         <w:ind w:start="2160" w:hanging="360"/>
       </w:pPr>
+      <w:rPr/>
     </w:lvl>
     <w:lvl w:ilvl="5">
       <w:start w:val="1"/>
@@ -26447,6 +27853,7 @@
         </w:tabs>
         <w:ind w:start="2520" w:hanging="360"/>
       </w:pPr>
+      <w:rPr/>
     </w:lvl>
     <w:lvl w:ilvl="6">
       <w:start w:val="1"/>
@@ -26459,6 +27866,7 @@
         </w:tabs>
         <w:ind w:start="2880" w:hanging="360"/>
       </w:pPr>
+      <w:rPr/>
     </w:lvl>
     <w:lvl w:ilvl="7">
       <w:start w:val="1"/>
@@ -26471,6 +27879,7 @@
         </w:tabs>
         <w:ind w:start="3240" w:hanging="360"/>
       </w:pPr>
+      <w:rPr/>
     </w:lvl>
     <w:lvl w:ilvl="8">
       <w:start w:val="1"/>
@@ -26483,6 +27892,7 @@
         </w:tabs>
         <w:ind w:start="3600" w:hanging="360"/>
       </w:pPr>
+      <w:rPr/>
     </w:lvl>
   </w:abstractNum>
   <w:abstractNum w:abstractNumId="13">
@@ -26649,6 +28059,7 @@
         </w:tabs>
         <w:ind w:start="1080" w:hanging="360"/>
       </w:pPr>
+      <w:rPr/>
     </w:lvl>
     <w:lvl w:ilvl="2">
       <w:start w:val="1"/>
@@ -26661,6 +28072,7 @@
         </w:tabs>
         <w:ind w:start="1440" w:hanging="360"/>
       </w:pPr>
+      <w:rPr/>
     </w:lvl>
     <w:lvl w:ilvl="3">
       <w:start w:val="1"/>
@@ -26673,6 +28085,7 @@
         </w:tabs>
         <w:ind w:start="1800" w:hanging="360"/>
       </w:pPr>
+      <w:rPr/>
     </w:lvl>
     <w:lvl w:ilvl="4">
       <w:start w:val="1"/>
@@ -26685,6 +28098,7 @@
         </w:tabs>
         <w:ind w:start="2160" w:hanging="360"/>
       </w:pPr>
+      <w:rPr/>
     </w:lvl>
     <w:lvl w:ilvl="5">
       <w:start w:val="1"/>
@@ -26697,6 +28111,7 @@
         </w:tabs>
         <w:ind w:start="2520" w:hanging="360"/>
       </w:pPr>
+      <w:rPr/>
     </w:lvl>
     <w:lvl w:ilvl="6">
       <w:start w:val="1"/>
@@ -26709,6 +28124,7 @@
         </w:tabs>
         <w:ind w:start="2880" w:hanging="360"/>
       </w:pPr>
+      <w:rPr/>
     </w:lvl>
     <w:lvl w:ilvl="7">
       <w:start w:val="1"/>
@@ -26721,6 +28137,7 @@
         </w:tabs>
         <w:ind w:start="3240" w:hanging="360"/>
       </w:pPr>
+      <w:rPr/>
     </w:lvl>
     <w:lvl w:ilvl="8">
       <w:start w:val="1"/>
@@ -26733,6 +28150,7 @@
         </w:tabs>
         <w:ind w:start="3600" w:hanging="360"/>
       </w:pPr>
+      <w:rPr/>
     </w:lvl>
   </w:abstractNum>
   <w:abstractNum w:abstractNumId="15">
@@ -26762,6 +28180,7 @@
         </w:tabs>
         <w:ind w:start="1080" w:hanging="360"/>
       </w:pPr>
+      <w:rPr/>
     </w:lvl>
     <w:lvl w:ilvl="2">
       <w:start w:val="1"/>
@@ -26774,6 +28193,7 @@
         </w:tabs>
         <w:ind w:start="1440" w:hanging="360"/>
       </w:pPr>
+      <w:rPr/>
     </w:lvl>
     <w:lvl w:ilvl="3">
       <w:start w:val="1"/>
@@ -26786,6 +28206,7 @@
         </w:tabs>
         <w:ind w:start="1800" w:hanging="360"/>
       </w:pPr>
+      <w:rPr/>
     </w:lvl>
     <w:lvl w:ilvl="4">
       <w:start w:val="1"/>
@@ -26798,6 +28219,7 @@
         </w:tabs>
         <w:ind w:start="2160" w:hanging="360"/>
       </w:pPr>
+      <w:rPr/>
     </w:lvl>
     <w:lvl w:ilvl="5">
       <w:start w:val="1"/>
@@ -26810,6 +28232,7 @@
         </w:tabs>
         <w:ind w:start="2520" w:hanging="360"/>
       </w:pPr>
+      <w:rPr/>
     </w:lvl>
     <w:lvl w:ilvl="6">
       <w:start w:val="1"/>
@@ -26822,6 +28245,7 @@
         </w:tabs>
         <w:ind w:start="2880" w:hanging="360"/>
       </w:pPr>
+      <w:rPr/>
     </w:lvl>
     <w:lvl w:ilvl="7">
       <w:start w:val="1"/>
@@ -26834,6 +28258,7 @@
         </w:tabs>
         <w:ind w:start="3240" w:hanging="360"/>
       </w:pPr>
+      <w:rPr/>
     </w:lvl>
     <w:lvl w:ilvl="8">
       <w:start w:val="1"/>
@@ -26846,6 +28271,7 @@
         </w:tabs>
         <w:ind w:start="3600" w:hanging="360"/>
       </w:pPr>
+      <w:rPr/>
     </w:lvl>
   </w:abstractNum>
   <w:abstractNum w:abstractNumId="16">
@@ -26875,6 +28301,7 @@
         </w:tabs>
         <w:ind w:start="1080" w:hanging="360"/>
       </w:pPr>
+      <w:rPr/>
     </w:lvl>
     <w:lvl w:ilvl="2">
       <w:start w:val="1"/>
@@ -26887,6 +28314,7 @@
         </w:tabs>
         <w:ind w:start="1440" w:hanging="360"/>
       </w:pPr>
+      <w:rPr/>
     </w:lvl>
     <w:lvl w:ilvl="3">
       <w:start w:val="1"/>
@@ -26899,6 +28327,7 @@
         </w:tabs>
         <w:ind w:start="1800" w:hanging="360"/>
       </w:pPr>
+      <w:rPr/>
     </w:lvl>
     <w:lvl w:ilvl="4">
       <w:start w:val="1"/>
@@ -26911,6 +28340,7 @@
         </w:tabs>
         <w:ind w:start="2160" w:hanging="360"/>
       </w:pPr>
+      <w:rPr/>
     </w:lvl>
     <w:lvl w:ilvl="5">
       <w:start w:val="1"/>
@@ -26923,6 +28353,7 @@
         </w:tabs>
         <w:ind w:start="2520" w:hanging="360"/>
       </w:pPr>
+      <w:rPr/>
     </w:lvl>
     <w:lvl w:ilvl="6">
       <w:start w:val="1"/>
@@ -26935,6 +28366,7 @@
         </w:tabs>
         <w:ind w:start="2880" w:hanging="360"/>
       </w:pPr>
+      <w:rPr/>
     </w:lvl>
     <w:lvl w:ilvl="7">
       <w:start w:val="1"/>
@@ -26947,6 +28379,7 @@
         </w:tabs>
         <w:ind w:start="3240" w:hanging="360"/>
       </w:pPr>
+      <w:rPr/>
     </w:lvl>
     <w:lvl w:ilvl="8">
       <w:start w:val="1"/>
@@ -26959,6 +28392,7 @@
         </w:tabs>
         <w:ind w:start="3600" w:hanging="360"/>
       </w:pPr>
+      <w:rPr/>
     </w:lvl>
   </w:abstractNum>
   <w:abstractNum w:abstractNumId="17">
@@ -26988,6 +28422,7 @@
         </w:tabs>
         <w:ind w:start="1080" w:hanging="360"/>
       </w:pPr>
+      <w:rPr/>
     </w:lvl>
     <w:lvl w:ilvl="2">
       <w:start w:val="1"/>
@@ -27000,6 +28435,7 @@
         </w:tabs>
         <w:ind w:start="1440" w:hanging="360"/>
       </w:pPr>
+      <w:rPr/>
     </w:lvl>
     <w:lvl w:ilvl="3">
       <w:start w:val="1"/>
@@ -27012,6 +28448,7 @@
         </w:tabs>
         <w:ind w:start="1800" w:hanging="360"/>
       </w:pPr>
+      <w:rPr/>
     </w:lvl>
     <w:lvl w:ilvl="4">
       <w:start w:val="1"/>
@@ -27024,6 +28461,7 @@
         </w:tabs>
         <w:ind w:start="2160" w:hanging="360"/>
       </w:pPr>
+      <w:rPr/>
     </w:lvl>
     <w:lvl w:ilvl="5">
       <w:start w:val="1"/>
@@ -27036,6 +28474,7 @@
         </w:tabs>
         <w:ind w:start="2520" w:hanging="360"/>
       </w:pPr>
+      <w:rPr/>
     </w:lvl>
     <w:lvl w:ilvl="6">
       <w:start w:val="1"/>
@@ -27048,6 +28487,7 @@
         </w:tabs>
         <w:ind w:start="2880" w:hanging="360"/>
       </w:pPr>
+      <w:rPr/>
     </w:lvl>
     <w:lvl w:ilvl="7">
       <w:start w:val="1"/>
@@ -27060,6 +28500,7 @@
         </w:tabs>
         <w:ind w:start="3240" w:hanging="360"/>
       </w:pPr>
+      <w:rPr/>
     </w:lvl>
     <w:lvl w:ilvl="8">
       <w:start w:val="1"/>
@@ -27072,6 +28513,7 @@
         </w:tabs>
         <w:ind w:start="3600" w:hanging="360"/>
       </w:pPr>
+      <w:rPr/>
     </w:lvl>
   </w:abstractNum>
   <w:abstractNum w:abstractNumId="18">
@@ -27101,6 +28543,7 @@
         </w:tabs>
         <w:ind w:start="1080" w:hanging="360"/>
       </w:pPr>
+      <w:rPr/>
     </w:lvl>
     <w:lvl w:ilvl="2">
       <w:start w:val="1"/>
@@ -27113,6 +28556,7 @@
         </w:tabs>
         <w:ind w:start="1440" w:hanging="360"/>
       </w:pPr>
+      <w:rPr/>
     </w:lvl>
     <w:lvl w:ilvl="3">
       <w:start w:val="1"/>
@@ -27125,6 +28569,7 @@
         </w:tabs>
         <w:ind w:start="1800" w:hanging="360"/>
       </w:pPr>
+      <w:rPr/>
     </w:lvl>
     <w:lvl w:ilvl="4">
       <w:start w:val="1"/>
@@ -27137,6 +28582,7 @@
         </w:tabs>
         <w:ind w:start="2160" w:hanging="360"/>
       </w:pPr>
+      <w:rPr/>
     </w:lvl>
     <w:lvl w:ilvl="5">
       <w:start w:val="1"/>
@@ -27149,6 +28595,7 @@
         </w:tabs>
         <w:ind w:start="2520" w:hanging="360"/>
       </w:pPr>
+      <w:rPr/>
     </w:lvl>
     <w:lvl w:ilvl="6">
       <w:start w:val="1"/>
@@ -27161,6 +28608,7 @@
         </w:tabs>
         <w:ind w:start="2880" w:hanging="360"/>
       </w:pPr>
+      <w:rPr/>
     </w:lvl>
     <w:lvl w:ilvl="7">
       <w:start w:val="1"/>
@@ -27173,6 +28621,7 @@
         </w:tabs>
         <w:ind w:start="3240" w:hanging="360"/>
       </w:pPr>
+      <w:rPr/>
     </w:lvl>
     <w:lvl w:ilvl="8">
       <w:start w:val="1"/>
@@ -27185,6 +28634,7 @@
         </w:tabs>
         <w:ind w:start="3600" w:hanging="360"/>
       </w:pPr>
+      <w:rPr/>
     </w:lvl>
   </w:abstractNum>
   <w:abstractNum w:abstractNumId="19">
@@ -27327,120 +28777,123 @@
   <w:abstractNum w:abstractNumId="20">
     <w:lvl w:ilvl="0">
       <w:start w:val="1"/>
-      <w:numFmt w:val="none"/>
-      <w:suff w:val="nothing"/>
-      <w:lvlText w:val=""/>
+      <w:numFmt w:val="bullet"/>
+      <w:lvlText w:val="◆"/>
       <w:lvlJc w:val="start"/>
       <w:pPr>
         <w:tabs>
           <w:tab w:val="num" w:pos="0"/>
         </w:tabs>
-        <w:ind w:start="0" w:hanging="0"/>
-      </w:pPr>
+        <w:ind w:start="720" w:hanging="360"/>
+      </w:pPr>
+      <w:rPr>
+        <w:rFonts w:ascii="Latin Modern Roman" w:hAnsi="Latin Modern Roman" w:cs="Latin Modern Roman" w:hint="default"/>
+        <w:color w:val="BDAB5D"/>
+      </w:rPr>
     </w:lvl>
     <w:lvl w:ilvl="1">
       <w:start w:val="1"/>
-      <w:numFmt w:val="none"/>
-      <w:suff w:val="nothing"/>
-      <w:lvlText w:val=""/>
+      <w:numFmt w:val="decimal"/>
+      <w:lvlText w:val="%2."/>
       <w:lvlJc w:val="start"/>
       <w:pPr>
         <w:tabs>
-          <w:tab w:val="num" w:pos="0"/>
+          <w:tab w:val="num" w:pos="1080"/>
         </w:tabs>
-        <w:ind w:start="0" w:hanging="0"/>
-      </w:pPr>
+        <w:ind w:start="1080" w:hanging="360"/>
+      </w:pPr>
+      <w:rPr/>
     </w:lvl>
     <w:lvl w:ilvl="2">
       <w:start w:val="1"/>
-      <w:numFmt w:val="none"/>
-      <w:suff w:val="nothing"/>
-      <w:lvlText w:val=""/>
+      <w:numFmt w:val="decimal"/>
+      <w:lvlText w:val="%3."/>
       <w:lvlJc w:val="start"/>
       <w:pPr>
         <w:tabs>
-          <w:tab w:val="num" w:pos="0"/>
+          <w:tab w:val="num" w:pos="1440"/>
         </w:tabs>
-        <w:ind w:start="0" w:hanging="0"/>
-      </w:pPr>
+        <w:ind w:start="1440" w:hanging="360"/>
+      </w:pPr>
+      <w:rPr/>
     </w:lvl>
     <w:lvl w:ilvl="3">
       <w:start w:val="1"/>
-      <w:numFmt w:val="none"/>
-      <w:suff w:val="nothing"/>
-      <w:lvlText w:val=""/>
+      <w:numFmt w:val="decimal"/>
+      <w:lvlText w:val="%4."/>
       <w:lvlJc w:val="start"/>
       <w:pPr>
         <w:tabs>
-          <w:tab w:val="num" w:pos="0"/>
+          <w:tab w:val="num" w:pos="1800"/>
         </w:tabs>
-        <w:ind w:start="0" w:hanging="0"/>
-      </w:pPr>
+        <w:ind w:start="1800" w:hanging="360"/>
+      </w:pPr>
+      <w:rPr/>
     </w:lvl>
     <w:lvl w:ilvl="4">
       <w:start w:val="1"/>
-      <w:numFmt w:val="none"/>
-      <w:suff w:val="nothing"/>
-      <w:lvlText w:val=""/>
+      <w:numFmt w:val="decimal"/>
+      <w:lvlText w:val="%5."/>
       <w:lvlJc w:val="start"/>
       <w:pPr>
         <w:tabs>
-          <w:tab w:val="num" w:pos="0"/>
+          <w:tab w:val="num" w:pos="2160"/>
         </w:tabs>
-        <w:ind w:start="0" w:hanging="0"/>
-      </w:pPr>
+        <w:ind w:start="2160" w:hanging="360"/>
+      </w:pPr>
+      <w:rPr/>
     </w:lvl>
     <w:lvl w:ilvl="5">
       <w:start w:val="1"/>
-      <w:numFmt w:val="none"/>
-      <w:suff w:val="nothing"/>
-      <w:lvlText w:val=""/>
+      <w:numFmt w:val="decimal"/>
+      <w:lvlText w:val="%6."/>
       <w:lvlJc w:val="start"/>
       <w:pPr>
         <w:tabs>
-          <w:tab w:val="num" w:pos="0"/>
+          <w:tab w:val="num" w:pos="2520"/>
         </w:tabs>
-        <w:ind w:start="0" w:hanging="0"/>
-      </w:pPr>
+        <w:ind w:start="2520" w:hanging="360"/>
+      </w:pPr>
+      <w:rPr/>
     </w:lvl>
     <w:lvl w:ilvl="6">
       <w:start w:val="1"/>
-      <w:numFmt w:val="none"/>
-      <w:suff w:val="nothing"/>
-      <w:lvlText w:val=""/>
+      <w:numFmt w:val="decimal"/>
+      <w:lvlText w:val="%7."/>
       <w:lvlJc w:val="start"/>
       <w:pPr>
         <w:tabs>
-          <w:tab w:val="num" w:pos="0"/>
+          <w:tab w:val="num" w:pos="2880"/>
         </w:tabs>
-        <w:ind w:start="0" w:hanging="0"/>
-      </w:pPr>
+        <w:ind w:start="2880" w:hanging="360"/>
+      </w:pPr>
+      <w:rPr/>
     </w:lvl>
     <w:lvl w:ilvl="7">
       <w:start w:val="1"/>
-      <w:numFmt w:val="none"/>
-      <w:suff w:val="nothing"/>
-      <w:lvlText w:val=""/>
+      <w:numFmt w:val="decimal"/>
+      <w:lvlText w:val="%8."/>
       <w:lvlJc w:val="start"/>
       <w:pPr>
         <w:tabs>
-          <w:tab w:val="num" w:pos="0"/>
+          <w:tab w:val="num" w:pos="3240"/>
         </w:tabs>
-        <w:ind w:start="0" w:hanging="0"/>
-      </w:pPr>
+        <w:ind w:start="3240" w:hanging="360"/>
+      </w:pPr>
+      <w:rPr/>
     </w:lvl>
     <w:lvl w:ilvl="8">
       <w:start w:val="1"/>
-      <w:numFmt w:val="none"/>
-      <w:suff w:val="nothing"/>
-      <w:lvlText w:val=""/>
+      <w:numFmt w:val="decimal"/>
+      <w:lvlText w:val="%9."/>
       <w:lvlJc w:val="start"/>
       <w:pPr>
         <w:tabs>
-          <w:tab w:val="num" w:pos="0"/>
+          <w:tab w:val="num" w:pos="3600"/>
         </w:tabs>
-        <w:ind w:start="0" w:hanging="0"/>
-      </w:pPr>
+        <w:ind w:start="3600" w:hanging="360"/>
+      </w:pPr>
+      <w:rPr/>
     </w:lvl>
   </w:abstractNum>
   <w:num w:numId="1">
@@ -27504,7 +28957,7 @@
     <w:abstractNumId w:val="20"/>
   </w:num>
   <w:num w:numId="21">
-    <w:abstractNumId w:val="1"/>
+    <w:abstractNumId w:val="2"/>
     <w:lvlOverride w:ilvl="0">
       <w:startOverride w:val="1"/>
     </w:lvlOverride>
@@ -27653,8 +29106,8 @@
       <w:u w:val="single"/>
     </w:rPr>
   </w:style>
-  <w:style w:type="character" w:styleId="FootnoteCharactersuser">
-    <w:name w:val="Footnote Characters (user)"/>
+  <w:style w:type="character" w:styleId="FootnoteCharacters">
+    <w:name w:val="Footnote Characters"/>
     <w:uiPriority w:val="99"/>
     <w:semiHidden/>
     <w:unhideWhenUsed/>
@@ -27663,8 +29116,8 @@
       <w:vertAlign w:val="superscript"/>
     </w:rPr>
   </w:style>
-  <w:style w:type="character" w:styleId="FootnoteCharacters">
-    <w:name w:val="Footnote Characters"/>
+  <w:style w:type="character" w:styleId="FootnoteCharactersuser">
+    <w:name w:val="Footnote Characters (user)"/>
     <w:qFormat/>
     <w:rPr>
       <w:vertAlign w:val="superscript"/>
@@ -27688,8 +29141,8 @@
       <w:szCs w:val="20"/>
     </w:rPr>
   </w:style>
-  <w:style w:type="character" w:styleId="Bullets">
-    <w:name w:val="Bullets"/>
+  <w:style w:type="character" w:styleId="Bulletsuser">
+    <w:name w:val="Bullets (user)"/>
     <w:qFormat/>
     <w:rPr>
       <w:rFonts w:ascii="OpenSymbol" w:hAnsi="OpenSymbol" w:eastAsia="OpenSymbol" w:cs="OpenSymbol"/>

</xml_diff>